<commit_message>
Updated code to run for both scRNAseq and spatial (Xenium and Visium HD)
</commit_message>
<xml_diff>
--- a/SapiensOntoCellMap_documentation.docx
+++ b/SapiensOntoCellMap_documentation.docx
@@ -354,29 +354,43 @@
       </w:r>
     </w:p>
     <w:p>
-      <w:r>
-        <w:rPr>
+      <w:pPr>
+        <w:rPr>
+          <w:rFonts w:ascii="Times New Roman" w:hAnsi="Times New Roman" w:cs="Times New Roman"/>
+        </w:rPr>
+      </w:pPr>
+      <w:r>
+        <w:rPr>
+          <w:rFonts w:ascii="Times New Roman" w:hAnsi="Times New Roman" w:cs="Times New Roman"/>
           <w:b/>
           <w:bCs/>
         </w:rPr>
         <w:t>Ontology Integration</w:t>
       </w:r>
       <w:r>
+        <w:rPr>
+          <w:rFonts w:ascii="Times New Roman" w:hAnsi="Times New Roman" w:cs="Times New Roman"/>
+        </w:rPr>
         <w:t xml:space="preserve">: The use of the </w:t>
       </w:r>
       <w:r>
         <w:rPr>
+          <w:rFonts w:ascii="Times New Roman" w:hAnsi="Times New Roman" w:cs="Times New Roman"/>
           <w:b/>
           <w:bCs/>
         </w:rPr>
         <w:t>Cell Ontology (CL)</w:t>
       </w:r>
       <w:r>
+        <w:rPr>
+          <w:rFonts w:ascii="Times New Roman" w:hAnsi="Times New Roman" w:cs="Times New Roman"/>
+        </w:rPr>
         <w:t xml:space="preserve"> and </w:t>
       </w:r>
       <w:proofErr w:type="spellStart"/>
       <w:r>
         <w:rPr>
+          <w:rFonts w:ascii="Times New Roman" w:hAnsi="Times New Roman" w:cs="Times New Roman"/>
           <w:b/>
           <w:bCs/>
         </w:rPr>
@@ -384,21 +398,29 @@
       </w:r>
       <w:proofErr w:type="spellEnd"/>
       <w:r>
+        <w:rPr>
+          <w:rFonts w:ascii="Times New Roman" w:hAnsi="Times New Roman" w:cs="Times New Roman"/>
+        </w:rPr>
         <w:t xml:space="preserve"> is a well-established standard in the field. Major international consortia like the </w:t>
       </w:r>
       <w:r>
         <w:rPr>
+          <w:rFonts w:ascii="Times New Roman" w:hAnsi="Times New Roman" w:cs="Times New Roman"/>
           <w:b/>
           <w:bCs/>
         </w:rPr>
         <w:t>Human Cell Atlas (HCA)</w:t>
       </w:r>
       <w:r>
+        <w:rPr>
+          <w:rFonts w:ascii="Times New Roman" w:hAnsi="Times New Roman" w:cs="Times New Roman"/>
+        </w:rPr>
         <w:t xml:space="preserve">, </w:t>
       </w:r>
       <w:proofErr w:type="spellStart"/>
       <w:r>
         <w:rPr>
+          <w:rFonts w:ascii="Times New Roman" w:hAnsi="Times New Roman" w:cs="Times New Roman"/>
           <w:b/>
           <w:bCs/>
         </w:rPr>
@@ -406,16 +428,23 @@
       </w:r>
       <w:proofErr w:type="spellEnd"/>
       <w:r>
+        <w:rPr>
+          <w:rFonts w:ascii="Times New Roman" w:hAnsi="Times New Roman" w:cs="Times New Roman"/>
+        </w:rPr>
         <w:t xml:space="preserve">, and the </w:t>
       </w:r>
       <w:r>
         <w:rPr>
+          <w:rFonts w:ascii="Times New Roman" w:hAnsi="Times New Roman" w:cs="Times New Roman"/>
           <w:b/>
           <w:bCs/>
         </w:rPr>
         <w:t>ENCODE</w:t>
       </w:r>
       <w:r>
+        <w:rPr>
+          <w:rFonts w:ascii="Times New Roman" w:hAnsi="Times New Roman" w:cs="Times New Roman"/>
+        </w:rPr>
         <w:t xml:space="preserve"> project rely on these ontologies for standardized cell and tissue annotation.</w:t>
       </w:r>
     </w:p>
@@ -429,6 +458,7 @@
       </w:pPr>
       <w:r>
         <w:rPr>
+          <w:rFonts w:ascii="Times New Roman" w:hAnsi="Times New Roman" w:cs="Times New Roman"/>
           <w:b/>
           <w:bCs/>
         </w:rPr>
@@ -436,6 +466,7 @@
       </w:r>
       <w:r>
         <w:rPr>
+          <w:rFonts w:ascii="Times New Roman" w:hAnsi="Times New Roman" w:cs="Times New Roman"/>
           <w:b/>
           <w:bCs/>
         </w:rPr>
@@ -443,6 +474,7 @@
       </w:r>
       <w:r>
         <w:rPr>
+          <w:rFonts w:ascii="Times New Roman" w:hAnsi="Times New Roman" w:cs="Times New Roman"/>
           <w:b/>
           <w:bCs/>
         </w:rPr>
@@ -450,6 +482,7 @@
       </w:r>
       <w:r>
         <w:rPr>
+          <w:rFonts w:ascii="Times New Roman" w:hAnsi="Times New Roman" w:cs="Times New Roman"/>
           <w:b/>
           <w:bCs/>
         </w:rPr>
@@ -457,6 +490,7 @@
       </w:r>
       <w:r>
         <w:rPr>
+          <w:rFonts w:ascii="Times New Roman" w:hAnsi="Times New Roman" w:cs="Times New Roman"/>
           <w:b/>
           <w:bCs/>
         </w:rPr>
@@ -464,6 +498,7 @@
       </w:r>
       <w:r>
         <w:rPr>
+          <w:rFonts w:ascii="Times New Roman" w:hAnsi="Times New Roman" w:cs="Times New Roman"/>
           <w:b/>
           <w:bCs/>
         </w:rPr>
@@ -471,25 +506,12 @@
       </w:r>
       <w:r>
         <w:rPr>
+          <w:rFonts w:ascii="Times New Roman" w:hAnsi="Times New Roman" w:cs="Times New Roman"/>
           <w:b/>
           <w:bCs/>
         </w:rPr>
-        <w:lastRenderedPageBreak/>
         <w:br/>
-      </w:r>
-      <w:r>
-        <w:rPr>
-          <w:b/>
-          <w:bCs/>
-        </w:rPr>
-        <w:t>Cell Type Annotation and Enrichment Tools</w:t>
-      </w:r>
-      <w:r>
-        <w:rPr>
-          <w:b/>
-          <w:bCs/>
-        </w:rPr>
-        <w:t>:</w:t>
+        <w:t>Cell Type Annotation and Enrichment Tools:</w:t>
       </w:r>
     </w:p>
     <w:tbl>
@@ -502,13 +524,13 @@
         <w:tblLook w:val="04A0" w:firstRow="1" w:lastRow="0" w:firstColumn="1" w:lastColumn="0" w:noHBand="0" w:noVBand="1"/>
       </w:tblPr>
       <w:tblGrid>
-        <w:gridCol w:w="1807"/>
-        <w:gridCol w:w="1419"/>
-        <w:gridCol w:w="1302"/>
-        <w:gridCol w:w="1302"/>
-        <w:gridCol w:w="1153"/>
-        <w:gridCol w:w="1301"/>
-        <w:gridCol w:w="1060"/>
+        <w:gridCol w:w="1715"/>
+        <w:gridCol w:w="1408"/>
+        <w:gridCol w:w="1315"/>
+        <w:gridCol w:w="1315"/>
+        <w:gridCol w:w="1191"/>
+        <w:gridCol w:w="1317"/>
+        <w:gridCol w:w="1083"/>
       </w:tblGrid>
       <w:tr>
         <w:trPr>
@@ -536,7 +558,7 @@
             <w:pPr>
               <w:spacing w:after="0" w:line="240" w:lineRule="auto"/>
               <w:rPr>
-                <w:rFonts w:ascii="Arial" w:eastAsia="Times New Roman" w:hAnsi="Arial" w:cs="Arial"/>
+                <w:rFonts w:ascii="Times New Roman" w:eastAsia="Times New Roman" w:hAnsi="Times New Roman" w:cs="Times New Roman"/>
                 <w:kern w:val="0"/>
                 <w:sz w:val="20"/>
                 <w:szCs w:val="20"/>
@@ -545,12 +567,13 @@
             </w:pPr>
             <w:r>
               <w:rPr>
-                <w:rFonts w:ascii="Arial" w:eastAsia="Times New Roman" w:hAnsi="Arial" w:cs="Arial"/>
-                <w:kern w:val="0"/>
-                <w:sz w:val="20"/>
-                <w:szCs w:val="20"/>
-                <w14:ligatures w14:val="none"/>
-              </w:rPr>
+                <w:rFonts w:ascii="Times New Roman" w:eastAsia="Times New Roman" w:hAnsi="Times New Roman" w:cs="Times New Roman"/>
+                <w:kern w:val="0"/>
+                <w:sz w:val="20"/>
+                <w:szCs w:val="20"/>
+                <w14:ligatures w14:val="none"/>
+              </w:rPr>
+              <w:lastRenderedPageBreak/>
               <w:t>Feature</w:t>
             </w:r>
           </w:p>
@@ -577,7 +600,7 @@
             <w:pPr>
               <w:spacing w:after="0" w:line="240" w:lineRule="auto"/>
               <w:rPr>
-                <w:rFonts w:ascii="Arial" w:eastAsia="Times New Roman" w:hAnsi="Arial" w:cs="Arial"/>
+                <w:rFonts w:ascii="Times New Roman" w:eastAsia="Times New Roman" w:hAnsi="Times New Roman" w:cs="Times New Roman"/>
                 <w:kern w:val="0"/>
                 <w:sz w:val="20"/>
                 <w:szCs w:val="20"/>
@@ -586,7 +609,7 @@
             </w:pPr>
             <w:r>
               <w:rPr>
-                <w:rFonts w:ascii="Arial" w:eastAsia="Times New Roman" w:hAnsi="Arial" w:cs="Arial"/>
+                <w:rFonts w:ascii="Times New Roman" w:eastAsia="Times New Roman" w:hAnsi="Times New Roman" w:cs="Times New Roman"/>
                 <w:kern w:val="0"/>
                 <w:sz w:val="20"/>
                 <w:szCs w:val="20"/>
@@ -618,7 +641,7 @@
             <w:pPr>
               <w:spacing w:after="0" w:line="240" w:lineRule="auto"/>
               <w:rPr>
-                <w:rFonts w:ascii="Arial" w:eastAsia="Times New Roman" w:hAnsi="Arial" w:cs="Arial"/>
+                <w:rFonts w:ascii="Times New Roman" w:eastAsia="Times New Roman" w:hAnsi="Times New Roman" w:cs="Times New Roman"/>
                 <w:kern w:val="0"/>
                 <w:sz w:val="20"/>
                 <w:szCs w:val="20"/>
@@ -627,7 +650,7 @@
             </w:pPr>
             <w:r>
               <w:rPr>
-                <w:rFonts w:ascii="Arial" w:eastAsia="Times New Roman" w:hAnsi="Arial" w:cs="Arial"/>
+                <w:rFonts w:ascii="Times New Roman" w:eastAsia="Times New Roman" w:hAnsi="Times New Roman" w:cs="Times New Roman"/>
                 <w:kern w:val="0"/>
                 <w:sz w:val="20"/>
                 <w:szCs w:val="20"/>
@@ -659,7 +682,7 @@
             <w:pPr>
               <w:spacing w:after="0" w:line="240" w:lineRule="auto"/>
               <w:rPr>
-                <w:rFonts w:ascii="Arial" w:eastAsia="Times New Roman" w:hAnsi="Arial" w:cs="Arial"/>
+                <w:rFonts w:ascii="Times New Roman" w:eastAsia="Times New Roman" w:hAnsi="Times New Roman" w:cs="Times New Roman"/>
                 <w:kern w:val="0"/>
                 <w:sz w:val="20"/>
                 <w:szCs w:val="20"/>
@@ -669,7 +692,7 @@
             <w:proofErr w:type="spellStart"/>
             <w:r>
               <w:rPr>
-                <w:rFonts w:ascii="Arial" w:eastAsia="Times New Roman" w:hAnsi="Arial" w:cs="Arial"/>
+                <w:rFonts w:ascii="Times New Roman" w:eastAsia="Times New Roman" w:hAnsi="Times New Roman" w:cs="Times New Roman"/>
                 <w:kern w:val="0"/>
                 <w:sz w:val="20"/>
                 <w:szCs w:val="20"/>
@@ -702,7 +725,7 @@
             <w:pPr>
               <w:spacing w:after="0" w:line="240" w:lineRule="auto"/>
               <w:rPr>
-                <w:rFonts w:ascii="Arial" w:eastAsia="Times New Roman" w:hAnsi="Arial" w:cs="Arial"/>
+                <w:rFonts w:ascii="Times New Roman" w:eastAsia="Times New Roman" w:hAnsi="Times New Roman" w:cs="Times New Roman"/>
                 <w:kern w:val="0"/>
                 <w:sz w:val="20"/>
                 <w:szCs w:val="20"/>
@@ -712,7 +735,7 @@
             <w:proofErr w:type="spellStart"/>
             <w:r>
               <w:rPr>
-                <w:rFonts w:ascii="Arial" w:eastAsia="Times New Roman" w:hAnsi="Arial" w:cs="Arial"/>
+                <w:rFonts w:ascii="Times New Roman" w:eastAsia="Times New Roman" w:hAnsi="Times New Roman" w:cs="Times New Roman"/>
                 <w:kern w:val="0"/>
                 <w:sz w:val="20"/>
                 <w:szCs w:val="20"/>
@@ -745,7 +768,7 @@
             <w:pPr>
               <w:spacing w:after="0" w:line="240" w:lineRule="auto"/>
               <w:rPr>
-                <w:rFonts w:ascii="Arial" w:eastAsia="Times New Roman" w:hAnsi="Arial" w:cs="Arial"/>
+                <w:rFonts w:ascii="Times New Roman" w:eastAsia="Times New Roman" w:hAnsi="Times New Roman" w:cs="Times New Roman"/>
                 <w:kern w:val="0"/>
                 <w:sz w:val="20"/>
                 <w:szCs w:val="20"/>
@@ -755,7 +778,7 @@
             <w:proofErr w:type="spellStart"/>
             <w:r>
               <w:rPr>
-                <w:rFonts w:ascii="Arial" w:eastAsia="Times New Roman" w:hAnsi="Arial" w:cs="Arial"/>
+                <w:rFonts w:ascii="Times New Roman" w:eastAsia="Times New Roman" w:hAnsi="Times New Roman" w:cs="Times New Roman"/>
                 <w:kern w:val="0"/>
                 <w:sz w:val="20"/>
                 <w:szCs w:val="20"/>
@@ -788,7 +811,7 @@
             <w:pPr>
               <w:spacing w:after="0" w:line="240" w:lineRule="auto"/>
               <w:rPr>
-                <w:rFonts w:ascii="Arial" w:eastAsia="Times New Roman" w:hAnsi="Arial" w:cs="Arial"/>
+                <w:rFonts w:ascii="Times New Roman" w:eastAsia="Times New Roman" w:hAnsi="Times New Roman" w:cs="Times New Roman"/>
                 <w:kern w:val="0"/>
                 <w:sz w:val="20"/>
                 <w:szCs w:val="20"/>
@@ -798,7 +821,7 @@
             <w:proofErr w:type="spellStart"/>
             <w:r>
               <w:rPr>
-                <w:rFonts w:ascii="Arial" w:eastAsia="Times New Roman" w:hAnsi="Arial" w:cs="Arial"/>
+                <w:rFonts w:ascii="Times New Roman" w:eastAsia="Times New Roman" w:hAnsi="Times New Roman" w:cs="Times New Roman"/>
                 <w:kern w:val="0"/>
                 <w:sz w:val="20"/>
                 <w:szCs w:val="20"/>
@@ -836,7 +859,7 @@
             <w:pPr>
               <w:spacing w:after="0" w:line="240" w:lineRule="auto"/>
               <w:rPr>
-                <w:rFonts w:ascii="Arial" w:eastAsia="Times New Roman" w:hAnsi="Arial" w:cs="Arial"/>
+                <w:rFonts w:ascii="Times New Roman" w:eastAsia="Times New Roman" w:hAnsi="Times New Roman" w:cs="Times New Roman"/>
                 <w:kern w:val="0"/>
                 <w:sz w:val="20"/>
                 <w:szCs w:val="20"/>
@@ -845,7 +868,7 @@
             </w:pPr>
             <w:r>
               <w:rPr>
-                <w:rFonts w:ascii="Arial" w:eastAsia="Times New Roman" w:hAnsi="Arial" w:cs="Arial"/>
+                <w:rFonts w:ascii="Times New Roman" w:eastAsia="Times New Roman" w:hAnsi="Times New Roman" w:cs="Times New Roman"/>
                 <w:kern w:val="0"/>
                 <w:sz w:val="20"/>
                 <w:szCs w:val="20"/>
@@ -877,7 +900,7 @@
             <w:pPr>
               <w:spacing w:after="0" w:line="240" w:lineRule="auto"/>
               <w:rPr>
-                <w:rFonts w:ascii="Arial" w:eastAsia="Times New Roman" w:hAnsi="Arial" w:cs="Arial"/>
+                <w:rFonts w:ascii="Times New Roman" w:eastAsia="Times New Roman" w:hAnsi="Times New Roman" w:cs="Times New Roman"/>
                 <w:kern w:val="0"/>
                 <w:sz w:val="20"/>
                 <w:szCs w:val="20"/>
@@ -886,7 +909,7 @@
             </w:pPr>
             <w:r>
               <w:rPr>
-                <w:rFonts w:ascii="Arial" w:eastAsia="Times New Roman" w:hAnsi="Arial" w:cs="Arial"/>
+                <w:rFonts w:ascii="Times New Roman" w:eastAsia="Times New Roman" w:hAnsi="Times New Roman" w:cs="Times New Roman"/>
                 <w:kern w:val="0"/>
                 <w:sz w:val="20"/>
                 <w:szCs w:val="20"/>
@@ -918,7 +941,7 @@
             <w:pPr>
               <w:spacing w:after="0" w:line="240" w:lineRule="auto"/>
               <w:rPr>
-                <w:rFonts w:ascii="Arial" w:eastAsia="Times New Roman" w:hAnsi="Arial" w:cs="Arial"/>
+                <w:rFonts w:ascii="Times New Roman" w:eastAsia="Times New Roman" w:hAnsi="Times New Roman" w:cs="Times New Roman"/>
                 <w:kern w:val="0"/>
                 <w:sz w:val="20"/>
                 <w:szCs w:val="20"/>
@@ -927,7 +950,7 @@
             </w:pPr>
             <w:r>
               <w:rPr>
-                <w:rFonts w:ascii="Arial" w:eastAsia="Times New Roman" w:hAnsi="Arial" w:cs="Arial"/>
+                <w:rFonts w:ascii="Times New Roman" w:eastAsia="Times New Roman" w:hAnsi="Times New Roman" w:cs="Times New Roman"/>
                 <w:kern w:val="0"/>
                 <w:sz w:val="20"/>
                 <w:szCs w:val="20"/>
@@ -959,7 +982,7 @@
             <w:pPr>
               <w:spacing w:after="0" w:line="240" w:lineRule="auto"/>
               <w:rPr>
-                <w:rFonts w:ascii="Arial" w:eastAsia="Times New Roman" w:hAnsi="Arial" w:cs="Arial"/>
+                <w:rFonts w:ascii="Times New Roman" w:eastAsia="Times New Roman" w:hAnsi="Times New Roman" w:cs="Times New Roman"/>
                 <w:kern w:val="0"/>
                 <w:sz w:val="20"/>
                 <w:szCs w:val="20"/>
@@ -968,7 +991,7 @@
             </w:pPr>
             <w:r>
               <w:rPr>
-                <w:rFonts w:ascii="Arial" w:eastAsia="Times New Roman" w:hAnsi="Arial" w:cs="Arial"/>
+                <w:rFonts w:ascii="Times New Roman" w:eastAsia="Times New Roman" w:hAnsi="Times New Roman" w:cs="Times New Roman"/>
                 <w:kern w:val="0"/>
                 <w:sz w:val="20"/>
                 <w:szCs w:val="20"/>
@@ -1000,7 +1023,7 @@
             <w:pPr>
               <w:spacing w:after="0" w:line="240" w:lineRule="auto"/>
               <w:rPr>
-                <w:rFonts w:ascii="Arial" w:eastAsia="Times New Roman" w:hAnsi="Arial" w:cs="Arial"/>
+                <w:rFonts w:ascii="Times New Roman" w:eastAsia="Times New Roman" w:hAnsi="Times New Roman" w:cs="Times New Roman"/>
                 <w:kern w:val="0"/>
                 <w:sz w:val="20"/>
                 <w:szCs w:val="20"/>
@@ -1009,7 +1032,7 @@
             </w:pPr>
             <w:r>
               <w:rPr>
-                <w:rFonts w:ascii="Arial" w:eastAsia="Times New Roman" w:hAnsi="Arial" w:cs="Arial"/>
+                <w:rFonts w:ascii="Times New Roman" w:eastAsia="Times New Roman" w:hAnsi="Times New Roman" w:cs="Times New Roman"/>
                 <w:kern w:val="0"/>
                 <w:sz w:val="20"/>
                 <w:szCs w:val="20"/>
@@ -1041,7 +1064,7 @@
             <w:pPr>
               <w:spacing w:after="0" w:line="240" w:lineRule="auto"/>
               <w:rPr>
-                <w:rFonts w:ascii="Arial" w:eastAsia="Times New Roman" w:hAnsi="Arial" w:cs="Arial"/>
+                <w:rFonts w:ascii="Times New Roman" w:eastAsia="Times New Roman" w:hAnsi="Times New Roman" w:cs="Times New Roman"/>
                 <w:kern w:val="0"/>
                 <w:sz w:val="20"/>
                 <w:szCs w:val="20"/>
@@ -1050,7 +1073,7 @@
             </w:pPr>
             <w:r>
               <w:rPr>
-                <w:rFonts w:ascii="Arial" w:eastAsia="Times New Roman" w:hAnsi="Arial" w:cs="Arial"/>
+                <w:rFonts w:ascii="Times New Roman" w:eastAsia="Times New Roman" w:hAnsi="Times New Roman" w:cs="Times New Roman"/>
                 <w:kern w:val="0"/>
                 <w:sz w:val="20"/>
                 <w:szCs w:val="20"/>
@@ -1082,7 +1105,7 @@
             <w:pPr>
               <w:spacing w:after="0" w:line="240" w:lineRule="auto"/>
               <w:rPr>
-                <w:rFonts w:ascii="Arial" w:eastAsia="Times New Roman" w:hAnsi="Arial" w:cs="Arial"/>
+                <w:rFonts w:ascii="Times New Roman" w:eastAsia="Times New Roman" w:hAnsi="Times New Roman" w:cs="Times New Roman"/>
                 <w:kern w:val="0"/>
                 <w:sz w:val="20"/>
                 <w:szCs w:val="20"/>
@@ -1091,7 +1114,7 @@
             </w:pPr>
             <w:r>
               <w:rPr>
-                <w:rFonts w:ascii="Arial" w:eastAsia="Times New Roman" w:hAnsi="Arial" w:cs="Arial"/>
+                <w:rFonts w:ascii="Times New Roman" w:eastAsia="Times New Roman" w:hAnsi="Times New Roman" w:cs="Times New Roman"/>
                 <w:kern w:val="0"/>
                 <w:sz w:val="20"/>
                 <w:szCs w:val="20"/>
@@ -1128,7 +1151,7 @@
             <w:pPr>
               <w:spacing w:after="0" w:line="240" w:lineRule="auto"/>
               <w:rPr>
-                <w:rFonts w:ascii="Arial" w:eastAsia="Times New Roman" w:hAnsi="Arial" w:cs="Arial"/>
+                <w:rFonts w:ascii="Times New Roman" w:eastAsia="Times New Roman" w:hAnsi="Times New Roman" w:cs="Times New Roman"/>
                 <w:kern w:val="0"/>
                 <w:sz w:val="20"/>
                 <w:szCs w:val="20"/>
@@ -1137,7 +1160,7 @@
             </w:pPr>
             <w:r>
               <w:rPr>
-                <w:rFonts w:ascii="Arial" w:eastAsia="Times New Roman" w:hAnsi="Arial" w:cs="Arial"/>
+                <w:rFonts w:ascii="Times New Roman" w:eastAsia="Times New Roman" w:hAnsi="Times New Roman" w:cs="Times New Roman"/>
                 <w:kern w:val="0"/>
                 <w:sz w:val="20"/>
                 <w:szCs w:val="20"/>
@@ -1169,7 +1192,7 @@
             <w:pPr>
               <w:spacing w:after="0" w:line="240" w:lineRule="auto"/>
               <w:rPr>
-                <w:rFonts w:ascii="Arial" w:eastAsia="Times New Roman" w:hAnsi="Arial" w:cs="Arial"/>
+                <w:rFonts w:ascii="Times New Roman" w:eastAsia="Times New Roman" w:hAnsi="Times New Roman" w:cs="Times New Roman"/>
                 <w:kern w:val="0"/>
                 <w:sz w:val="20"/>
                 <w:szCs w:val="20"/>
@@ -1178,7 +1201,7 @@
             </w:pPr>
             <w:r>
               <w:rPr>
-                <w:rFonts w:ascii="Arial" w:eastAsia="Times New Roman" w:hAnsi="Arial" w:cs="Arial"/>
+                <w:rFonts w:ascii="Times New Roman" w:eastAsia="Times New Roman" w:hAnsi="Times New Roman" w:cs="Times New Roman"/>
                 <w:kern w:val="0"/>
                 <w:sz w:val="20"/>
                 <w:szCs w:val="20"/>
@@ -1210,7 +1233,7 @@
             <w:pPr>
               <w:spacing w:after="0" w:line="240" w:lineRule="auto"/>
               <w:rPr>
-                <w:rFonts w:ascii="Arial" w:eastAsia="Times New Roman" w:hAnsi="Arial" w:cs="Arial"/>
+                <w:rFonts w:ascii="Times New Roman" w:eastAsia="Times New Roman" w:hAnsi="Times New Roman" w:cs="Times New Roman"/>
                 <w:kern w:val="0"/>
                 <w:sz w:val="20"/>
                 <w:szCs w:val="20"/>
@@ -1219,7 +1242,7 @@
             </w:pPr>
             <w:r>
               <w:rPr>
-                <w:rFonts w:ascii="Arial" w:eastAsia="Times New Roman" w:hAnsi="Arial" w:cs="Arial"/>
+                <w:rFonts w:ascii="Times New Roman" w:eastAsia="Times New Roman" w:hAnsi="Times New Roman" w:cs="Times New Roman"/>
                 <w:kern w:val="0"/>
                 <w:sz w:val="20"/>
                 <w:szCs w:val="20"/>
@@ -1251,7 +1274,7 @@
             <w:pPr>
               <w:spacing w:after="0" w:line="240" w:lineRule="auto"/>
               <w:rPr>
-                <w:rFonts w:ascii="Arial" w:eastAsia="Times New Roman" w:hAnsi="Arial" w:cs="Arial"/>
+                <w:rFonts w:ascii="Times New Roman" w:eastAsia="Times New Roman" w:hAnsi="Times New Roman" w:cs="Times New Roman"/>
                 <w:kern w:val="0"/>
                 <w:sz w:val="20"/>
                 <w:szCs w:val="20"/>
@@ -1260,7 +1283,7 @@
             </w:pPr>
             <w:r>
               <w:rPr>
-                <w:rFonts w:ascii="Arial" w:eastAsia="Times New Roman" w:hAnsi="Arial" w:cs="Arial"/>
+                <w:rFonts w:ascii="Times New Roman" w:eastAsia="Times New Roman" w:hAnsi="Times New Roman" w:cs="Times New Roman"/>
                 <w:kern w:val="0"/>
                 <w:sz w:val="20"/>
                 <w:szCs w:val="20"/>
@@ -1292,7 +1315,7 @@
             <w:pPr>
               <w:spacing w:after="0" w:line="240" w:lineRule="auto"/>
               <w:rPr>
-                <w:rFonts w:ascii="Arial" w:eastAsia="Times New Roman" w:hAnsi="Arial" w:cs="Arial"/>
+                <w:rFonts w:ascii="Times New Roman" w:eastAsia="Times New Roman" w:hAnsi="Times New Roman" w:cs="Times New Roman"/>
                 <w:kern w:val="0"/>
                 <w:sz w:val="20"/>
                 <w:szCs w:val="20"/>
@@ -1301,7 +1324,7 @@
             </w:pPr>
             <w:r>
               <w:rPr>
-                <w:rFonts w:ascii="Arial" w:eastAsia="Times New Roman" w:hAnsi="Arial" w:cs="Arial"/>
+                <w:rFonts w:ascii="Times New Roman" w:eastAsia="Times New Roman" w:hAnsi="Times New Roman" w:cs="Times New Roman"/>
                 <w:kern w:val="0"/>
                 <w:sz w:val="20"/>
                 <w:szCs w:val="20"/>
@@ -1333,7 +1356,7 @@
             <w:pPr>
               <w:spacing w:after="0" w:line="240" w:lineRule="auto"/>
               <w:rPr>
-                <w:rFonts w:ascii="Arial" w:eastAsia="Times New Roman" w:hAnsi="Arial" w:cs="Arial"/>
+                <w:rFonts w:ascii="Times New Roman" w:eastAsia="Times New Roman" w:hAnsi="Times New Roman" w:cs="Times New Roman"/>
                 <w:kern w:val="0"/>
                 <w:sz w:val="20"/>
                 <w:szCs w:val="20"/>
@@ -1342,7 +1365,7 @@
             </w:pPr>
             <w:r>
               <w:rPr>
-                <w:rFonts w:ascii="Arial" w:eastAsia="Times New Roman" w:hAnsi="Arial" w:cs="Arial"/>
+                <w:rFonts w:ascii="Times New Roman" w:eastAsia="Times New Roman" w:hAnsi="Times New Roman" w:cs="Times New Roman"/>
                 <w:kern w:val="0"/>
                 <w:sz w:val="20"/>
                 <w:szCs w:val="20"/>
@@ -1374,7 +1397,7 @@
             <w:pPr>
               <w:spacing w:after="0" w:line="240" w:lineRule="auto"/>
               <w:rPr>
-                <w:rFonts w:ascii="Arial" w:eastAsia="Times New Roman" w:hAnsi="Arial" w:cs="Arial"/>
+                <w:rFonts w:ascii="Times New Roman" w:eastAsia="Times New Roman" w:hAnsi="Times New Roman" w:cs="Times New Roman"/>
                 <w:kern w:val="0"/>
                 <w:sz w:val="20"/>
                 <w:szCs w:val="20"/>
@@ -1383,7 +1406,7 @@
             </w:pPr>
             <w:r>
               <w:rPr>
-                <w:rFonts w:ascii="Arial" w:eastAsia="Times New Roman" w:hAnsi="Arial" w:cs="Arial"/>
+                <w:rFonts w:ascii="Times New Roman" w:eastAsia="Times New Roman" w:hAnsi="Times New Roman" w:cs="Times New Roman"/>
                 <w:kern w:val="0"/>
                 <w:sz w:val="20"/>
                 <w:szCs w:val="20"/>
@@ -1420,7 +1443,7 @@
             <w:pPr>
               <w:spacing w:after="0" w:line="240" w:lineRule="auto"/>
               <w:rPr>
-                <w:rFonts w:ascii="Arial" w:eastAsia="Times New Roman" w:hAnsi="Arial" w:cs="Arial"/>
+                <w:rFonts w:ascii="Times New Roman" w:eastAsia="Times New Roman" w:hAnsi="Times New Roman" w:cs="Times New Roman"/>
                 <w:kern w:val="0"/>
                 <w:sz w:val="20"/>
                 <w:szCs w:val="20"/>
@@ -1429,7 +1452,7 @@
             </w:pPr>
             <w:r>
               <w:rPr>
-                <w:rFonts w:ascii="Arial" w:eastAsia="Times New Roman" w:hAnsi="Arial" w:cs="Arial"/>
+                <w:rFonts w:ascii="Times New Roman" w:eastAsia="Times New Roman" w:hAnsi="Times New Roman" w:cs="Times New Roman"/>
                 <w:kern w:val="0"/>
                 <w:sz w:val="20"/>
                 <w:szCs w:val="20"/>
@@ -1461,7 +1484,7 @@
             <w:pPr>
               <w:spacing w:after="0" w:line="240" w:lineRule="auto"/>
               <w:rPr>
-                <w:rFonts w:ascii="Arial" w:eastAsia="Times New Roman" w:hAnsi="Arial" w:cs="Arial"/>
+                <w:rFonts w:ascii="Times New Roman" w:eastAsia="Times New Roman" w:hAnsi="Times New Roman" w:cs="Times New Roman"/>
                 <w:kern w:val="0"/>
                 <w:sz w:val="20"/>
                 <w:szCs w:val="20"/>
@@ -1470,7 +1493,7 @@
             </w:pPr>
             <w:r>
               <w:rPr>
-                <w:rFonts w:ascii="Arial" w:eastAsia="Times New Roman" w:hAnsi="Arial" w:cs="Arial"/>
+                <w:rFonts w:ascii="Times New Roman" w:eastAsia="Times New Roman" w:hAnsi="Times New Roman" w:cs="Times New Roman"/>
                 <w:kern w:val="0"/>
                 <w:sz w:val="20"/>
                 <w:szCs w:val="20"/>
@@ -1481,7 +1504,7 @@
             <w:proofErr w:type="spellStart"/>
             <w:r>
               <w:rPr>
-                <w:rFonts w:ascii="Arial" w:eastAsia="Times New Roman" w:hAnsi="Arial" w:cs="Arial"/>
+                <w:rFonts w:ascii="Times New Roman" w:eastAsia="Times New Roman" w:hAnsi="Times New Roman" w:cs="Times New Roman"/>
                 <w:kern w:val="0"/>
                 <w:sz w:val="20"/>
                 <w:szCs w:val="20"/>
@@ -1492,7 +1515,7 @@
             <w:proofErr w:type="spellEnd"/>
             <w:r>
               <w:rPr>
-                <w:rFonts w:ascii="Arial" w:eastAsia="Times New Roman" w:hAnsi="Arial" w:cs="Arial"/>
+                <w:rFonts w:ascii="Times New Roman" w:eastAsia="Times New Roman" w:hAnsi="Times New Roman" w:cs="Times New Roman"/>
                 <w:kern w:val="0"/>
                 <w:sz w:val="20"/>
                 <w:szCs w:val="20"/>
@@ -1524,7 +1547,7 @@
             <w:pPr>
               <w:spacing w:after="0" w:line="240" w:lineRule="auto"/>
               <w:rPr>
-                <w:rFonts w:ascii="Arial" w:eastAsia="Times New Roman" w:hAnsi="Arial" w:cs="Arial"/>
+                <w:rFonts w:ascii="Times New Roman" w:eastAsia="Times New Roman" w:hAnsi="Times New Roman" w:cs="Times New Roman"/>
                 <w:kern w:val="0"/>
                 <w:sz w:val="20"/>
                 <w:szCs w:val="20"/>
@@ -1534,7 +1557,7 @@
             <w:proofErr w:type="spellStart"/>
             <w:r>
               <w:rPr>
-                <w:rFonts w:ascii="Arial" w:eastAsia="Times New Roman" w:hAnsi="Arial" w:cs="Arial"/>
+                <w:rFonts w:ascii="Times New Roman" w:eastAsia="Times New Roman" w:hAnsi="Times New Roman" w:cs="Times New Roman"/>
                 <w:kern w:val="0"/>
                 <w:sz w:val="20"/>
                 <w:szCs w:val="20"/>
@@ -1545,7 +1568,7 @@
             <w:proofErr w:type="spellEnd"/>
             <w:r>
               <w:rPr>
-                <w:rFonts w:ascii="Arial" w:eastAsia="Times New Roman" w:hAnsi="Arial" w:cs="Arial"/>
+                <w:rFonts w:ascii="Times New Roman" w:eastAsia="Times New Roman" w:hAnsi="Times New Roman" w:cs="Times New Roman"/>
                 <w:kern w:val="0"/>
                 <w:sz w:val="20"/>
                 <w:szCs w:val="20"/>
@@ -1577,7 +1600,7 @@
             <w:pPr>
               <w:spacing w:after="0" w:line="240" w:lineRule="auto"/>
               <w:rPr>
-                <w:rFonts w:ascii="Arial" w:eastAsia="Times New Roman" w:hAnsi="Arial" w:cs="Arial"/>
+                <w:rFonts w:ascii="Times New Roman" w:eastAsia="Times New Roman" w:hAnsi="Times New Roman" w:cs="Times New Roman"/>
                 <w:kern w:val="0"/>
                 <w:sz w:val="20"/>
                 <w:szCs w:val="20"/>
@@ -1587,7 +1610,7 @@
             <w:proofErr w:type="spellStart"/>
             <w:r>
               <w:rPr>
-                <w:rFonts w:ascii="Arial" w:eastAsia="Times New Roman" w:hAnsi="Arial" w:cs="Arial"/>
+                <w:rFonts w:ascii="Times New Roman" w:eastAsia="Times New Roman" w:hAnsi="Times New Roman" w:cs="Times New Roman"/>
                 <w:kern w:val="0"/>
                 <w:sz w:val="20"/>
                 <w:szCs w:val="20"/>
@@ -1598,7 +1621,7 @@
             <w:proofErr w:type="spellEnd"/>
             <w:r>
               <w:rPr>
-                <w:rFonts w:ascii="Arial" w:eastAsia="Times New Roman" w:hAnsi="Arial" w:cs="Arial"/>
+                <w:rFonts w:ascii="Times New Roman" w:eastAsia="Times New Roman" w:hAnsi="Times New Roman" w:cs="Times New Roman"/>
                 <w:kern w:val="0"/>
                 <w:sz w:val="20"/>
                 <w:szCs w:val="20"/>
@@ -1630,7 +1653,7 @@
             <w:pPr>
               <w:spacing w:after="0" w:line="240" w:lineRule="auto"/>
               <w:rPr>
-                <w:rFonts w:ascii="Arial" w:eastAsia="Times New Roman" w:hAnsi="Arial" w:cs="Arial"/>
+                <w:rFonts w:ascii="Times New Roman" w:eastAsia="Times New Roman" w:hAnsi="Times New Roman" w:cs="Times New Roman"/>
                 <w:kern w:val="0"/>
                 <w:sz w:val="20"/>
                 <w:szCs w:val="20"/>
@@ -1640,7 +1663,7 @@
             <w:proofErr w:type="spellStart"/>
             <w:r>
               <w:rPr>
-                <w:rFonts w:ascii="Arial" w:eastAsia="Times New Roman" w:hAnsi="Arial" w:cs="Arial"/>
+                <w:rFonts w:ascii="Times New Roman" w:eastAsia="Times New Roman" w:hAnsi="Times New Roman" w:cs="Times New Roman"/>
                 <w:kern w:val="0"/>
                 <w:sz w:val="20"/>
                 <w:szCs w:val="20"/>
@@ -1651,7 +1674,7 @@
             <w:proofErr w:type="spellEnd"/>
             <w:r>
               <w:rPr>
-                <w:rFonts w:ascii="Arial" w:eastAsia="Times New Roman" w:hAnsi="Arial" w:cs="Arial"/>
+                <w:rFonts w:ascii="Times New Roman" w:eastAsia="Times New Roman" w:hAnsi="Times New Roman" w:cs="Times New Roman"/>
                 <w:kern w:val="0"/>
                 <w:sz w:val="20"/>
                 <w:szCs w:val="20"/>
@@ -1683,7 +1706,7 @@
             <w:pPr>
               <w:spacing w:after="0" w:line="240" w:lineRule="auto"/>
               <w:rPr>
-                <w:rFonts w:ascii="Arial" w:eastAsia="Times New Roman" w:hAnsi="Arial" w:cs="Arial"/>
+                <w:rFonts w:ascii="Times New Roman" w:eastAsia="Times New Roman" w:hAnsi="Times New Roman" w:cs="Times New Roman"/>
                 <w:kern w:val="0"/>
                 <w:sz w:val="20"/>
                 <w:szCs w:val="20"/>
@@ -1693,7 +1716,7 @@
             <w:proofErr w:type="spellStart"/>
             <w:r>
               <w:rPr>
-                <w:rFonts w:ascii="Arial" w:eastAsia="Times New Roman" w:hAnsi="Arial" w:cs="Arial"/>
+                <w:rFonts w:ascii="Times New Roman" w:eastAsia="Times New Roman" w:hAnsi="Times New Roman" w:cs="Times New Roman"/>
                 <w:kern w:val="0"/>
                 <w:sz w:val="20"/>
                 <w:szCs w:val="20"/>
@@ -1704,7 +1727,7 @@
             <w:proofErr w:type="spellEnd"/>
             <w:r>
               <w:rPr>
-                <w:rFonts w:ascii="Arial" w:eastAsia="Times New Roman" w:hAnsi="Arial" w:cs="Arial"/>
+                <w:rFonts w:ascii="Times New Roman" w:eastAsia="Times New Roman" w:hAnsi="Times New Roman" w:cs="Times New Roman"/>
                 <w:kern w:val="0"/>
                 <w:sz w:val="20"/>
                 <w:szCs w:val="20"/>
@@ -1736,7 +1759,7 @@
             <w:pPr>
               <w:spacing w:after="0" w:line="240" w:lineRule="auto"/>
               <w:rPr>
-                <w:rFonts w:ascii="Arial" w:eastAsia="Times New Roman" w:hAnsi="Arial" w:cs="Arial"/>
+                <w:rFonts w:ascii="Times New Roman" w:eastAsia="Times New Roman" w:hAnsi="Times New Roman" w:cs="Times New Roman"/>
                 <w:kern w:val="0"/>
                 <w:sz w:val="20"/>
                 <w:szCs w:val="20"/>
@@ -1745,7 +1768,7 @@
             </w:pPr>
             <w:r>
               <w:rPr>
-                <w:rFonts w:ascii="Arial" w:eastAsia="Times New Roman" w:hAnsi="Arial" w:cs="Arial"/>
+                <w:rFonts w:ascii="Times New Roman" w:eastAsia="Times New Roman" w:hAnsi="Times New Roman" w:cs="Times New Roman"/>
                 <w:kern w:val="0"/>
                 <w:sz w:val="20"/>
                 <w:szCs w:val="20"/>
@@ -1782,7 +1805,7 @@
             <w:pPr>
               <w:spacing w:after="0" w:line="240" w:lineRule="auto"/>
               <w:rPr>
-                <w:rFonts w:ascii="Arial" w:eastAsia="Times New Roman" w:hAnsi="Arial" w:cs="Arial"/>
+                <w:rFonts w:ascii="Times New Roman" w:eastAsia="Times New Roman" w:hAnsi="Times New Roman" w:cs="Times New Roman"/>
                 <w:kern w:val="0"/>
                 <w:sz w:val="20"/>
                 <w:szCs w:val="20"/>
@@ -1791,7 +1814,7 @@
             </w:pPr>
             <w:r>
               <w:rPr>
-                <w:rFonts w:ascii="Arial" w:eastAsia="Times New Roman" w:hAnsi="Arial" w:cs="Arial"/>
+                <w:rFonts w:ascii="Times New Roman" w:eastAsia="Times New Roman" w:hAnsi="Times New Roman" w:cs="Times New Roman"/>
                 <w:kern w:val="0"/>
                 <w:sz w:val="20"/>
                 <w:szCs w:val="20"/>
@@ -1823,7 +1846,7 @@
             <w:pPr>
               <w:spacing w:after="0" w:line="240" w:lineRule="auto"/>
               <w:rPr>
-                <w:rFonts w:ascii="Arial" w:eastAsia="Times New Roman" w:hAnsi="Arial" w:cs="Arial"/>
+                <w:rFonts w:ascii="Times New Roman" w:eastAsia="Times New Roman" w:hAnsi="Times New Roman" w:cs="Times New Roman"/>
                 <w:kern w:val="0"/>
                 <w:sz w:val="20"/>
                 <w:szCs w:val="20"/>
@@ -1842,7 +1865,7 @@
             </w:r>
             <w:r>
               <w:rPr>
-                <w:rFonts w:ascii="Arial" w:eastAsia="Times New Roman" w:hAnsi="Arial" w:cs="Arial"/>
+                <w:rFonts w:ascii="Times New Roman" w:eastAsia="Times New Roman" w:hAnsi="Times New Roman" w:cs="Times New Roman"/>
                 <w:kern w:val="0"/>
                 <w:sz w:val="20"/>
                 <w:szCs w:val="20"/>
@@ -1874,7 +1897,7 @@
             <w:pPr>
               <w:spacing w:after="0" w:line="240" w:lineRule="auto"/>
               <w:rPr>
-                <w:rFonts w:ascii="Arial" w:eastAsia="Times New Roman" w:hAnsi="Arial" w:cs="Arial"/>
+                <w:rFonts w:ascii="Times New Roman" w:eastAsia="Times New Roman" w:hAnsi="Times New Roman" w:cs="Times New Roman"/>
                 <w:kern w:val="0"/>
                 <w:sz w:val="20"/>
                 <w:szCs w:val="20"/>
@@ -1893,7 +1916,7 @@
             </w:r>
             <w:r>
               <w:rPr>
-                <w:rFonts w:ascii="Arial" w:eastAsia="Times New Roman" w:hAnsi="Arial" w:cs="Arial"/>
+                <w:rFonts w:ascii="Times New Roman" w:eastAsia="Times New Roman" w:hAnsi="Times New Roman" w:cs="Times New Roman"/>
                 <w:kern w:val="0"/>
                 <w:sz w:val="20"/>
                 <w:szCs w:val="20"/>
@@ -1925,7 +1948,7 @@
             <w:pPr>
               <w:spacing w:after="0" w:line="240" w:lineRule="auto"/>
               <w:rPr>
-                <w:rFonts w:ascii="Arial" w:eastAsia="Times New Roman" w:hAnsi="Arial" w:cs="Arial"/>
+                <w:rFonts w:ascii="Times New Roman" w:eastAsia="Times New Roman" w:hAnsi="Times New Roman" w:cs="Times New Roman"/>
                 <w:kern w:val="0"/>
                 <w:sz w:val="20"/>
                 <w:szCs w:val="20"/>
@@ -1944,7 +1967,7 @@
             </w:r>
             <w:r>
               <w:rPr>
-                <w:rFonts w:ascii="Arial" w:eastAsia="Times New Roman" w:hAnsi="Arial" w:cs="Arial"/>
+                <w:rFonts w:ascii="Times New Roman" w:eastAsia="Times New Roman" w:hAnsi="Times New Roman" w:cs="Times New Roman"/>
                 <w:kern w:val="0"/>
                 <w:sz w:val="20"/>
                 <w:szCs w:val="20"/>
@@ -1976,7 +1999,7 @@
             <w:pPr>
               <w:spacing w:after="0" w:line="240" w:lineRule="auto"/>
               <w:rPr>
-                <w:rFonts w:ascii="Arial" w:eastAsia="Times New Roman" w:hAnsi="Arial" w:cs="Arial"/>
+                <w:rFonts w:ascii="Times New Roman" w:eastAsia="Times New Roman" w:hAnsi="Times New Roman" w:cs="Times New Roman"/>
                 <w:kern w:val="0"/>
                 <w:sz w:val="20"/>
                 <w:szCs w:val="20"/>
@@ -1995,7 +2018,7 @@
             </w:r>
             <w:r>
               <w:rPr>
-                <w:rFonts w:ascii="Arial" w:eastAsia="Times New Roman" w:hAnsi="Arial" w:cs="Arial"/>
+                <w:rFonts w:ascii="Times New Roman" w:eastAsia="Times New Roman" w:hAnsi="Times New Roman" w:cs="Times New Roman"/>
                 <w:kern w:val="0"/>
                 <w:sz w:val="20"/>
                 <w:szCs w:val="20"/>
@@ -2027,7 +2050,7 @@
             <w:pPr>
               <w:spacing w:after="0" w:line="240" w:lineRule="auto"/>
               <w:rPr>
-                <w:rFonts w:ascii="Arial" w:eastAsia="Times New Roman" w:hAnsi="Arial" w:cs="Arial"/>
+                <w:rFonts w:ascii="Times New Roman" w:eastAsia="Times New Roman" w:hAnsi="Times New Roman" w:cs="Times New Roman"/>
                 <w:kern w:val="0"/>
                 <w:sz w:val="20"/>
                 <w:szCs w:val="20"/>
@@ -2046,7 +2069,7 @@
             </w:r>
             <w:r>
               <w:rPr>
-                <w:rFonts w:ascii="Arial" w:eastAsia="Times New Roman" w:hAnsi="Arial" w:cs="Arial"/>
+                <w:rFonts w:ascii="Times New Roman" w:eastAsia="Times New Roman" w:hAnsi="Times New Roman" w:cs="Times New Roman"/>
                 <w:kern w:val="0"/>
                 <w:sz w:val="20"/>
                 <w:szCs w:val="20"/>
@@ -2078,7 +2101,7 @@
             <w:pPr>
               <w:spacing w:after="0" w:line="240" w:lineRule="auto"/>
               <w:rPr>
-                <w:rFonts w:ascii="Arial" w:eastAsia="Times New Roman" w:hAnsi="Arial" w:cs="Arial"/>
+                <w:rFonts w:ascii="Times New Roman" w:eastAsia="Times New Roman" w:hAnsi="Times New Roman" w:cs="Times New Roman"/>
                 <w:kern w:val="0"/>
                 <w:sz w:val="20"/>
                 <w:szCs w:val="20"/>
@@ -2097,7 +2120,7 @@
             </w:r>
             <w:r>
               <w:rPr>
-                <w:rFonts w:ascii="Arial" w:eastAsia="Times New Roman" w:hAnsi="Arial" w:cs="Arial"/>
+                <w:rFonts w:ascii="Times New Roman" w:eastAsia="Times New Roman" w:hAnsi="Times New Roman" w:cs="Times New Roman"/>
                 <w:kern w:val="0"/>
                 <w:sz w:val="20"/>
                 <w:szCs w:val="20"/>
@@ -2134,7 +2157,7 @@
             <w:pPr>
               <w:spacing w:after="0" w:line="240" w:lineRule="auto"/>
               <w:rPr>
-                <w:rFonts w:ascii="Arial" w:eastAsia="Times New Roman" w:hAnsi="Arial" w:cs="Arial"/>
+                <w:rFonts w:ascii="Times New Roman" w:eastAsia="Times New Roman" w:hAnsi="Times New Roman" w:cs="Times New Roman"/>
                 <w:kern w:val="0"/>
                 <w:sz w:val="20"/>
                 <w:szCs w:val="20"/>
@@ -2143,7 +2166,7 @@
             </w:pPr>
             <w:r>
               <w:rPr>
-                <w:rFonts w:ascii="Arial" w:eastAsia="Times New Roman" w:hAnsi="Arial" w:cs="Arial"/>
+                <w:rFonts w:ascii="Times New Roman" w:eastAsia="Times New Roman" w:hAnsi="Times New Roman" w:cs="Times New Roman"/>
                 <w:kern w:val="0"/>
                 <w:sz w:val="20"/>
                 <w:szCs w:val="20"/>
@@ -2175,7 +2198,7 @@
             <w:pPr>
               <w:spacing w:after="0" w:line="240" w:lineRule="auto"/>
               <w:rPr>
-                <w:rFonts w:ascii="Arial" w:eastAsia="Times New Roman" w:hAnsi="Arial" w:cs="Arial"/>
+                <w:rFonts w:ascii="Times New Roman" w:eastAsia="Times New Roman" w:hAnsi="Times New Roman" w:cs="Times New Roman"/>
                 <w:kern w:val="0"/>
                 <w:sz w:val="20"/>
                 <w:szCs w:val="20"/>
@@ -2184,7 +2207,7 @@
             </w:pPr>
             <w:r>
               <w:rPr>
-                <w:rFonts w:ascii="Arial" w:eastAsia="Times New Roman" w:hAnsi="Arial" w:cs="Arial"/>
+                <w:rFonts w:ascii="Times New Roman" w:eastAsia="Times New Roman" w:hAnsi="Times New Roman" w:cs="Times New Roman"/>
                 <w:kern w:val="0"/>
                 <w:sz w:val="20"/>
                 <w:szCs w:val="20"/>
@@ -2216,7 +2239,7 @@
             <w:pPr>
               <w:spacing w:after="0" w:line="240" w:lineRule="auto"/>
               <w:rPr>
-                <w:rFonts w:ascii="Arial" w:eastAsia="Times New Roman" w:hAnsi="Arial" w:cs="Arial"/>
+                <w:rFonts w:ascii="Times New Roman" w:eastAsia="Times New Roman" w:hAnsi="Times New Roman" w:cs="Times New Roman"/>
                 <w:kern w:val="0"/>
                 <w:sz w:val="20"/>
                 <w:szCs w:val="20"/>
@@ -2235,7 +2258,7 @@
             </w:r>
             <w:r>
               <w:rPr>
-                <w:rFonts w:ascii="Arial" w:eastAsia="Times New Roman" w:hAnsi="Arial" w:cs="Arial"/>
+                <w:rFonts w:ascii="Times New Roman" w:eastAsia="Times New Roman" w:hAnsi="Times New Roman" w:cs="Times New Roman"/>
                 <w:kern w:val="0"/>
                 <w:sz w:val="20"/>
                 <w:szCs w:val="20"/>
@@ -2267,7 +2290,7 @@
             <w:pPr>
               <w:spacing w:after="0" w:line="240" w:lineRule="auto"/>
               <w:rPr>
-                <w:rFonts w:ascii="Arial" w:eastAsia="Times New Roman" w:hAnsi="Arial" w:cs="Arial"/>
+                <w:rFonts w:ascii="Times New Roman" w:eastAsia="Times New Roman" w:hAnsi="Times New Roman" w:cs="Times New Roman"/>
                 <w:kern w:val="0"/>
                 <w:sz w:val="20"/>
                 <w:szCs w:val="20"/>
@@ -2286,7 +2309,7 @@
             </w:r>
             <w:r>
               <w:rPr>
-                <w:rFonts w:ascii="Arial" w:eastAsia="Times New Roman" w:hAnsi="Arial" w:cs="Arial"/>
+                <w:rFonts w:ascii="Times New Roman" w:eastAsia="Times New Roman" w:hAnsi="Times New Roman" w:cs="Times New Roman"/>
                 <w:kern w:val="0"/>
                 <w:sz w:val="20"/>
                 <w:szCs w:val="20"/>
@@ -2318,7 +2341,7 @@
             <w:pPr>
               <w:spacing w:after="0" w:line="240" w:lineRule="auto"/>
               <w:rPr>
-                <w:rFonts w:ascii="Arial" w:eastAsia="Times New Roman" w:hAnsi="Arial" w:cs="Arial"/>
+                <w:rFonts w:ascii="Times New Roman" w:eastAsia="Times New Roman" w:hAnsi="Times New Roman" w:cs="Times New Roman"/>
                 <w:kern w:val="0"/>
                 <w:sz w:val="20"/>
                 <w:szCs w:val="20"/>
@@ -2337,7 +2360,7 @@
             </w:r>
             <w:r>
               <w:rPr>
-                <w:rFonts w:ascii="Arial" w:eastAsia="Times New Roman" w:hAnsi="Arial" w:cs="Arial"/>
+                <w:rFonts w:ascii="Times New Roman" w:eastAsia="Times New Roman" w:hAnsi="Times New Roman" w:cs="Times New Roman"/>
                 <w:kern w:val="0"/>
                 <w:sz w:val="20"/>
                 <w:szCs w:val="20"/>
@@ -2369,7 +2392,7 @@
             <w:pPr>
               <w:spacing w:after="0" w:line="240" w:lineRule="auto"/>
               <w:rPr>
-                <w:rFonts w:ascii="Arial" w:eastAsia="Times New Roman" w:hAnsi="Arial" w:cs="Arial"/>
+                <w:rFonts w:ascii="Times New Roman" w:eastAsia="Times New Roman" w:hAnsi="Times New Roman" w:cs="Times New Roman"/>
                 <w:kern w:val="0"/>
                 <w:sz w:val="20"/>
                 <w:szCs w:val="20"/>
@@ -2388,7 +2411,7 @@
             </w:r>
             <w:r>
               <w:rPr>
-                <w:rFonts w:ascii="Arial" w:eastAsia="Times New Roman" w:hAnsi="Arial" w:cs="Arial"/>
+                <w:rFonts w:ascii="Times New Roman" w:eastAsia="Times New Roman" w:hAnsi="Times New Roman" w:cs="Times New Roman"/>
                 <w:kern w:val="0"/>
                 <w:sz w:val="20"/>
                 <w:szCs w:val="20"/>
@@ -2420,7 +2443,7 @@
             <w:pPr>
               <w:spacing w:after="0" w:line="240" w:lineRule="auto"/>
               <w:rPr>
-                <w:rFonts w:ascii="Arial" w:eastAsia="Times New Roman" w:hAnsi="Arial" w:cs="Arial"/>
+                <w:rFonts w:ascii="Times New Roman" w:eastAsia="Times New Roman" w:hAnsi="Times New Roman" w:cs="Times New Roman"/>
                 <w:kern w:val="0"/>
                 <w:sz w:val="20"/>
                 <w:szCs w:val="20"/>
@@ -2439,7 +2462,7 @@
             </w:r>
             <w:r>
               <w:rPr>
-                <w:rFonts w:ascii="Arial" w:eastAsia="Times New Roman" w:hAnsi="Arial" w:cs="Arial"/>
+                <w:rFonts w:ascii="Times New Roman" w:eastAsia="Times New Roman" w:hAnsi="Times New Roman" w:cs="Times New Roman"/>
                 <w:kern w:val="0"/>
                 <w:sz w:val="20"/>
                 <w:szCs w:val="20"/>
@@ -2476,7 +2499,7 @@
             <w:pPr>
               <w:spacing w:after="0" w:line="240" w:lineRule="auto"/>
               <w:rPr>
-                <w:rFonts w:ascii="Arial" w:eastAsia="Times New Roman" w:hAnsi="Arial" w:cs="Arial"/>
+                <w:rFonts w:ascii="Times New Roman" w:eastAsia="Times New Roman" w:hAnsi="Times New Roman" w:cs="Times New Roman"/>
                 <w:kern w:val="0"/>
                 <w:sz w:val="20"/>
                 <w:szCs w:val="20"/>
@@ -2485,7 +2508,7 @@
             </w:pPr>
             <w:r>
               <w:rPr>
-                <w:rFonts w:ascii="Arial" w:eastAsia="Times New Roman" w:hAnsi="Arial" w:cs="Arial"/>
+                <w:rFonts w:ascii="Times New Roman" w:eastAsia="Times New Roman" w:hAnsi="Times New Roman" w:cs="Times New Roman"/>
                 <w:kern w:val="0"/>
                 <w:sz w:val="20"/>
                 <w:szCs w:val="20"/>
@@ -2517,7 +2540,7 @@
             <w:pPr>
               <w:spacing w:after="0" w:line="240" w:lineRule="auto"/>
               <w:rPr>
-                <w:rFonts w:ascii="Arial" w:eastAsia="Times New Roman" w:hAnsi="Arial" w:cs="Arial"/>
+                <w:rFonts w:ascii="Times New Roman" w:eastAsia="Times New Roman" w:hAnsi="Times New Roman" w:cs="Times New Roman"/>
                 <w:kern w:val="0"/>
                 <w:sz w:val="20"/>
                 <w:szCs w:val="20"/>
@@ -2526,7 +2549,7 @@
             </w:pPr>
             <w:r>
               <w:rPr>
-                <w:rFonts w:ascii="Arial" w:eastAsia="Times New Roman" w:hAnsi="Arial" w:cs="Arial"/>
+                <w:rFonts w:ascii="Times New Roman" w:eastAsia="Times New Roman" w:hAnsi="Times New Roman" w:cs="Times New Roman"/>
                 <w:kern w:val="0"/>
                 <w:sz w:val="20"/>
                 <w:szCs w:val="20"/>
@@ -2558,7 +2581,7 @@
             <w:pPr>
               <w:spacing w:after="0" w:line="240" w:lineRule="auto"/>
               <w:rPr>
-                <w:rFonts w:ascii="Arial" w:eastAsia="Times New Roman" w:hAnsi="Arial" w:cs="Arial"/>
+                <w:rFonts w:ascii="Times New Roman" w:eastAsia="Times New Roman" w:hAnsi="Times New Roman" w:cs="Times New Roman"/>
                 <w:kern w:val="0"/>
                 <w:sz w:val="20"/>
                 <w:szCs w:val="20"/>
@@ -2567,7 +2590,7 @@
             </w:pPr>
             <w:r>
               <w:rPr>
-                <w:rFonts w:ascii="Arial" w:eastAsia="Times New Roman" w:hAnsi="Arial" w:cs="Arial"/>
+                <w:rFonts w:ascii="Times New Roman" w:eastAsia="Times New Roman" w:hAnsi="Times New Roman" w:cs="Times New Roman"/>
                 <w:kern w:val="0"/>
                 <w:sz w:val="20"/>
                 <w:szCs w:val="20"/>
@@ -2599,7 +2622,7 @@
             <w:pPr>
               <w:spacing w:after="0" w:line="240" w:lineRule="auto"/>
               <w:rPr>
-                <w:rFonts w:ascii="Arial" w:eastAsia="Times New Roman" w:hAnsi="Arial" w:cs="Arial"/>
+                <w:rFonts w:ascii="Times New Roman" w:eastAsia="Times New Roman" w:hAnsi="Times New Roman" w:cs="Times New Roman"/>
                 <w:kern w:val="0"/>
                 <w:sz w:val="20"/>
                 <w:szCs w:val="20"/>
@@ -2608,7 +2631,7 @@
             </w:pPr>
             <w:r>
               <w:rPr>
-                <w:rFonts w:ascii="Arial" w:eastAsia="Times New Roman" w:hAnsi="Arial" w:cs="Arial"/>
+                <w:rFonts w:ascii="Times New Roman" w:eastAsia="Times New Roman" w:hAnsi="Times New Roman" w:cs="Times New Roman"/>
                 <w:kern w:val="0"/>
                 <w:sz w:val="20"/>
                 <w:szCs w:val="20"/>
@@ -2640,7 +2663,7 @@
             <w:pPr>
               <w:spacing w:after="0" w:line="240" w:lineRule="auto"/>
               <w:rPr>
-                <w:rFonts w:ascii="Arial" w:eastAsia="Times New Roman" w:hAnsi="Arial" w:cs="Arial"/>
+                <w:rFonts w:ascii="Times New Roman" w:eastAsia="Times New Roman" w:hAnsi="Times New Roman" w:cs="Times New Roman"/>
                 <w:kern w:val="0"/>
                 <w:sz w:val="20"/>
                 <w:szCs w:val="20"/>
@@ -2649,7 +2672,7 @@
             </w:pPr>
             <w:r>
               <w:rPr>
-                <w:rFonts w:ascii="Arial" w:eastAsia="Times New Roman" w:hAnsi="Arial" w:cs="Arial"/>
+                <w:rFonts w:ascii="Times New Roman" w:eastAsia="Times New Roman" w:hAnsi="Times New Roman" w:cs="Times New Roman"/>
                 <w:kern w:val="0"/>
                 <w:sz w:val="20"/>
                 <w:szCs w:val="20"/>
@@ -2681,7 +2704,7 @@
             <w:pPr>
               <w:spacing w:after="0" w:line="240" w:lineRule="auto"/>
               <w:rPr>
-                <w:rFonts w:ascii="Arial" w:eastAsia="Times New Roman" w:hAnsi="Arial" w:cs="Arial"/>
+                <w:rFonts w:ascii="Times New Roman" w:eastAsia="Times New Roman" w:hAnsi="Times New Roman" w:cs="Times New Roman"/>
                 <w:kern w:val="0"/>
                 <w:sz w:val="20"/>
                 <w:szCs w:val="20"/>
@@ -2690,7 +2713,7 @@
             </w:pPr>
             <w:r>
               <w:rPr>
-                <w:rFonts w:ascii="Arial" w:eastAsia="Times New Roman" w:hAnsi="Arial" w:cs="Arial"/>
+                <w:rFonts w:ascii="Times New Roman" w:eastAsia="Times New Roman" w:hAnsi="Times New Roman" w:cs="Times New Roman"/>
                 <w:kern w:val="0"/>
                 <w:sz w:val="20"/>
                 <w:szCs w:val="20"/>
@@ -2722,7 +2745,7 @@
             <w:pPr>
               <w:spacing w:after="0" w:line="240" w:lineRule="auto"/>
               <w:rPr>
-                <w:rFonts w:ascii="Arial" w:eastAsia="Times New Roman" w:hAnsi="Arial" w:cs="Arial"/>
+                <w:rFonts w:ascii="Times New Roman" w:eastAsia="Times New Roman" w:hAnsi="Times New Roman" w:cs="Times New Roman"/>
                 <w:kern w:val="0"/>
                 <w:sz w:val="20"/>
                 <w:szCs w:val="20"/>
@@ -2731,7 +2754,7 @@
             </w:pPr>
             <w:r>
               <w:rPr>
-                <w:rFonts w:ascii="Arial" w:eastAsia="Times New Roman" w:hAnsi="Arial" w:cs="Arial"/>
+                <w:rFonts w:ascii="Times New Roman" w:eastAsia="Times New Roman" w:hAnsi="Times New Roman" w:cs="Times New Roman"/>
                 <w:kern w:val="0"/>
                 <w:sz w:val="20"/>
                 <w:szCs w:val="20"/>
@@ -2768,7 +2791,7 @@
             <w:pPr>
               <w:spacing w:after="0" w:line="240" w:lineRule="auto"/>
               <w:rPr>
-                <w:rFonts w:ascii="Arial" w:eastAsia="Times New Roman" w:hAnsi="Arial" w:cs="Arial"/>
+                <w:rFonts w:ascii="Times New Roman" w:eastAsia="Times New Roman" w:hAnsi="Times New Roman" w:cs="Times New Roman"/>
                 <w:kern w:val="0"/>
                 <w:sz w:val="20"/>
                 <w:szCs w:val="20"/>
@@ -2777,7 +2800,7 @@
             </w:pPr>
             <w:r>
               <w:rPr>
-                <w:rFonts w:ascii="Arial" w:eastAsia="Times New Roman" w:hAnsi="Arial" w:cs="Arial"/>
+                <w:rFonts w:ascii="Times New Roman" w:eastAsia="Times New Roman" w:hAnsi="Times New Roman" w:cs="Times New Roman"/>
                 <w:kern w:val="0"/>
                 <w:sz w:val="20"/>
                 <w:szCs w:val="20"/>
@@ -2809,7 +2832,7 @@
             <w:pPr>
               <w:spacing w:after="0" w:line="240" w:lineRule="auto"/>
               <w:rPr>
-                <w:rFonts w:ascii="Arial" w:eastAsia="Times New Roman" w:hAnsi="Arial" w:cs="Arial"/>
+                <w:rFonts w:ascii="Times New Roman" w:eastAsia="Times New Roman" w:hAnsi="Times New Roman" w:cs="Times New Roman"/>
                 <w:kern w:val="0"/>
                 <w:sz w:val="20"/>
                 <w:szCs w:val="20"/>
@@ -2818,7 +2841,7 @@
             </w:pPr>
             <w:r>
               <w:rPr>
-                <w:rFonts w:ascii="Arial" w:eastAsia="Times New Roman" w:hAnsi="Arial" w:cs="Arial"/>
+                <w:rFonts w:ascii="Times New Roman" w:eastAsia="Times New Roman" w:hAnsi="Times New Roman" w:cs="Times New Roman"/>
                 <w:kern w:val="0"/>
                 <w:sz w:val="20"/>
                 <w:szCs w:val="20"/>
@@ -2850,7 +2873,7 @@
             <w:pPr>
               <w:spacing w:after="0" w:line="240" w:lineRule="auto"/>
               <w:rPr>
-                <w:rFonts w:ascii="Arial" w:eastAsia="Times New Roman" w:hAnsi="Arial" w:cs="Arial"/>
+                <w:rFonts w:ascii="Times New Roman" w:eastAsia="Times New Roman" w:hAnsi="Times New Roman" w:cs="Times New Roman"/>
                 <w:kern w:val="0"/>
                 <w:sz w:val="20"/>
                 <w:szCs w:val="20"/>
@@ -2859,7 +2882,7 @@
             </w:pPr>
             <w:r>
               <w:rPr>
-                <w:rFonts w:ascii="Arial" w:eastAsia="Times New Roman" w:hAnsi="Arial" w:cs="Arial"/>
+                <w:rFonts w:ascii="Times New Roman" w:eastAsia="Times New Roman" w:hAnsi="Times New Roman" w:cs="Times New Roman"/>
                 <w:kern w:val="0"/>
                 <w:sz w:val="20"/>
                 <w:szCs w:val="20"/>
@@ -2891,7 +2914,7 @@
             <w:pPr>
               <w:spacing w:after="0" w:line="240" w:lineRule="auto"/>
               <w:rPr>
-                <w:rFonts w:ascii="Arial" w:eastAsia="Times New Roman" w:hAnsi="Arial" w:cs="Arial"/>
+                <w:rFonts w:ascii="Times New Roman" w:eastAsia="Times New Roman" w:hAnsi="Times New Roman" w:cs="Times New Roman"/>
                 <w:kern w:val="0"/>
                 <w:sz w:val="20"/>
                 <w:szCs w:val="20"/>
@@ -2900,7 +2923,7 @@
             </w:pPr>
             <w:r>
               <w:rPr>
-                <w:rFonts w:ascii="Arial" w:eastAsia="Times New Roman" w:hAnsi="Arial" w:cs="Arial"/>
+                <w:rFonts w:ascii="Times New Roman" w:eastAsia="Times New Roman" w:hAnsi="Times New Roman" w:cs="Times New Roman"/>
                 <w:kern w:val="0"/>
                 <w:sz w:val="20"/>
                 <w:szCs w:val="20"/>
@@ -2932,7 +2955,7 @@
             <w:pPr>
               <w:spacing w:after="0" w:line="240" w:lineRule="auto"/>
               <w:rPr>
-                <w:rFonts w:ascii="Arial" w:eastAsia="Times New Roman" w:hAnsi="Arial" w:cs="Arial"/>
+                <w:rFonts w:ascii="Times New Roman" w:eastAsia="Times New Roman" w:hAnsi="Times New Roman" w:cs="Times New Roman"/>
                 <w:kern w:val="0"/>
                 <w:sz w:val="20"/>
                 <w:szCs w:val="20"/>
@@ -2941,7 +2964,7 @@
             </w:pPr>
             <w:r>
               <w:rPr>
-                <w:rFonts w:ascii="Arial" w:eastAsia="Times New Roman" w:hAnsi="Arial" w:cs="Arial"/>
+                <w:rFonts w:ascii="Times New Roman" w:eastAsia="Times New Roman" w:hAnsi="Times New Roman" w:cs="Times New Roman"/>
                 <w:kern w:val="0"/>
                 <w:sz w:val="20"/>
                 <w:szCs w:val="20"/>
@@ -2973,7 +2996,7 @@
             <w:pPr>
               <w:spacing w:after="0" w:line="240" w:lineRule="auto"/>
               <w:rPr>
-                <w:rFonts w:ascii="Arial" w:eastAsia="Times New Roman" w:hAnsi="Arial" w:cs="Arial"/>
+                <w:rFonts w:ascii="Times New Roman" w:eastAsia="Times New Roman" w:hAnsi="Times New Roman" w:cs="Times New Roman"/>
                 <w:kern w:val="0"/>
                 <w:sz w:val="20"/>
                 <w:szCs w:val="20"/>
@@ -2982,7 +3005,7 @@
             </w:pPr>
             <w:r>
               <w:rPr>
-                <w:rFonts w:ascii="Arial" w:eastAsia="Times New Roman" w:hAnsi="Arial" w:cs="Arial"/>
+                <w:rFonts w:ascii="Times New Roman" w:eastAsia="Times New Roman" w:hAnsi="Times New Roman" w:cs="Times New Roman"/>
                 <w:kern w:val="0"/>
                 <w:sz w:val="20"/>
                 <w:szCs w:val="20"/>
@@ -3014,7 +3037,7 @@
             <w:pPr>
               <w:spacing w:after="0" w:line="240" w:lineRule="auto"/>
               <w:rPr>
-                <w:rFonts w:ascii="Arial" w:eastAsia="Times New Roman" w:hAnsi="Arial" w:cs="Arial"/>
+                <w:rFonts w:ascii="Times New Roman" w:eastAsia="Times New Roman" w:hAnsi="Times New Roman" w:cs="Times New Roman"/>
                 <w:kern w:val="0"/>
                 <w:sz w:val="20"/>
                 <w:szCs w:val="20"/>
@@ -3023,7 +3046,7 @@
             </w:pPr>
             <w:r>
               <w:rPr>
-                <w:rFonts w:ascii="Arial" w:eastAsia="Times New Roman" w:hAnsi="Arial" w:cs="Arial"/>
+                <w:rFonts w:ascii="Times New Roman" w:eastAsia="Times New Roman" w:hAnsi="Times New Roman" w:cs="Times New Roman"/>
                 <w:kern w:val="0"/>
                 <w:sz w:val="20"/>
                 <w:szCs w:val="20"/>
@@ -3169,7 +3192,15 @@
           <w:kern w:val="0"/>
           <w14:ligatures w14:val="none"/>
         </w:rPr>
-        <w:t xml:space="preserve"> Download the complete datasets for </w:t>
+        <w:t xml:space="preserve"> Download </w:t>
+      </w:r>
+      <w:r>
+        <w:rPr>
+          <w:rFonts w:ascii="Times New Roman" w:eastAsia="Times New Roman" w:hAnsi="Times New Roman" w:cs="Times New Roman"/>
+          <w:kern w:val="0"/>
+          <w14:ligatures w14:val="none"/>
+        </w:rPr>
+        <w:t xml:space="preserve">multiple databases including </w:t>
       </w:r>
       <w:proofErr w:type="spellStart"/>
       <w:r>
@@ -3178,7 +3209,7 @@
           <w:kern w:val="0"/>
           <w14:ligatures w14:val="none"/>
         </w:rPr>
-        <w:t>CellMarkerDB</w:t>
+        <w:t>cellmarkerdb</w:t>
       </w:r>
       <w:proofErr w:type="spellEnd"/>
       <w:r>
@@ -3187,15 +3218,25 @@
           <w:kern w:val="0"/>
           <w14:ligatures w14:val="none"/>
         </w:rPr>
-        <w:t xml:space="preserve"> and</w:t>
-      </w:r>
+        <w:t xml:space="preserve">, </w:t>
+      </w:r>
+      <w:proofErr w:type="spellStart"/>
       <w:r>
         <w:rPr>
           <w:rFonts w:ascii="Times New Roman" w:eastAsia="Times New Roman" w:hAnsi="Times New Roman" w:cs="Times New Roman"/>
           <w:kern w:val="0"/>
           <w14:ligatures w14:val="none"/>
         </w:rPr>
-        <w:t xml:space="preserve"> the </w:t>
+        <w:t>cellxgene</w:t>
+      </w:r>
+      <w:proofErr w:type="spellEnd"/>
+      <w:r>
+        <w:rPr>
+          <w:rFonts w:ascii="Times New Roman" w:eastAsia="Times New Roman" w:hAnsi="Times New Roman" w:cs="Times New Roman"/>
+          <w:kern w:val="0"/>
+          <w14:ligatures w14:val="none"/>
+        </w:rPr>
+        <w:t xml:space="preserve">, </w:t>
       </w:r>
       <w:proofErr w:type="spellStart"/>
       <w:r>
@@ -3204,7 +3245,7 @@
           <w:kern w:val="0"/>
           <w14:ligatures w14:val="none"/>
         </w:rPr>
-        <w:t>Uberon</w:t>
+        <w:t>panglaodb</w:t>
       </w:r>
       <w:proofErr w:type="spellEnd"/>
       <w:r>
@@ -3213,8 +3254,18 @@
           <w:kern w:val="0"/>
           <w14:ligatures w14:val="none"/>
         </w:rPr>
-        <w:t xml:space="preserve"> ontology. </w:t>
-      </w:r>
+        <w:t xml:space="preserve">, </w:t>
+      </w:r>
+      <w:proofErr w:type="spellStart"/>
+      <w:r>
+        <w:rPr>
+          <w:rFonts w:ascii="Times New Roman" w:eastAsia="Times New Roman" w:hAnsi="Times New Roman" w:cs="Times New Roman"/>
+          <w:kern w:val="0"/>
+          <w14:ligatures w14:val="none"/>
+        </w:rPr>
+        <w:t>HubMap</w:t>
+      </w:r>
+      <w:proofErr w:type="spellEnd"/>
     </w:p>
     <w:p>
       <w:pPr>
@@ -3245,7 +3296,15 @@
           <w:kern w:val="0"/>
           <w14:ligatures w14:val="none"/>
         </w:rPr>
-        <w:t xml:space="preserve"> Parse the </w:t>
+        <w:t xml:space="preserve"> </w:t>
+      </w:r>
+      <w:r>
+        <w:rPr>
+          <w:rFonts w:ascii="Times New Roman" w:eastAsia="Times New Roman" w:hAnsi="Times New Roman" w:cs="Times New Roman"/>
+          <w:kern w:val="0"/>
+          <w14:ligatures w14:val="none"/>
+        </w:rPr>
+        <w:t xml:space="preserve">Using </w:t>
       </w:r>
       <w:proofErr w:type="spellStart"/>
       <w:r>
@@ -3254,7 +3313,7 @@
           <w:kern w:val="0"/>
           <w14:ligatures w14:val="none"/>
         </w:rPr>
-        <w:t>Uberon</w:t>
+        <w:t>cellxgene</w:t>
       </w:r>
       <w:proofErr w:type="spellEnd"/>
       <w:r>
@@ -3263,7 +3322,15 @@
           <w:kern w:val="0"/>
           <w14:ligatures w14:val="none"/>
         </w:rPr>
-        <w:t xml:space="preserve"> ontology to extract its internal structure. This will be used to build a directed acyclic graph (DAG) that represents the hierarchical relationships between organs, tissues, and cells. This graph will serve as the core framework for a consistent naming system.</w:t>
+        <w:t xml:space="preserve"> ontology guide for extracting </w:t>
+      </w:r>
+      <w:r>
+        <w:rPr>
+          <w:rFonts w:ascii="Times New Roman" w:eastAsia="Times New Roman" w:hAnsi="Times New Roman" w:cs="Times New Roman"/>
+          <w:kern w:val="0"/>
+          <w14:ligatures w14:val="none"/>
+        </w:rPr>
+        <w:t>cell and tissue ID and hierarchy</w:t>
       </w:r>
     </w:p>
     <w:p>
@@ -3295,7 +3362,31 @@
           <w:kern w:val="0"/>
           <w14:ligatures w14:val="none"/>
         </w:rPr>
-        <w:t xml:space="preserve"> Parse the </w:t>
+        <w:t xml:space="preserve"> </w:t>
+      </w:r>
+      <w:r>
+        <w:rPr>
+          <w:rFonts w:ascii="Times New Roman" w:eastAsia="Times New Roman" w:hAnsi="Times New Roman" w:cs="Times New Roman"/>
+          <w:kern w:val="0"/>
+          <w14:ligatures w14:val="none"/>
+        </w:rPr>
+        <w:t>Each of the database has separate parser</w:t>
+      </w:r>
+      <w:r>
+        <w:rPr>
+          <w:rFonts w:ascii="Times New Roman" w:eastAsia="Times New Roman" w:hAnsi="Times New Roman" w:cs="Times New Roman"/>
+          <w:kern w:val="0"/>
+          <w14:ligatures w14:val="none"/>
+        </w:rPr>
+        <w:t xml:space="preserve"> connected to ontology parser f</w:t>
+      </w:r>
+      <w:r>
+        <w:rPr>
+          <w:rFonts w:ascii="Times New Roman" w:eastAsia="Times New Roman" w:hAnsi="Times New Roman" w:cs="Times New Roman"/>
+          <w:kern w:val="0"/>
+          <w14:ligatures w14:val="none"/>
+        </w:rPr>
+        <w:t xml:space="preserve">or entries with missing cell or tissue IDs, use the constructed </w:t>
       </w:r>
       <w:proofErr w:type="spellStart"/>
       <w:r>
@@ -3304,7 +3395,7 @@
           <w:kern w:val="0"/>
           <w14:ligatures w14:val="none"/>
         </w:rPr>
-        <w:t>CellMarkerDB</w:t>
+        <w:t>Uberon</w:t>
       </w:r>
       <w:proofErr w:type="spellEnd"/>
       <w:r>
@@ -3313,25 +3404,31 @@
           <w:kern w:val="0"/>
           <w14:ligatures w14:val="none"/>
         </w:rPr>
-        <w:t xml:space="preserve">. For entries with missing cell or tissue IDs, use the constructed </w:t>
-      </w:r>
-      <w:proofErr w:type="spellStart"/>
+        <w:t xml:space="preserve"> graph to programmatically map and standardize the nomenclature. This ensures all marker data </w:t>
+      </w:r>
       <w:r>
         <w:rPr>
           <w:rFonts w:ascii="Times New Roman" w:eastAsia="Times New Roman" w:hAnsi="Times New Roman" w:cs="Times New Roman"/>
           <w:kern w:val="0"/>
           <w14:ligatures w14:val="none"/>
         </w:rPr>
-        <w:t>Uberon</w:t>
-      </w:r>
-      <w:proofErr w:type="spellEnd"/>
+        <w:t xml:space="preserve">(combined into a single database) </w:t>
+      </w:r>
       <w:r>
         <w:rPr>
           <w:rFonts w:ascii="Times New Roman" w:eastAsia="Times New Roman" w:hAnsi="Times New Roman" w:cs="Times New Roman"/>
           <w:kern w:val="0"/>
           <w14:ligatures w14:val="none"/>
         </w:rPr>
-        <w:t xml:space="preserve"> graph to programmatically map and standardize the nomenclature. This ensures all marker data is linked to a consistent ontological framework.</w:t>
+        <w:t>is linked to a consistent ontological framework.</w:t>
+      </w:r>
+      <w:r>
+        <w:rPr>
+          <w:rFonts w:ascii="Times New Roman" w:eastAsia="Times New Roman" w:hAnsi="Times New Roman" w:cs="Times New Roman"/>
+          <w:kern w:val="0"/>
+          <w14:ligatures w14:val="none"/>
+        </w:rPr>
+        <w:t xml:space="preserve"> </w:t>
       </w:r>
     </w:p>
     <w:p>
@@ -3386,8 +3483,27 @@
           <w:kern w:val="0"/>
           <w14:ligatures w14:val="none"/>
         </w:rPr>
-        <w:lastRenderedPageBreak/>
-        <w:t>Phase 2: Database Enrichment and Validation</w:t>
+        <w:br/>
+      </w:r>
+      <w:r>
+        <w:rPr>
+          <w:rFonts w:ascii="Times New Roman" w:eastAsia="Times New Roman" w:hAnsi="Times New Roman" w:cs="Times New Roman"/>
+          <w:b/>
+          <w:bCs/>
+          <w:kern w:val="0"/>
+          <w14:ligatures w14:val="none"/>
+        </w:rPr>
+        <w:t xml:space="preserve">Phase 2: Database </w:t>
+      </w:r>
+      <w:r>
+        <w:rPr>
+          <w:rFonts w:ascii="Times New Roman" w:eastAsia="Times New Roman" w:hAnsi="Times New Roman" w:cs="Times New Roman"/>
+          <w:b/>
+          <w:bCs/>
+          <w:kern w:val="0"/>
+          <w14:ligatures w14:val="none"/>
+        </w:rPr>
+        <w:t>Update</w:t>
       </w:r>
     </w:p>
     <w:p>
@@ -3411,7 +3527,8 @@
           <w:kern w:val="0"/>
           <w14:ligatures w14:val="none"/>
         </w:rPr>
-        <w:t>Atlas-Based Marker Discovery:</w:t>
+        <w:lastRenderedPageBreak/>
+        <w:t>Comparative Analysis and Scoring:</w:t>
       </w:r>
       <w:r>
         <w:rPr>
@@ -3419,7 +3536,63 @@
           <w:kern w:val="0"/>
           <w14:ligatures w14:val="none"/>
         </w:rPr>
-        <w:t xml:space="preserve"> Perform differential gene expression analysis on the Tabula Sapiens Atlas data. The analysis should identify marker genes for each unique combination of cell ID, tissue ID, and cell-tissue ID present in the atlas. This is a crucial step to generate your own high-quality marker list from a trusted source.</w:t>
+        <w:t xml:space="preserve"> </w:t>
+      </w:r>
+      <w:r>
+        <w:rPr>
+          <w:rFonts w:ascii="Times New Roman" w:eastAsia="Times New Roman" w:hAnsi="Times New Roman" w:cs="Times New Roman"/>
+          <w:kern w:val="0"/>
+          <w14:ligatures w14:val="none"/>
+        </w:rPr>
+        <w:t>Given new database</w:t>
+      </w:r>
+      <w:r>
+        <w:rPr>
+          <w:rFonts w:ascii="Times New Roman" w:eastAsia="Times New Roman" w:hAnsi="Times New Roman" w:cs="Times New Roman"/>
+          <w:kern w:val="0"/>
+          <w14:ligatures w14:val="none"/>
+        </w:rPr>
+        <w:t xml:space="preserve"> consolidated from publication</w:t>
+      </w:r>
+      <w:r>
+        <w:rPr>
+          <w:rFonts w:ascii="Times New Roman" w:eastAsia="Times New Roman" w:hAnsi="Times New Roman" w:cs="Times New Roman"/>
+          <w:kern w:val="0"/>
+          <w14:ligatures w14:val="none"/>
+        </w:rPr>
+        <w:t xml:space="preserve"> </w:t>
+      </w:r>
+      <w:r>
+        <w:rPr>
+          <w:rFonts w:ascii="Times New Roman" w:eastAsia="Times New Roman" w:hAnsi="Times New Roman" w:cs="Times New Roman"/>
+          <w:kern w:val="0"/>
+          <w14:ligatures w14:val="none"/>
+        </w:rPr>
+        <w:t>c</w:t>
+      </w:r>
+      <w:r>
+        <w:rPr>
+          <w:rFonts w:ascii="Times New Roman" w:eastAsia="Times New Roman" w:hAnsi="Times New Roman" w:cs="Times New Roman"/>
+          <w:kern w:val="0"/>
+          <w14:ligatures w14:val="none"/>
+        </w:rPr>
+        <w:t>ompare the marker genes with the markers already present in your curated SQLite</w:t>
+      </w:r>
+      <w:r>
+        <w:rPr>
+          <w:rFonts w:ascii="Times New Roman" w:eastAsia="Times New Roman" w:hAnsi="Times New Roman" w:cs="Times New Roman"/>
+          <w:kern w:val="0"/>
+          <w14:ligatures w14:val="none"/>
+        </w:rPr>
+        <w:t xml:space="preserve"> database</w:t>
+      </w:r>
+      <w:r>
+        <w:rPr>
+          <w:rFonts w:ascii="Times New Roman" w:eastAsia="Times New Roman" w:hAnsi="Times New Roman" w:cs="Times New Roman"/>
+          <w:kern w:val="0"/>
+          <w14:ligatures w14:val="none"/>
+        </w:rPr>
+        <w:t>. Instead of a simple "union," a more robust approach is to implement a scoring system that prioritizes markers found in both sources or those with strong statistical significance in the atlas. This ensures the highest confidence markers are given more weight.</w:t>
       </w:r>
     </w:p>
     <w:p>
@@ -3443,7 +3616,7 @@
           <w:kern w:val="0"/>
           <w14:ligatures w14:val="none"/>
         </w:rPr>
-        <w:t>Comparative Analysis and Scoring:</w:t>
+        <w:t>Database Update:</w:t>
       </w:r>
       <w:r>
         <w:rPr>
@@ -3451,57 +3624,31 @@
           <w:kern w:val="0"/>
           <w14:ligatures w14:val="none"/>
         </w:rPr>
-        <w:t xml:space="preserve"> Compare the marker genes identified in the Tabula Sapiens Atlas with the markers already present in your curated SQLite database (from </w:t>
-      </w:r>
-      <w:proofErr w:type="spellStart"/>
+        <w:t xml:space="preserve"> Update the SQLite database with the new markers</w:t>
+      </w:r>
       <w:r>
         <w:rPr>
           <w:rFonts w:ascii="Times New Roman" w:eastAsia="Times New Roman" w:hAnsi="Times New Roman" w:cs="Times New Roman"/>
           <w:kern w:val="0"/>
           <w14:ligatures w14:val="none"/>
         </w:rPr>
-        <w:t>CellMarkerDB</w:t>
-      </w:r>
-      <w:proofErr w:type="spellEnd"/>
+        <w:t xml:space="preserve"> along with </w:t>
+      </w:r>
       <w:r>
         <w:rPr>
           <w:rFonts w:ascii="Times New Roman" w:eastAsia="Times New Roman" w:hAnsi="Times New Roman" w:cs="Times New Roman"/>
           <w:kern w:val="0"/>
           <w14:ligatures w14:val="none"/>
         </w:rPr>
-        <w:t>). Instead of a simple "union," a more robust approach is to implement a scoring system that prioritizes markers found in both sources or those with strong statistical significance in the atlas. This ensures the highest confidence markers are given more weight.</w:t>
-      </w:r>
-    </w:p>
-    <w:p>
-      <w:pPr>
-        <w:numPr>
-          <w:ilvl w:val="0"/>
-          <w:numId w:val="6"/>
-        </w:numPr>
-        <w:spacing w:before="100" w:beforeAutospacing="1" w:after="100" w:afterAutospacing="1" w:line="240" w:lineRule="auto"/>
+        <w:t>prove from literature and in case of computational markers use mean expression</w:t>
+      </w:r>
+      <w:r>
         <w:rPr>
           <w:rFonts w:ascii="Times New Roman" w:eastAsia="Times New Roman" w:hAnsi="Times New Roman" w:cs="Times New Roman"/>
           <w:kern w:val="0"/>
           <w14:ligatures w14:val="none"/>
         </w:rPr>
-      </w:pPr>
-      <w:r>
-        <w:rPr>
-          <w:rFonts w:ascii="Times New Roman" w:eastAsia="Times New Roman" w:hAnsi="Times New Roman" w:cs="Times New Roman"/>
-          <w:b/>
-          <w:bCs/>
-          <w:kern w:val="0"/>
-          <w14:ligatures w14:val="none"/>
-        </w:rPr>
-        <w:t>Database Update:</w:t>
-      </w:r>
-      <w:r>
-        <w:rPr>
-          <w:rFonts w:ascii="Times New Roman" w:eastAsia="Times New Roman" w:hAnsi="Times New Roman" w:cs="Times New Roman"/>
-          <w:kern w:val="0"/>
-          <w14:ligatures w14:val="none"/>
-        </w:rPr>
-        <w:t xml:space="preserve"> Update the SQLite database with the new markers and their associated confidence scores from the Tabula Sapiens analysis. This creates a more comprehensive and validated resource.</w:t>
+        <w:t xml:space="preserve"> and percent cell expressing the marker.</w:t>
       </w:r>
     </w:p>
     <w:p>
@@ -3542,73 +3689,25 @@
       </w:pPr>
       <w:r>
         <w:rPr>
-          <w:rFonts w:ascii="Times New Roman" w:eastAsia="Times New Roman" w:hAnsi="Times New Roman" w:cs="Times New Roman"/>
+          <w:rFonts w:ascii="Times New Roman" w:hAnsi="Times New Roman" w:cs="Times New Roman"/>
           <w:b/>
           <w:bCs/>
+        </w:rPr>
+        <w:t>Annotation Tool Core Logic:</w:t>
+      </w:r>
+      <w:r>
+        <w:rPr>
+          <w:rFonts w:ascii="Times New Roman" w:hAnsi="Times New Roman" w:cs="Times New Roman"/>
+        </w:rPr>
+        <w:t xml:space="preserve"> The core algorithm processes differentially expressed gene (DEG) files generated from spatial or single-cell analyses. For each cluster within the input file, the tool automatically extracts a list of significant marker genes based on user-defined statistical thresholds for adjusted p-value, log2 fold change, and mean expression counts.</w:t>
+      </w:r>
+      <w:r>
+        <w:rPr>
+          <w:rFonts w:ascii="Times New Roman" w:eastAsia="Times New Roman" w:hAnsi="Times New Roman" w:cs="Times New Roman"/>
           <w:kern w:val="0"/>
           <w14:ligatures w14:val="none"/>
         </w:rPr>
-        <w:t>Annotation Tool Core Logic:</w:t>
-      </w:r>
-      <w:r>
-        <w:rPr>
-          <w:rFonts w:ascii="Times New Roman" w:eastAsia="Times New Roman" w:hAnsi="Times New Roman" w:cs="Times New Roman"/>
-          <w:kern w:val="0"/>
-          <w14:ligatures w14:val="none"/>
-        </w:rPr>
-        <w:t xml:space="preserve"> Develop the core algorithm that accepts a user-submitted dictionary of genes from a single-cell cluster</w:t>
-      </w:r>
-      <w:r>
-        <w:rPr>
-          <w:rFonts w:ascii="Times New Roman" w:eastAsia="Times New Roman" w:hAnsi="Times New Roman" w:cs="Times New Roman"/>
-          <w:kern w:val="0"/>
-          <w14:ligatures w14:val="none"/>
-        </w:rPr>
-        <w:t xml:space="preserve"> given a spatial/single-cell object with clusters. Perform quality control based on the metadata to </w:t>
-      </w:r>
-      <w:r>
-        <w:rPr>
-          <w:rFonts w:ascii="Times New Roman" w:eastAsia="Times New Roman" w:hAnsi="Times New Roman" w:cs="Times New Roman"/>
-          <w:kern w:val="0"/>
-          <w14:ligatures w14:val="none"/>
-        </w:rPr>
-        <w:t xml:space="preserve">understand if the </w:t>
-      </w:r>
-      <w:proofErr w:type="gramStart"/>
-      <w:r>
-        <w:rPr>
-          <w:rFonts w:ascii="Times New Roman" w:eastAsia="Times New Roman" w:hAnsi="Times New Roman" w:cs="Times New Roman"/>
-          <w:kern w:val="0"/>
-          <w14:ligatures w14:val="none"/>
-        </w:rPr>
-        <w:t>particular cluster</w:t>
-      </w:r>
-      <w:proofErr w:type="gramEnd"/>
-      <w:r>
-        <w:rPr>
-          <w:rFonts w:ascii="Times New Roman" w:eastAsia="Times New Roman" w:hAnsi="Times New Roman" w:cs="Times New Roman"/>
-          <w:kern w:val="0"/>
-          <w14:ligatures w14:val="none"/>
-        </w:rPr>
-        <w:t xml:space="preserve"> is not annotated because of the quality of cells/information at the </w:t>
-      </w:r>
-      <w:proofErr w:type="gramStart"/>
-      <w:r>
-        <w:rPr>
-          <w:rFonts w:ascii="Times New Roman" w:eastAsia="Times New Roman" w:hAnsi="Times New Roman" w:cs="Times New Roman"/>
-          <w:kern w:val="0"/>
-          <w14:ligatures w14:val="none"/>
-        </w:rPr>
-        <w:t>particular spot</w:t>
-      </w:r>
-      <w:proofErr w:type="gramEnd"/>
-      <w:r>
-        <w:rPr>
-          <w:rFonts w:ascii="Times New Roman" w:eastAsia="Times New Roman" w:hAnsi="Times New Roman" w:cs="Times New Roman"/>
-          <w:kern w:val="0"/>
-          <w14:ligatures w14:val="none"/>
-        </w:rPr>
-        <w:t xml:space="preserve">. </w:t>
+        <w:t xml:space="preserve"> </w:t>
       </w:r>
     </w:p>
     <w:p>
@@ -3626,21 +3725,24 @@
       </w:pPr>
       <w:r>
         <w:rPr>
-          <w:rFonts w:ascii="Times New Roman" w:eastAsia="Times New Roman" w:hAnsi="Times New Roman" w:cs="Times New Roman"/>
+          <w:rFonts w:ascii="Times New Roman" w:hAnsi="Times New Roman" w:cs="Times New Roman"/>
           <w:b/>
           <w:bCs/>
-          <w:kern w:val="0"/>
-          <w14:ligatures w14:val="none"/>
         </w:rPr>
         <w:t>Statistical Enrichment Analysis:</w:t>
       </w:r>
       <w:r>
         <w:rPr>
-          <w:rFonts w:ascii="Times New Roman" w:eastAsia="Times New Roman" w:hAnsi="Times New Roman" w:cs="Times New Roman"/>
-          <w:kern w:val="0"/>
-          <w14:ligatures w14:val="none"/>
-        </w:rPr>
-        <w:t xml:space="preserve"> Use the Fisher's exact test or a hypergeometric test to compare the user's gene list against the marker lists in the SQLite database. The result should be a ranked list of potential cell types.</w:t>
+          <w:rFonts w:ascii="Times New Roman" w:hAnsi="Times New Roman" w:cs="Times New Roman"/>
+        </w:rPr>
+        <w:t xml:space="preserve"> A hypergeometric test is implemented for the statistical enrichment analysis. This test evaluates the significance of the overlap between the extracted gene list for each cluster and the curated gene sets within a pre-compiled cell marker database. The analysis yields a ranked list of candidate cell type annotations for each </w:t>
+      </w:r>
+      <w:proofErr w:type="spellStart"/>
+      <w:r>
+        <w:rPr>
+          <w:rFonts w:ascii="Times New Roman" w:hAnsi="Times New Roman" w:cs="Times New Roman"/>
+        </w:rPr>
+        <w:t>cluster.</w:t>
       </w:r>
     </w:p>
     <w:p>
@@ -3656,7 +3758,25 @@
           <w14:ligatures w14:val="none"/>
         </w:rPr>
       </w:pPr>
-      <w:r>
+      <w:proofErr w:type="spellEnd"/>
+      <w:r>
+        <w:rPr>
+          <w:rFonts w:ascii="Times New Roman" w:hAnsi="Times New Roman" w:cs="Times New Roman"/>
+          <w:b/>
+          <w:bCs/>
+        </w:rPr>
+        <w:t>Output Generation:</w:t>
+      </w:r>
+      <w:r>
+        <w:rPr>
+          <w:rFonts w:ascii="Times New Roman" w:hAnsi="Times New Roman" w:cs="Times New Roman"/>
+        </w:rPr>
+        <w:t xml:space="preserve"> The tool generates multiple outputs to facilitate data-driven decisions. For each potential annotation, it provides key metrics including the raw p-value, an FDR-corrected p-value (Benjamini-Hochberg), the enrichment ratio, and the list of specific genes driving the enrichment. All results are compiled into a comprehensive, interactive HTML report that features sortable data tables, dynamic heatmaps, and a DEG browser with publication-quality plots for exploring the underlying data distributions.</w:t>
+      </w:r>
+    </w:p>
+    <w:p>
+      <w:pPr>
+        <w:spacing w:before="100" w:beforeAutospacing="1" w:after="100" w:afterAutospacing="1" w:line="240" w:lineRule="auto"/>
         <w:rPr>
           <w:rFonts w:ascii="Times New Roman" w:eastAsia="Times New Roman" w:hAnsi="Times New Roman" w:cs="Times New Roman"/>
           <w:b/>
@@ -3664,55 +3784,8 @@
           <w:kern w:val="0"/>
           <w14:ligatures w14:val="none"/>
         </w:rPr>
-        <w:t>Output Generation:</w:t>
-      </w:r>
-      <w:r>
-        <w:rPr>
-          <w:rFonts w:ascii="Times New Roman" w:eastAsia="Times New Roman" w:hAnsi="Times New Roman" w:cs="Times New Roman"/>
-          <w:kern w:val="0"/>
-          <w14:ligatures w14:val="none"/>
-        </w:rPr>
-        <w:t xml:space="preserve"> The final output should not just be a list of </w:t>
-      </w:r>
-      <w:proofErr w:type="gramStart"/>
-      <w:r>
-        <w:rPr>
-          <w:rFonts w:ascii="Times New Roman" w:eastAsia="Times New Roman" w:hAnsi="Times New Roman" w:cs="Times New Roman"/>
-          <w:kern w:val="0"/>
-          <w14:ligatures w14:val="none"/>
-        </w:rPr>
-        <w:t>cell</w:t>
-      </w:r>
-      <w:proofErr w:type="gramEnd"/>
-      <w:r>
-        <w:rPr>
-          <w:rFonts w:ascii="Times New Roman" w:eastAsia="Times New Roman" w:hAnsi="Times New Roman" w:cs="Times New Roman"/>
-          <w:kern w:val="0"/>
-          <w14:ligatures w14:val="none"/>
-        </w:rPr>
-        <w:t xml:space="preserve"> </w:t>
-      </w:r>
-      <w:proofErr w:type="gramStart"/>
-      <w:r>
-        <w:rPr>
-          <w:rFonts w:ascii="Times New Roman" w:eastAsia="Times New Roman" w:hAnsi="Times New Roman" w:cs="Times New Roman"/>
-          <w:kern w:val="0"/>
-          <w14:ligatures w14:val="none"/>
-        </w:rPr>
-        <w:t>types, but</w:t>
-      </w:r>
-      <w:proofErr w:type="gramEnd"/>
-      <w:r>
-        <w:rPr>
-          <w:rFonts w:ascii="Times New Roman" w:eastAsia="Times New Roman" w:hAnsi="Times New Roman" w:cs="Times New Roman"/>
-          <w:kern w:val="0"/>
-          <w14:ligatures w14:val="none"/>
-        </w:rPr>
-        <w:t xml:space="preserve"> also include the statistical significance for each assignment (p-value) and a corrected p-value (e.g., False Discovery Rate, FDR). This allows the user to make a data-driven decision on cell identity.</w:t>
-      </w:r>
-    </w:p>
-    <w:p>
-      <w:pPr>
+      </w:pPr>
+      <w:r>
         <w:rPr>
           <w:rFonts w:ascii="Times New Roman" w:eastAsia="Times New Roman" w:hAnsi="Times New Roman" w:cs="Times New Roman"/>
           <w:b/>
@@ -3720,7 +3793,8 @@
           <w:kern w:val="0"/>
           <w14:ligatures w14:val="none"/>
         </w:rPr>
-      </w:pPr>
+        <w:t>Current update (</w:t>
+      </w:r>
       <w:r>
         <w:rPr>
           <w:rFonts w:ascii="Times New Roman" w:eastAsia="Times New Roman" w:hAnsi="Times New Roman" w:cs="Times New Roman"/>
@@ -3729,20 +3803,19 @@
           <w:kern w:val="0"/>
           <w14:ligatures w14:val="none"/>
         </w:rPr>
-        <w:br w:type="page"/>
-      </w:r>
-    </w:p>
-    <w:p>
-      <w:pPr>
-        <w:spacing w:before="100" w:beforeAutospacing="1" w:after="100" w:afterAutospacing="1" w:line="240" w:lineRule="auto"/>
+        <w:t>9</w:t>
+      </w:r>
+      <w:r>
         <w:rPr>
           <w:rFonts w:ascii="Times New Roman" w:eastAsia="Times New Roman" w:hAnsi="Times New Roman" w:cs="Times New Roman"/>
           <w:b/>
           <w:bCs/>
           <w:kern w:val="0"/>
+          <w:vertAlign w:val="superscript"/>
           <w14:ligatures w14:val="none"/>
         </w:rPr>
-      </w:pPr>
+        <w:t>th</w:t>
+      </w:r>
       <w:r>
         <w:rPr>
           <w:rFonts w:ascii="Times New Roman" w:eastAsia="Times New Roman" w:hAnsi="Times New Roman" w:cs="Times New Roman"/>
@@ -3751,8 +3824,7 @@
           <w:kern w:val="0"/>
           <w14:ligatures w14:val="none"/>
         </w:rPr>
-        <w:lastRenderedPageBreak/>
-        <w:t>Current update (22</w:t>
+        <w:t xml:space="preserve"> Oct</w:t>
       </w:r>
       <w:r>
         <w:rPr>
@@ -3760,11 +3832,158 @@
           <w:b/>
           <w:bCs/>
           <w:kern w:val="0"/>
-          <w:vertAlign w:val="superscript"/>
           <w14:ligatures w14:val="none"/>
         </w:rPr>
-        <w:t>nd</w:t>
-      </w:r>
+        <w:t xml:space="preserve"> 2025):</w:t>
+      </w:r>
+    </w:p>
+    <w:p>
+      <w:pPr>
+        <w:pStyle w:val="ListParagraph"/>
+        <w:numPr>
+          <w:ilvl w:val="0"/>
+          <w:numId w:val="8"/>
+        </w:numPr>
+        <w:rPr>
+          <w:rFonts w:ascii="Times New Roman" w:hAnsi="Times New Roman" w:cs="Times New Roman"/>
+        </w:rPr>
+      </w:pPr>
+      <w:r>
+        <w:rPr>
+          <w:rFonts w:ascii="Times New Roman" w:hAnsi="Times New Roman" w:cs="Times New Roman"/>
+        </w:rPr>
+        <w:t xml:space="preserve">Phase 1: </w:t>
+      </w:r>
+    </w:p>
+    <w:p>
+      <w:pPr>
+        <w:pStyle w:val="ListParagraph"/>
+        <w:numPr>
+          <w:ilvl w:val="1"/>
+          <w:numId w:val="8"/>
+        </w:numPr>
+        <w:rPr>
+          <w:rFonts w:ascii="Times New Roman" w:hAnsi="Times New Roman" w:cs="Times New Roman"/>
+        </w:rPr>
+      </w:pPr>
+      <w:r>
+        <w:rPr>
+          <w:rFonts w:ascii="Times New Roman" w:hAnsi="Times New Roman" w:cs="Times New Roman"/>
+        </w:rPr>
+        <w:t xml:space="preserve">Resource Download </w:t>
+      </w:r>
+      <w:r>
+        <w:rPr>
+          <w:rFonts w:ascii="Apple Color Emoji" w:hAnsi="Apple Color Emoji" w:cs="Apple Color Emoji"/>
+          <w:color w:val="B42419"/>
+          <w:kern w:val="0"/>
+          <w:sz w:val="22"/>
+          <w:szCs w:val="22"/>
+        </w:rPr>
+        <w:t>✅</w:t>
+      </w:r>
+    </w:p>
+    <w:p>
+      <w:pPr>
+        <w:pStyle w:val="ListParagraph"/>
+        <w:numPr>
+          <w:ilvl w:val="1"/>
+          <w:numId w:val="8"/>
+        </w:numPr>
+        <w:rPr>
+          <w:rFonts w:ascii="Times New Roman" w:hAnsi="Times New Roman" w:cs="Times New Roman"/>
+        </w:rPr>
+      </w:pPr>
+      <w:r>
+        <w:rPr>
+          <w:rFonts w:ascii="Times New Roman" w:eastAsia="Times New Roman" w:hAnsi="Times New Roman" w:cs="Times New Roman"/>
+          <w:kern w:val="0"/>
+          <w14:ligatures w14:val="none"/>
+        </w:rPr>
+        <w:t xml:space="preserve">Ontology Parsing </w:t>
+      </w:r>
+      <w:r>
+        <w:rPr>
+          <w:rFonts w:ascii="Apple Color Emoji" w:hAnsi="Apple Color Emoji" w:cs="Apple Color Emoji"/>
+          <w:color w:val="B42419"/>
+          <w:kern w:val="0"/>
+          <w:sz w:val="22"/>
+          <w:szCs w:val="22"/>
+        </w:rPr>
+        <w:t>✅</w:t>
+      </w:r>
+    </w:p>
+    <w:p>
+      <w:pPr>
+        <w:pStyle w:val="ListParagraph"/>
+        <w:numPr>
+          <w:ilvl w:val="1"/>
+          <w:numId w:val="8"/>
+        </w:numPr>
+        <w:rPr>
+          <w:rFonts w:ascii="Times New Roman" w:hAnsi="Times New Roman" w:cs="Times New Roman"/>
+        </w:rPr>
+      </w:pPr>
+      <w:r>
+        <w:rPr>
+          <w:rFonts w:ascii="Times New Roman" w:hAnsi="Times New Roman" w:cs="Times New Roman"/>
+          <w:color w:val="000000" w:themeColor="text1"/>
+          <w:kern w:val="0"/>
+          <w:sz w:val="22"/>
+          <w:szCs w:val="22"/>
+        </w:rPr>
+        <w:t>Combined Database</w:t>
+      </w:r>
+      <w:r>
+        <w:rPr>
+          <w:rFonts w:ascii="Times New Roman" w:hAnsi="Times New Roman" w:cs="Times New Roman"/>
+          <w:color w:val="B42419"/>
+          <w:kern w:val="0"/>
+          <w:sz w:val="22"/>
+          <w:szCs w:val="22"/>
+        </w:rPr>
+        <w:t xml:space="preserve"> </w:t>
+      </w:r>
+      <w:r>
+        <w:rPr>
+          <w:rFonts w:ascii="Apple Color Emoji" w:hAnsi="Apple Color Emoji" w:cs="Apple Color Emoji"/>
+          <w:color w:val="B42419"/>
+          <w:kern w:val="0"/>
+          <w:sz w:val="22"/>
+          <w:szCs w:val="22"/>
+        </w:rPr>
+        <w:t>✅</w:t>
+      </w:r>
+    </w:p>
+    <w:p>
+      <w:pPr>
+        <w:pStyle w:val="ListParagraph"/>
+        <w:numPr>
+          <w:ilvl w:val="0"/>
+          <w:numId w:val="8"/>
+        </w:numPr>
+        <w:rPr>
+          <w:rFonts w:ascii="Times New Roman" w:hAnsi="Times New Roman" w:cs="Times New Roman"/>
+        </w:rPr>
+      </w:pPr>
+      <w:r>
+        <w:rPr>
+          <w:rFonts w:ascii="Times New Roman" w:hAnsi="Times New Roman" w:cs="Times New Roman"/>
+        </w:rPr>
+        <w:t xml:space="preserve">Phase 2: </w:t>
+      </w:r>
+    </w:p>
+    <w:p>
+      <w:pPr>
+        <w:pStyle w:val="ListParagraph"/>
+        <w:numPr>
+          <w:ilvl w:val="1"/>
+          <w:numId w:val="8"/>
+        </w:numPr>
+        <w:rPr>
+          <w:rFonts w:ascii="Times New Roman" w:hAnsi="Times New Roman" w:cs="Times New Roman"/>
+        </w:rPr>
+      </w:pPr>
       <w:r>
         <w:rPr>
           <w:rFonts w:ascii="Times New Roman" w:eastAsia="Times New Roman" w:hAnsi="Times New Roman" w:cs="Times New Roman"/>
@@ -3773,11 +3992,132 @@
           <w:kern w:val="0"/>
           <w14:ligatures w14:val="none"/>
         </w:rPr>
-        <w:t xml:space="preserve"> Aug 2025):</w:t>
+        <w:t xml:space="preserve">Compare and update the database -&gt; ongoing. </w:t>
       </w:r>
     </w:p>
     <w:p>
       <w:pPr>
+        <w:pStyle w:val="ListParagraph"/>
+        <w:ind w:left="1440"/>
+        <w:rPr>
+          <w:rFonts w:ascii="Times New Roman" w:hAnsi="Times New Roman" w:cs="Times New Roman"/>
+        </w:rPr>
+      </w:pPr>
+    </w:p>
+    <w:p>
+      <w:pPr>
+        <w:pStyle w:val="ListParagraph"/>
+        <w:numPr>
+          <w:ilvl w:val="0"/>
+          <w:numId w:val="8"/>
+        </w:numPr>
+        <w:rPr>
+          <w:rFonts w:ascii="Times New Roman" w:hAnsi="Times New Roman" w:cs="Times New Roman"/>
+        </w:rPr>
+      </w:pPr>
+      <w:r>
+        <w:rPr>
+          <w:rFonts w:ascii="Times New Roman" w:hAnsi="Times New Roman" w:cs="Times New Roman"/>
+        </w:rPr>
+        <w:t>Phase 3:</w:t>
+      </w:r>
+    </w:p>
+    <w:p>
+      <w:pPr>
+        <w:pStyle w:val="ListParagraph"/>
+        <w:numPr>
+          <w:ilvl w:val="1"/>
+          <w:numId w:val="8"/>
+        </w:numPr>
+        <w:rPr>
+          <w:rFonts w:ascii="Times New Roman" w:hAnsi="Times New Roman" w:cs="Times New Roman"/>
+        </w:rPr>
+      </w:pPr>
+      <w:r>
+        <w:rPr>
+          <w:rFonts w:ascii="Times New Roman" w:hAnsi="Times New Roman" w:cs="Times New Roman"/>
+        </w:rPr>
+        <w:t xml:space="preserve">Given DEG file from </w:t>
+      </w:r>
+      <w:proofErr w:type="spellStart"/>
+      <w:r>
+        <w:rPr>
+          <w:rFonts w:ascii="Times New Roman" w:hAnsi="Times New Roman" w:cs="Times New Roman"/>
+        </w:rPr>
+        <w:t>scRNAseq</w:t>
+      </w:r>
+      <w:proofErr w:type="spellEnd"/>
+      <w:r>
+        <w:rPr>
+          <w:rFonts w:ascii="Times New Roman" w:hAnsi="Times New Roman" w:cs="Times New Roman"/>
+        </w:rPr>
+        <w:t xml:space="preserve"> and Spatial (</w:t>
+      </w:r>
+      <w:proofErr w:type="spellStart"/>
+      <w:r>
+        <w:rPr>
+          <w:rFonts w:ascii="Times New Roman" w:hAnsi="Times New Roman" w:cs="Times New Roman"/>
+        </w:rPr>
+        <w:t>Visium</w:t>
+      </w:r>
+      <w:proofErr w:type="spellEnd"/>
+      <w:r>
+        <w:rPr>
+          <w:rFonts w:ascii="Times New Roman" w:hAnsi="Times New Roman" w:cs="Times New Roman"/>
+        </w:rPr>
+        <w:t xml:space="preserve"> HD and Xenium) </w:t>
+      </w:r>
+      <w:proofErr w:type="spellStart"/>
+      <w:r>
+        <w:rPr>
+          <w:rFonts w:ascii="Times New Roman" w:hAnsi="Times New Roman" w:cs="Times New Roman"/>
+        </w:rPr>
+        <w:t>spaceranger</w:t>
+      </w:r>
+      <w:proofErr w:type="spellEnd"/>
+      <w:r>
+        <w:rPr>
+          <w:rFonts w:ascii="Times New Roman" w:hAnsi="Times New Roman" w:cs="Times New Roman"/>
+        </w:rPr>
+        <w:t xml:space="preserve"> extract map of cluster and significant DEG per cluster given user defined thresholds </w:t>
+      </w:r>
+      <w:r>
+        <w:rPr>
+          <w:rFonts w:ascii="Apple Color Emoji" w:hAnsi="Apple Color Emoji" w:cs="Apple Color Emoji"/>
+        </w:rPr>
+        <w:t>✅</w:t>
+      </w:r>
+    </w:p>
+    <w:p>
+      <w:pPr>
+        <w:pStyle w:val="ListParagraph"/>
+        <w:numPr>
+          <w:ilvl w:val="1"/>
+          <w:numId w:val="8"/>
+        </w:numPr>
+        <w:rPr>
+          <w:rFonts w:ascii="Times New Roman" w:hAnsi="Times New Roman" w:cs="Times New Roman"/>
+        </w:rPr>
+      </w:pPr>
+      <w:r>
+        <w:rPr>
+          <w:rFonts w:ascii="Times New Roman" w:hAnsi="Times New Roman" w:cs="Times New Roman"/>
+        </w:rPr>
+        <w:t xml:space="preserve">Hypergeometric test </w:t>
+      </w:r>
+      <w:r>
+        <w:rPr>
+          <w:rFonts w:ascii="Apple Color Emoji" w:hAnsi="Apple Color Emoji" w:cs="Apple Color Emoji"/>
+          <w:color w:val="B42419"/>
+          <w:kern w:val="0"/>
+          <w:sz w:val="22"/>
+          <w:szCs w:val="22"/>
+        </w:rPr>
+        <w:t>✅</w:t>
+      </w:r>
+    </w:p>
+    <w:p>
+      <w:pPr>
         <w:spacing w:before="100" w:beforeAutospacing="1" w:after="100" w:afterAutospacing="1" w:line="240" w:lineRule="auto"/>
         <w:rPr>
           <w:rFonts w:ascii="Times New Roman" w:eastAsia="Times New Roman" w:hAnsi="Times New Roman" w:cs="Times New Roman"/>
@@ -3785,16 +4125,51 @@
           <w14:ligatures w14:val="none"/>
         </w:rPr>
       </w:pPr>
-      <w:proofErr w:type="spellStart"/>
-      <w:r>
+      <w:r>
+        <w:rPr>
+          <w:rFonts w:ascii="Times New Roman" w:hAnsi="Times New Roman" w:cs="Times New Roman"/>
+          <w:color w:val="000000" w:themeColor="text1"/>
+          <w:kern w:val="0"/>
+          <w:sz w:val="22"/>
+          <w:szCs w:val="22"/>
+        </w:rPr>
+        <w:lastRenderedPageBreak/>
+        <w:t>Return HTML intuitive and comprehensive report</w:t>
+      </w:r>
+      <w:r>
+        <w:rPr>
+          <w:rFonts w:ascii="Times New Roman" w:hAnsi="Times New Roman" w:cs="Times New Roman"/>
+        </w:rPr>
+        <w:t xml:space="preserve"> </w:t>
+      </w:r>
+      <w:r>
+        <w:rPr>
+          <w:rFonts w:ascii="Apple Color Emoji" w:hAnsi="Apple Color Emoji" w:cs="Apple Color Emoji"/>
+          <w:color w:val="B42419"/>
+          <w:kern w:val="0"/>
+          <w:sz w:val="22"/>
+          <w:szCs w:val="22"/>
+        </w:rPr>
+        <w:t>✅</w:t>
+      </w:r>
+    </w:p>
+    <w:p>
+      <w:pPr>
+        <w:spacing w:before="100" w:beforeAutospacing="1" w:after="100" w:afterAutospacing="1" w:line="240" w:lineRule="auto"/>
         <w:rPr>
           <w:rFonts w:ascii="Times New Roman" w:eastAsia="Times New Roman" w:hAnsi="Times New Roman" w:cs="Times New Roman"/>
           <w:kern w:val="0"/>
           <w14:ligatures w14:val="none"/>
         </w:rPr>
-        <w:t>Github</w:t>
-      </w:r>
-      <w:proofErr w:type="spellEnd"/>
+      </w:pPr>
+      <w:r>
+        <w:rPr>
+          <w:rFonts w:ascii="Times New Roman" w:eastAsia="Times New Roman" w:hAnsi="Times New Roman" w:cs="Times New Roman"/>
+          <w:kern w:val="0"/>
+          <w14:ligatures w14:val="none"/>
+        </w:rPr>
+        <w:t>GitHub</w:t>
+      </w:r>
       <w:r>
         <w:rPr>
           <w:rFonts w:ascii="Times New Roman" w:eastAsia="Times New Roman" w:hAnsi="Times New Roman" w:cs="Times New Roman"/>
@@ -3825,7 +4200,7 @@
         <w:adjustRightInd w:val="0"/>
         <w:spacing w:after="0" w:line="240" w:lineRule="auto"/>
         <w:rPr>
-          <w:rFonts w:ascii="Menlo" w:hAnsi="Menlo" w:cs="Menlo"/>
+          <w:rFonts w:ascii="Times New Roman" w:hAnsi="Times New Roman" w:cs="Times New Roman"/>
           <w:color w:val="000000"/>
           <w:kern w:val="0"/>
           <w:sz w:val="22"/>
@@ -3834,21 +4209,13 @@
       </w:pPr>
       <w:r>
         <w:rPr>
-          <w:rFonts w:ascii="Times New Roman" w:eastAsia="Times New Roman" w:hAnsi="Times New Roman" w:cs="Times New Roman"/>
-          <w:kern w:val="0"/>
-          <w14:ligatures w14:val="none"/>
-        </w:rPr>
-        <w:tab/>
-      </w:r>
-      <w:r>
-        <w:rPr>
-          <w:rFonts w:ascii="Menlo" w:hAnsi="Menlo" w:cs="Menlo"/>
+          <w:rFonts w:ascii="Times New Roman" w:hAnsi="Times New Roman" w:cs="Times New Roman"/>
           <w:color w:val="000000"/>
           <w:kern w:val="0"/>
           <w:sz w:val="22"/>
           <w:szCs w:val="22"/>
         </w:rPr>
-        <w:t>.</w:t>
+        <w:t>├── __init__.py</w:t>
       </w:r>
     </w:p>
     <w:p>
@@ -3872,7 +4239,7 @@
         <w:adjustRightInd w:val="0"/>
         <w:spacing w:after="0" w:line="240" w:lineRule="auto"/>
         <w:rPr>
-          <w:rFonts w:ascii="Menlo" w:hAnsi="Menlo" w:cs="Menlo"/>
+          <w:rFonts w:ascii="Times New Roman" w:hAnsi="Times New Roman" w:cs="Times New Roman"/>
           <w:color w:val="000000"/>
           <w:kern w:val="0"/>
           <w:sz w:val="22"/>
@@ -3881,13 +4248,13 @@
       </w:pPr>
       <w:r>
         <w:rPr>
-          <w:rFonts w:ascii="Menlo" w:hAnsi="Menlo" w:cs="Menlo"/>
+          <w:rFonts w:ascii="Times New Roman" w:hAnsi="Times New Roman" w:cs="Times New Roman"/>
           <w:color w:val="000000"/>
           <w:kern w:val="0"/>
           <w:sz w:val="22"/>
           <w:szCs w:val="22"/>
         </w:rPr>
-        <w:t>├── README.md</w:t>
+        <w:t>├── config</w:t>
       </w:r>
     </w:p>
     <w:p>
@@ -3911,7 +4278,7 @@
         <w:adjustRightInd w:val="0"/>
         <w:spacing w:after="0" w:line="240" w:lineRule="auto"/>
         <w:rPr>
-          <w:rFonts w:ascii="Menlo" w:hAnsi="Menlo" w:cs="Menlo"/>
+          <w:rFonts w:ascii="Times New Roman" w:hAnsi="Times New Roman" w:cs="Times New Roman"/>
           <w:color w:val="000000"/>
           <w:kern w:val="0"/>
           <w:sz w:val="22"/>
@@ -3920,13 +4287,23 @@
       </w:pPr>
       <w:r>
         <w:rPr>
-          <w:rFonts w:ascii="Menlo" w:hAnsi="Menlo" w:cs="Menlo"/>
+          <w:rFonts w:ascii="Times New Roman" w:hAnsi="Times New Roman" w:cs="Times New Roman"/>
           <w:color w:val="000000"/>
           <w:kern w:val="0"/>
           <w:sz w:val="22"/>
           <w:szCs w:val="22"/>
         </w:rPr>
-        <w:t>├── SapiensOntoCellMap_documentation.docx</w:t>
+        <w:t>│   ├── __init__.p</w:t>
+      </w:r>
+      <w:r>
+        <w:rPr>
+          <w:rFonts w:ascii="Times New Roman" w:hAnsi="Times New Roman" w:cs="Times New Roman"/>
+          <w:color w:val="000000"/>
+          <w:kern w:val="0"/>
+          <w:sz w:val="22"/>
+          <w:szCs w:val="22"/>
+        </w:rPr>
+        <w:t>y</w:t>
       </w:r>
     </w:p>
     <w:p>
@@ -3950,7 +4327,7 @@
         <w:adjustRightInd w:val="0"/>
         <w:spacing w:after="0" w:line="240" w:lineRule="auto"/>
         <w:rPr>
-          <w:rFonts w:ascii="Menlo" w:hAnsi="Menlo" w:cs="Menlo"/>
+          <w:rFonts w:ascii="Times New Roman" w:hAnsi="Times New Roman" w:cs="Times New Roman"/>
           <w:color w:val="000000"/>
           <w:kern w:val="0"/>
           <w:sz w:val="22"/>
@@ -3959,13 +4336,13 @@
       </w:pPr>
       <w:r>
         <w:rPr>
-          <w:rFonts w:ascii="Menlo" w:hAnsi="Menlo" w:cs="Menlo"/>
+          <w:rFonts w:ascii="Times New Roman" w:hAnsi="Times New Roman" w:cs="Times New Roman"/>
           <w:color w:val="000000"/>
           <w:kern w:val="0"/>
           <w:sz w:val="22"/>
           <w:szCs w:val="22"/>
         </w:rPr>
-        <w:t>├── __init__.py</w:t>
+        <w:t>│   └── config.py</w:t>
       </w:r>
     </w:p>
     <w:p>
@@ -3989,7 +4366,7 @@
         <w:adjustRightInd w:val="0"/>
         <w:spacing w:after="0" w:line="240" w:lineRule="auto"/>
         <w:rPr>
-          <w:rFonts w:ascii="Menlo" w:hAnsi="Menlo" w:cs="Menlo"/>
+          <w:rFonts w:ascii="Times New Roman" w:hAnsi="Times New Roman" w:cs="Times New Roman"/>
           <w:color w:val="000000"/>
           <w:kern w:val="0"/>
           <w:sz w:val="22"/>
@@ -3998,14 +4375,26 @@
       </w:pPr>
       <w:r>
         <w:rPr>
-          <w:rFonts w:ascii="Menlo" w:hAnsi="Menlo" w:cs="Menlo"/>
+          <w:rFonts w:ascii="Times New Roman" w:hAnsi="Times New Roman" w:cs="Times New Roman"/>
           <w:color w:val="000000"/>
           <w:kern w:val="0"/>
           <w:sz w:val="22"/>
           <w:szCs w:val="22"/>
         </w:rPr>
-        <w:t>├── config</w:t>
-      </w:r>
+        <w:t xml:space="preserve">├── </w:t>
+      </w:r>
+      <w:proofErr w:type="spellStart"/>
+      <w:r>
+        <w:rPr>
+          <w:rFonts w:ascii="Times New Roman" w:hAnsi="Times New Roman" w:cs="Times New Roman"/>
+          <w:color w:val="000000"/>
+          <w:kern w:val="0"/>
+          <w:sz w:val="22"/>
+          <w:szCs w:val="22"/>
+        </w:rPr>
+        <w:t>src</w:t>
+      </w:r>
+      <w:proofErr w:type="spellEnd"/>
     </w:p>
     <w:p>
       <w:pPr>
@@ -4028,7 +4417,7 @@
         <w:adjustRightInd w:val="0"/>
         <w:spacing w:after="0" w:line="240" w:lineRule="auto"/>
         <w:rPr>
-          <w:rFonts w:ascii="Menlo" w:hAnsi="Menlo" w:cs="Menlo"/>
+          <w:rFonts w:ascii="Times New Roman" w:hAnsi="Times New Roman" w:cs="Times New Roman"/>
           <w:color w:val="000000"/>
           <w:kern w:val="0"/>
           <w:sz w:val="22"/>
@@ -4037,7 +4426,7 @@
       </w:pPr>
       <w:r>
         <w:rPr>
-          <w:rFonts w:ascii="Menlo" w:hAnsi="Menlo" w:cs="Menlo"/>
+          <w:rFonts w:ascii="Times New Roman" w:hAnsi="Times New Roman" w:cs="Times New Roman"/>
           <w:color w:val="000000"/>
           <w:kern w:val="0"/>
           <w:sz w:val="22"/>
@@ -4067,7 +4456,7 @@
         <w:adjustRightInd w:val="0"/>
         <w:spacing w:after="0" w:line="240" w:lineRule="auto"/>
         <w:rPr>
-          <w:rFonts w:ascii="Menlo" w:hAnsi="Menlo" w:cs="Menlo"/>
+          <w:rFonts w:ascii="Times New Roman" w:hAnsi="Times New Roman" w:cs="Times New Roman"/>
           <w:color w:val="000000"/>
           <w:kern w:val="0"/>
           <w:sz w:val="22"/>
@@ -4076,14 +4465,26 @@
       </w:pPr>
       <w:r>
         <w:rPr>
-          <w:rFonts w:ascii="Menlo" w:hAnsi="Menlo" w:cs="Menlo"/>
+          <w:rFonts w:ascii="Times New Roman" w:hAnsi="Times New Roman" w:cs="Times New Roman"/>
           <w:color w:val="000000"/>
           <w:kern w:val="0"/>
           <w:sz w:val="22"/>
           <w:szCs w:val="22"/>
         </w:rPr>
-        <w:t>│   └── config.py</w:t>
-      </w:r>
+        <w:t xml:space="preserve">│   ├── </w:t>
+      </w:r>
+      <w:proofErr w:type="spellStart"/>
+      <w:r>
+        <w:rPr>
+          <w:rFonts w:ascii="Times New Roman" w:hAnsi="Times New Roman" w:cs="Times New Roman"/>
+          <w:color w:val="000000"/>
+          <w:kern w:val="0"/>
+          <w:sz w:val="22"/>
+          <w:szCs w:val="22"/>
+        </w:rPr>
+        <w:t>cluster_annotation</w:t>
+      </w:r>
+      <w:proofErr w:type="spellEnd"/>
     </w:p>
     <w:p>
       <w:pPr>
@@ -4106,7 +4507,7 @@
         <w:adjustRightInd w:val="0"/>
         <w:spacing w:after="0" w:line="240" w:lineRule="auto"/>
         <w:rPr>
-          <w:rFonts w:ascii="Menlo" w:hAnsi="Menlo" w:cs="Menlo"/>
+          <w:rFonts w:ascii="Times New Roman" w:hAnsi="Times New Roman" w:cs="Times New Roman"/>
           <w:color w:val="000000"/>
           <w:kern w:val="0"/>
           <w:sz w:val="22"/>
@@ -4115,13 +4516,13 @@
       </w:pPr>
       <w:r>
         <w:rPr>
-          <w:rFonts w:ascii="Menlo" w:hAnsi="Menlo" w:cs="Menlo"/>
+          <w:rFonts w:ascii="Times New Roman" w:hAnsi="Times New Roman" w:cs="Times New Roman"/>
           <w:color w:val="000000"/>
           <w:kern w:val="0"/>
           <w:sz w:val="22"/>
           <w:szCs w:val="22"/>
         </w:rPr>
-        <w:t>├── data</w:t>
+        <w:t>│   │   ├── get_cluster_annotation.py</w:t>
       </w:r>
     </w:p>
     <w:p>
@@ -4145,7 +4546,7 @@
         <w:adjustRightInd w:val="0"/>
         <w:spacing w:after="0" w:line="240" w:lineRule="auto"/>
         <w:rPr>
-          <w:rFonts w:ascii="Menlo" w:hAnsi="Menlo" w:cs="Menlo"/>
+          <w:rFonts w:ascii="Times New Roman" w:hAnsi="Times New Roman" w:cs="Times New Roman"/>
           <w:color w:val="000000"/>
           <w:kern w:val="0"/>
           <w:sz w:val="22"/>
@@ -4154,13 +4555,13 @@
       </w:pPr>
       <w:r>
         <w:rPr>
-          <w:rFonts w:ascii="Menlo" w:hAnsi="Menlo" w:cs="Menlo"/>
+          <w:rFonts w:ascii="Times New Roman" w:hAnsi="Times New Roman" w:cs="Times New Roman"/>
           <w:color w:val="000000"/>
           <w:kern w:val="0"/>
           <w:sz w:val="22"/>
           <w:szCs w:val="22"/>
         </w:rPr>
-        <w:t>│   ├── processed</w:t>
+        <w:t>│   │   ├── get_html_report.py</w:t>
       </w:r>
     </w:p>
     <w:p>
@@ -4184,7 +4585,7 @@
         <w:adjustRightInd w:val="0"/>
         <w:spacing w:after="0" w:line="240" w:lineRule="auto"/>
         <w:rPr>
-          <w:rFonts w:ascii="Menlo" w:hAnsi="Menlo" w:cs="Menlo"/>
+          <w:rFonts w:ascii="Times New Roman" w:hAnsi="Times New Roman" w:cs="Times New Roman"/>
           <w:color w:val="000000"/>
           <w:kern w:val="0"/>
           <w:sz w:val="22"/>
@@ -4193,13 +4594,13 @@
       </w:pPr>
       <w:r>
         <w:rPr>
-          <w:rFonts w:ascii="Menlo" w:hAnsi="Menlo" w:cs="Menlo"/>
+          <w:rFonts w:ascii="Times New Roman" w:hAnsi="Times New Roman" w:cs="Times New Roman"/>
           <w:color w:val="000000"/>
           <w:kern w:val="0"/>
           <w:sz w:val="22"/>
           <w:szCs w:val="22"/>
         </w:rPr>
-        <w:t>│   └── raw</w:t>
+        <w:t>│   │   └── get_marker_enrichment_test.py</w:t>
       </w:r>
     </w:p>
     <w:p>
@@ -4223,7 +4624,7 @@
         <w:adjustRightInd w:val="0"/>
         <w:spacing w:after="0" w:line="240" w:lineRule="auto"/>
         <w:rPr>
-          <w:rFonts w:ascii="Menlo" w:hAnsi="Menlo" w:cs="Menlo"/>
+          <w:rFonts w:ascii="Times New Roman" w:hAnsi="Times New Roman" w:cs="Times New Roman"/>
           <w:color w:val="000000"/>
           <w:kern w:val="0"/>
           <w:sz w:val="22"/>
@@ -4232,14 +4633,26 @@
       </w:pPr>
       <w:r>
         <w:rPr>
-          <w:rFonts w:ascii="Menlo" w:hAnsi="Menlo" w:cs="Menlo"/>
+          <w:rFonts w:ascii="Times New Roman" w:hAnsi="Times New Roman" w:cs="Times New Roman"/>
           <w:color w:val="000000"/>
           <w:kern w:val="0"/>
           <w:sz w:val="22"/>
           <w:szCs w:val="22"/>
         </w:rPr>
-        <w:t>│       ├── Cell_marker_Human.xlsx</w:t>
-      </w:r>
+        <w:t xml:space="preserve">│   ├── </w:t>
+      </w:r>
+      <w:proofErr w:type="spellStart"/>
+      <w:r>
+        <w:rPr>
+          <w:rFonts w:ascii="Times New Roman" w:hAnsi="Times New Roman" w:cs="Times New Roman"/>
+          <w:color w:val="000000"/>
+          <w:kern w:val="0"/>
+          <w:sz w:val="22"/>
+          <w:szCs w:val="22"/>
+        </w:rPr>
+        <w:t>db_manager</w:t>
+      </w:r>
+      <w:proofErr w:type="spellEnd"/>
     </w:p>
     <w:p>
       <w:pPr>
@@ -4262,7 +4675,7 @@
         <w:adjustRightInd w:val="0"/>
         <w:spacing w:after="0" w:line="240" w:lineRule="auto"/>
         <w:rPr>
-          <w:rFonts w:ascii="Menlo" w:hAnsi="Menlo" w:cs="Menlo"/>
+          <w:rFonts w:ascii="Times New Roman" w:hAnsi="Times New Roman" w:cs="Times New Roman"/>
           <w:color w:val="000000"/>
           <w:kern w:val="0"/>
           <w:sz w:val="22"/>
@@ -4271,26 +4684,14 @@
       </w:pPr>
       <w:r>
         <w:rPr>
-          <w:rFonts w:ascii="Menlo" w:hAnsi="Menlo" w:cs="Menlo"/>
+          <w:rFonts w:ascii="Times New Roman" w:hAnsi="Times New Roman" w:cs="Times New Roman"/>
           <w:color w:val="000000"/>
           <w:kern w:val="0"/>
           <w:sz w:val="22"/>
           <w:szCs w:val="22"/>
         </w:rPr>
-        <w:t>│       ├── human-</w:t>
-      </w:r>
-      <w:proofErr w:type="spellStart"/>
-      <w:r>
-        <w:rPr>
-          <w:rFonts w:ascii="Menlo" w:hAnsi="Menlo" w:cs="Menlo"/>
-          <w:color w:val="000000"/>
-          <w:kern w:val="0"/>
-          <w:sz w:val="22"/>
-          <w:szCs w:val="22"/>
-        </w:rPr>
-        <w:t>view.obo</w:t>
-      </w:r>
-      <w:proofErr w:type="spellEnd"/>
+        <w:t>│   │   ├── database_creator.py</w:t>
+      </w:r>
     </w:p>
     <w:p>
       <w:pPr>
@@ -4313,7 +4714,7 @@
         <w:adjustRightInd w:val="0"/>
         <w:spacing w:after="0" w:line="240" w:lineRule="auto"/>
         <w:rPr>
-          <w:rFonts w:ascii="Menlo" w:hAnsi="Menlo" w:cs="Menlo"/>
+          <w:rFonts w:ascii="Times New Roman" w:hAnsi="Times New Roman" w:cs="Times New Roman"/>
           <w:color w:val="000000"/>
           <w:kern w:val="0"/>
           <w:sz w:val="22"/>
@@ -4322,26 +4723,14 @@
       </w:pPr>
       <w:r>
         <w:rPr>
-          <w:rFonts w:ascii="Menlo" w:hAnsi="Menlo" w:cs="Menlo"/>
+          <w:rFonts w:ascii="Times New Roman" w:hAnsi="Times New Roman" w:cs="Times New Roman"/>
           <w:color w:val="000000"/>
           <w:kern w:val="0"/>
           <w:sz w:val="22"/>
           <w:szCs w:val="22"/>
         </w:rPr>
-        <w:t>│       └── human-</w:t>
-      </w:r>
-      <w:proofErr w:type="spellStart"/>
-      <w:r>
-        <w:rPr>
-          <w:rFonts w:ascii="Menlo" w:hAnsi="Menlo" w:cs="Menlo"/>
-          <w:color w:val="000000"/>
-          <w:kern w:val="0"/>
-          <w:sz w:val="22"/>
-          <w:szCs w:val="22"/>
-        </w:rPr>
-        <w:t>view.tsv</w:t>
-      </w:r>
-      <w:proofErr w:type="spellEnd"/>
+        <w:t>│   │   ├── db_manager.py</w:t>
+      </w:r>
     </w:p>
     <w:p>
       <w:pPr>
@@ -4364,7 +4753,7 @@
         <w:adjustRightInd w:val="0"/>
         <w:spacing w:after="0" w:line="240" w:lineRule="auto"/>
         <w:rPr>
-          <w:rFonts w:ascii="Menlo" w:hAnsi="Menlo" w:cs="Menlo"/>
+          <w:rFonts w:ascii="Times New Roman" w:hAnsi="Times New Roman" w:cs="Times New Roman"/>
           <w:color w:val="000000"/>
           <w:kern w:val="0"/>
           <w:sz w:val="22"/>
@@ -4373,26 +4762,14 @@
       </w:pPr>
       <w:r>
         <w:rPr>
-          <w:rFonts w:ascii="Menlo" w:hAnsi="Menlo" w:cs="Menlo"/>
+          <w:rFonts w:ascii="Times New Roman" w:hAnsi="Times New Roman" w:cs="Times New Roman"/>
           <w:color w:val="000000"/>
           <w:kern w:val="0"/>
           <w:sz w:val="22"/>
           <w:szCs w:val="22"/>
         </w:rPr>
-        <w:t xml:space="preserve">├── </w:t>
-      </w:r>
-      <w:proofErr w:type="spellStart"/>
-      <w:r>
-        <w:rPr>
-          <w:rFonts w:ascii="Menlo" w:hAnsi="Menlo" w:cs="Menlo"/>
-          <w:color w:val="000000"/>
-          <w:kern w:val="0"/>
-          <w:sz w:val="22"/>
-          <w:szCs w:val="22"/>
-        </w:rPr>
-        <w:t>src</w:t>
-      </w:r>
-      <w:proofErr w:type="spellEnd"/>
+        <w:t>│   │   └── db_schema.py</w:t>
+      </w:r>
     </w:p>
     <w:p>
       <w:pPr>
@@ -4415,7 +4792,7 @@
         <w:adjustRightInd w:val="0"/>
         <w:spacing w:after="0" w:line="240" w:lineRule="auto"/>
         <w:rPr>
-          <w:rFonts w:ascii="Menlo" w:hAnsi="Menlo" w:cs="Menlo"/>
+          <w:rFonts w:ascii="Times New Roman" w:hAnsi="Times New Roman" w:cs="Times New Roman"/>
           <w:color w:val="000000"/>
           <w:kern w:val="0"/>
           <w:sz w:val="22"/>
@@ -4424,13 +4801,13 @@
       </w:pPr>
       <w:r>
         <w:rPr>
-          <w:rFonts w:ascii="Menlo" w:hAnsi="Menlo" w:cs="Menlo"/>
+          <w:rFonts w:ascii="Times New Roman" w:hAnsi="Times New Roman" w:cs="Times New Roman"/>
           <w:color w:val="000000"/>
           <w:kern w:val="0"/>
           <w:sz w:val="22"/>
           <w:szCs w:val="22"/>
         </w:rPr>
-        <w:t>│   ├── __init__.py</w:t>
+        <w:t>│   ├── download</w:t>
       </w:r>
     </w:p>
     <w:p>
@@ -4454,7 +4831,7 @@
         <w:adjustRightInd w:val="0"/>
         <w:spacing w:after="0" w:line="240" w:lineRule="auto"/>
         <w:rPr>
-          <w:rFonts w:ascii="Menlo" w:hAnsi="Menlo" w:cs="Menlo"/>
+          <w:rFonts w:ascii="Times New Roman" w:hAnsi="Times New Roman" w:cs="Times New Roman"/>
           <w:color w:val="000000"/>
           <w:kern w:val="0"/>
           <w:sz w:val="22"/>
@@ -4463,26 +4840,14 @@
       </w:pPr>
       <w:r>
         <w:rPr>
-          <w:rFonts w:ascii="Menlo" w:hAnsi="Menlo" w:cs="Menlo"/>
+          <w:rFonts w:ascii="Times New Roman" w:hAnsi="Times New Roman" w:cs="Times New Roman"/>
           <w:color w:val="000000"/>
           <w:kern w:val="0"/>
           <w:sz w:val="22"/>
           <w:szCs w:val="22"/>
         </w:rPr>
-        <w:t xml:space="preserve">│   ├── </w:t>
-      </w:r>
-      <w:proofErr w:type="spellStart"/>
-      <w:r>
-        <w:rPr>
-          <w:rFonts w:ascii="Menlo" w:hAnsi="Menlo" w:cs="Menlo"/>
-          <w:color w:val="000000"/>
-          <w:kern w:val="0"/>
-          <w:sz w:val="22"/>
-          <w:szCs w:val="22"/>
-        </w:rPr>
-        <w:t>db_manager</w:t>
-      </w:r>
-      <w:proofErr w:type="spellEnd"/>
+        <w:t>│   │   └── bio_database_downloader.py</w:t>
+      </w:r>
     </w:p>
     <w:p>
       <w:pPr>
@@ -4505,7 +4870,7 @@
         <w:adjustRightInd w:val="0"/>
         <w:spacing w:after="0" w:line="240" w:lineRule="auto"/>
         <w:rPr>
-          <w:rFonts w:ascii="Menlo" w:hAnsi="Menlo" w:cs="Menlo"/>
+          <w:rFonts w:ascii="Times New Roman" w:hAnsi="Times New Roman" w:cs="Times New Roman"/>
           <w:color w:val="000000"/>
           <w:kern w:val="0"/>
           <w:sz w:val="22"/>
@@ -4514,13 +4879,13 @@
       </w:pPr>
       <w:r>
         <w:rPr>
-          <w:rFonts w:ascii="Menlo" w:hAnsi="Menlo" w:cs="Menlo"/>
+          <w:rFonts w:ascii="Times New Roman" w:hAnsi="Times New Roman" w:cs="Times New Roman"/>
           <w:color w:val="000000"/>
           <w:kern w:val="0"/>
           <w:sz w:val="22"/>
           <w:szCs w:val="22"/>
         </w:rPr>
-        <w:t>│   │   ├── db_manager.py</w:t>
+        <w:t>│   ├── parser</w:t>
       </w:r>
     </w:p>
     <w:p>
@@ -4544,7 +4909,7 @@
         <w:adjustRightInd w:val="0"/>
         <w:spacing w:after="0" w:line="240" w:lineRule="auto"/>
         <w:rPr>
-          <w:rFonts w:ascii="Menlo" w:hAnsi="Menlo" w:cs="Menlo"/>
+          <w:rFonts w:ascii="Times New Roman" w:hAnsi="Times New Roman" w:cs="Times New Roman"/>
           <w:color w:val="000000"/>
           <w:kern w:val="0"/>
           <w:sz w:val="22"/>
@@ -4553,13 +4918,13 @@
       </w:pPr>
       <w:r>
         <w:rPr>
-          <w:rFonts w:ascii="Menlo" w:hAnsi="Menlo" w:cs="Menlo"/>
+          <w:rFonts w:ascii="Times New Roman" w:hAnsi="Times New Roman" w:cs="Times New Roman"/>
           <w:color w:val="000000"/>
           <w:kern w:val="0"/>
           <w:sz w:val="22"/>
           <w:szCs w:val="22"/>
         </w:rPr>
-        <w:t>│   │   └── db_schema.py</w:t>
+        <w:t>│   │   ├── cell_ontology_parser.py</w:t>
       </w:r>
     </w:p>
     <w:p>
@@ -4583,7 +4948,7 @@
         <w:adjustRightInd w:val="0"/>
         <w:spacing w:after="0" w:line="240" w:lineRule="auto"/>
         <w:rPr>
-          <w:rFonts w:ascii="Menlo" w:hAnsi="Menlo" w:cs="Menlo"/>
+          <w:rFonts w:ascii="Times New Roman" w:hAnsi="Times New Roman" w:cs="Times New Roman"/>
           <w:color w:val="000000"/>
           <w:kern w:val="0"/>
           <w:sz w:val="22"/>
@@ -4592,13 +4957,13 @@
       </w:pPr>
       <w:r>
         <w:rPr>
-          <w:rFonts w:ascii="Menlo" w:hAnsi="Menlo" w:cs="Menlo"/>
+          <w:rFonts w:ascii="Times New Roman" w:hAnsi="Times New Roman" w:cs="Times New Roman"/>
           <w:color w:val="000000"/>
           <w:kern w:val="0"/>
           <w:sz w:val="22"/>
           <w:szCs w:val="22"/>
         </w:rPr>
-        <w:t>│   ├── download</w:t>
+        <w:t>│   │   ├── cellmarker_parser.py</w:t>
       </w:r>
     </w:p>
     <w:p>
@@ -4622,7 +4987,7 @@
         <w:adjustRightInd w:val="0"/>
         <w:spacing w:after="0" w:line="240" w:lineRule="auto"/>
         <w:rPr>
-          <w:rFonts w:ascii="Menlo" w:hAnsi="Menlo" w:cs="Menlo"/>
+          <w:rFonts w:ascii="Times New Roman" w:hAnsi="Times New Roman" w:cs="Times New Roman"/>
           <w:color w:val="000000"/>
           <w:kern w:val="0"/>
           <w:sz w:val="22"/>
@@ -4631,13 +4996,13 @@
       </w:pPr>
       <w:r>
         <w:rPr>
-          <w:rFonts w:ascii="Menlo" w:hAnsi="Menlo" w:cs="Menlo"/>
+          <w:rFonts w:ascii="Times New Roman" w:hAnsi="Times New Roman" w:cs="Times New Roman"/>
           <w:color w:val="000000"/>
           <w:kern w:val="0"/>
           <w:sz w:val="22"/>
           <w:szCs w:val="22"/>
         </w:rPr>
-        <w:t>│   │   └── bio_database_downloader.py</w:t>
+        <w:t>│   │   ├── cellmarkerdb_parser.py</w:t>
       </w:r>
     </w:p>
     <w:p>
@@ -4661,7 +5026,7 @@
         <w:adjustRightInd w:val="0"/>
         <w:spacing w:after="0" w:line="240" w:lineRule="auto"/>
         <w:rPr>
-          <w:rFonts w:ascii="Menlo" w:hAnsi="Menlo" w:cs="Menlo"/>
+          <w:rFonts w:ascii="Times New Roman" w:hAnsi="Times New Roman" w:cs="Times New Roman"/>
           <w:color w:val="000000"/>
           <w:kern w:val="0"/>
           <w:sz w:val="22"/>
@@ -4670,13 +5035,13 @@
       </w:pPr>
       <w:r>
         <w:rPr>
-          <w:rFonts w:ascii="Menlo" w:hAnsi="Menlo" w:cs="Menlo"/>
+          <w:rFonts w:ascii="Times New Roman" w:hAnsi="Times New Roman" w:cs="Times New Roman"/>
           <w:color w:val="000000"/>
           <w:kern w:val="0"/>
           <w:sz w:val="22"/>
           <w:szCs w:val="22"/>
         </w:rPr>
-        <w:t>│   ├── parser</w:t>
+        <w:t>│   │   ├── cellxgene_parser.py</w:t>
       </w:r>
     </w:p>
     <w:p>
@@ -4700,7 +5065,7 @@
         <w:adjustRightInd w:val="0"/>
         <w:spacing w:after="0" w:line="240" w:lineRule="auto"/>
         <w:rPr>
-          <w:rFonts w:ascii="Menlo" w:hAnsi="Menlo" w:cs="Menlo"/>
+          <w:rFonts w:ascii="Times New Roman" w:hAnsi="Times New Roman" w:cs="Times New Roman"/>
           <w:color w:val="000000"/>
           <w:kern w:val="0"/>
           <w:sz w:val="22"/>
@@ -4709,13 +5074,13 @@
       </w:pPr>
       <w:r>
         <w:rPr>
-          <w:rFonts w:ascii="Menlo" w:hAnsi="Menlo" w:cs="Menlo"/>
+          <w:rFonts w:ascii="Times New Roman" w:hAnsi="Times New Roman" w:cs="Times New Roman"/>
           <w:color w:val="000000"/>
           <w:kern w:val="0"/>
           <w:sz w:val="22"/>
           <w:szCs w:val="22"/>
         </w:rPr>
-        <w:t>│   │   ├── cell_ontology_parser.py</w:t>
+        <w:t>│   │   ├── customdb_parser.py</w:t>
       </w:r>
     </w:p>
     <w:p>
@@ -4739,7 +5104,7 @@
         <w:adjustRightInd w:val="0"/>
         <w:spacing w:after="0" w:line="240" w:lineRule="auto"/>
         <w:rPr>
-          <w:rFonts w:ascii="Menlo" w:hAnsi="Menlo" w:cs="Menlo"/>
+          <w:rFonts w:ascii="Times New Roman" w:hAnsi="Times New Roman" w:cs="Times New Roman"/>
           <w:color w:val="000000"/>
           <w:kern w:val="0"/>
           <w:sz w:val="22"/>
@@ -4748,13 +5113,13 @@
       </w:pPr>
       <w:r>
         <w:rPr>
-          <w:rFonts w:ascii="Menlo" w:hAnsi="Menlo" w:cs="Menlo"/>
+          <w:rFonts w:ascii="Times New Roman" w:hAnsi="Times New Roman" w:cs="Times New Roman"/>
           <w:color w:val="000000"/>
           <w:kern w:val="0"/>
           <w:sz w:val="22"/>
           <w:szCs w:val="22"/>
         </w:rPr>
-        <w:t>│   │   ├── cellmarker_parser.py</w:t>
+        <w:t>│   │   ├── database_file_parser.py</w:t>
       </w:r>
     </w:p>
     <w:p>
@@ -4778,7 +5143,7 @@
         <w:adjustRightInd w:val="0"/>
         <w:spacing w:after="0" w:line="240" w:lineRule="auto"/>
         <w:rPr>
-          <w:rFonts w:ascii="Menlo" w:hAnsi="Menlo" w:cs="Menlo"/>
+          <w:rFonts w:ascii="Times New Roman" w:hAnsi="Times New Roman" w:cs="Times New Roman"/>
           <w:color w:val="000000"/>
           <w:kern w:val="0"/>
           <w:sz w:val="22"/>
@@ -4787,13 +5152,13 @@
       </w:pPr>
       <w:r>
         <w:rPr>
-          <w:rFonts w:ascii="Menlo" w:hAnsi="Menlo" w:cs="Menlo"/>
+          <w:rFonts w:ascii="Times New Roman" w:hAnsi="Times New Roman" w:cs="Times New Roman"/>
           <w:color w:val="000000"/>
           <w:kern w:val="0"/>
           <w:sz w:val="22"/>
           <w:szCs w:val="22"/>
         </w:rPr>
-        <w:t>│   │   └── uberon_parser.py</w:t>
+        <w:t>│   │   ├── hubmap_parser.py</w:t>
       </w:r>
     </w:p>
     <w:p>
@@ -4817,7 +5182,7 @@
         <w:adjustRightInd w:val="0"/>
         <w:spacing w:after="0" w:line="240" w:lineRule="auto"/>
         <w:rPr>
-          <w:rFonts w:ascii="Menlo" w:hAnsi="Menlo" w:cs="Menlo"/>
+          <w:rFonts w:ascii="Times New Roman" w:hAnsi="Times New Roman" w:cs="Times New Roman"/>
           <w:color w:val="000000"/>
           <w:kern w:val="0"/>
           <w:sz w:val="22"/>
@@ -4826,13 +5191,13 @@
       </w:pPr>
       <w:r>
         <w:rPr>
-          <w:rFonts w:ascii="Menlo" w:hAnsi="Menlo" w:cs="Menlo"/>
+          <w:rFonts w:ascii="Times New Roman" w:hAnsi="Times New Roman" w:cs="Times New Roman"/>
           <w:color w:val="000000"/>
           <w:kern w:val="0"/>
           <w:sz w:val="22"/>
           <w:szCs w:val="22"/>
         </w:rPr>
-        <w:t>│   └── visualization</w:t>
+        <w:t>│   │   ├── ontology_utils.py</w:t>
       </w:r>
     </w:p>
     <w:p>
@@ -4856,7 +5221,7 @@
         <w:adjustRightInd w:val="0"/>
         <w:spacing w:after="0" w:line="240" w:lineRule="auto"/>
         <w:rPr>
-          <w:rFonts w:ascii="Menlo" w:hAnsi="Menlo" w:cs="Menlo"/>
+          <w:rFonts w:ascii="Times New Roman" w:hAnsi="Times New Roman" w:cs="Times New Roman"/>
           <w:color w:val="000000"/>
           <w:kern w:val="0"/>
           <w:sz w:val="22"/>
@@ -4865,13 +5230,13 @@
       </w:pPr>
       <w:r>
         <w:rPr>
-          <w:rFonts w:ascii="Menlo" w:hAnsi="Menlo" w:cs="Menlo"/>
+          <w:rFonts w:ascii="Times New Roman" w:hAnsi="Times New Roman" w:cs="Times New Roman"/>
           <w:color w:val="000000"/>
           <w:kern w:val="0"/>
           <w:sz w:val="22"/>
           <w:szCs w:val="22"/>
         </w:rPr>
-        <w:t>│       └── app.py</w:t>
+        <w:t>│   │   ├── panglaodb_parser.py</w:t>
       </w:r>
     </w:p>
     <w:p>
@@ -4895,7 +5260,7 @@
         <w:adjustRightInd w:val="0"/>
         <w:spacing w:after="0" w:line="240" w:lineRule="auto"/>
         <w:rPr>
-          <w:rFonts w:ascii="Menlo" w:hAnsi="Menlo" w:cs="Menlo"/>
+          <w:rFonts w:ascii="Times New Roman" w:hAnsi="Times New Roman" w:cs="Times New Roman"/>
           <w:color w:val="000000"/>
           <w:kern w:val="0"/>
           <w:sz w:val="22"/>
@@ -4904,13 +5269,13 @@
       </w:pPr>
       <w:r>
         <w:rPr>
-          <w:rFonts w:ascii="Menlo" w:hAnsi="Menlo" w:cs="Menlo"/>
+          <w:rFonts w:ascii="Times New Roman" w:hAnsi="Times New Roman" w:cs="Times New Roman"/>
           <w:color w:val="000000"/>
           <w:kern w:val="0"/>
           <w:sz w:val="22"/>
           <w:szCs w:val="22"/>
         </w:rPr>
-        <w:t>└── test</w:t>
+        <w:t>│   │   └── uberon_parser.py</w:t>
       </w:r>
     </w:p>
     <w:p>
@@ -4934,7 +5299,7 @@
         <w:adjustRightInd w:val="0"/>
         <w:spacing w:after="0" w:line="240" w:lineRule="auto"/>
         <w:rPr>
-          <w:rFonts w:ascii="Menlo" w:hAnsi="Menlo" w:cs="Menlo"/>
+          <w:rFonts w:ascii="Times New Roman" w:hAnsi="Times New Roman" w:cs="Times New Roman"/>
           <w:color w:val="000000"/>
           <w:kern w:val="0"/>
           <w:sz w:val="22"/>
@@ -4943,13 +5308,13 @@
       </w:pPr>
       <w:r>
         <w:rPr>
-          <w:rFonts w:ascii="Menlo" w:hAnsi="Menlo" w:cs="Menlo"/>
+          <w:rFonts w:ascii="Times New Roman" w:hAnsi="Times New Roman" w:cs="Times New Roman"/>
           <w:color w:val="000000"/>
           <w:kern w:val="0"/>
           <w:sz w:val="22"/>
           <w:szCs w:val="22"/>
         </w:rPr>
-        <w:t xml:space="preserve">    └── test_download.py</w:t>
+        <w:t>│   └── visualization</w:t>
       </w:r>
     </w:p>
     <w:p>
@@ -4973,13 +5338,23 @@
         <w:adjustRightInd w:val="0"/>
         <w:spacing w:after="0" w:line="240" w:lineRule="auto"/>
         <w:rPr>
-          <w:rFonts w:ascii="Menlo" w:hAnsi="Menlo" w:cs="Menlo"/>
+          <w:rFonts w:ascii="Times New Roman" w:hAnsi="Times New Roman" w:cs="Times New Roman"/>
           <w:color w:val="000000"/>
           <w:kern w:val="0"/>
           <w:sz w:val="22"/>
           <w:szCs w:val="22"/>
         </w:rPr>
       </w:pPr>
+      <w:r>
+        <w:rPr>
+          <w:rFonts w:ascii="Times New Roman" w:hAnsi="Times New Roman" w:cs="Times New Roman"/>
+          <w:color w:val="000000"/>
+          <w:kern w:val="0"/>
+          <w:sz w:val="22"/>
+          <w:szCs w:val="22"/>
+        </w:rPr>
+        <w:t>│       └── app.py</w:t>
+      </w:r>
     </w:p>
     <w:p>
       <w:pPr>
@@ -5002,1464 +5377,118 @@
         <w:adjustRightInd w:val="0"/>
         <w:spacing w:after="0" w:line="240" w:lineRule="auto"/>
         <w:rPr>
-          <w:rFonts w:ascii="Menlo" w:hAnsi="Menlo" w:cs="Menlo"/>
+          <w:rFonts w:ascii="Times New Roman" w:hAnsi="Times New Roman" w:cs="Times New Roman"/>
           <w:color w:val="000000"/>
           <w:kern w:val="0"/>
           <w:sz w:val="22"/>
           <w:szCs w:val="22"/>
         </w:rPr>
       </w:pPr>
+      <w:r>
+        <w:rPr>
+          <w:rFonts w:ascii="Times New Roman" w:hAnsi="Times New Roman" w:cs="Times New Roman"/>
+          <w:color w:val="000000"/>
+          <w:kern w:val="0"/>
+          <w:sz w:val="22"/>
+          <w:szCs w:val="22"/>
+        </w:rPr>
+        <w:t>└── test</w:t>
+      </w:r>
     </w:p>
     <w:p>
       <w:pPr>
-        <w:pStyle w:val="ListParagraph"/>
-        <w:numPr>
-          <w:ilvl w:val="0"/>
-          <w:numId w:val="8"/>
-        </w:numPr>
-        <w:rPr>
-          <w:rFonts w:ascii="Times New Roman" w:hAnsi="Times New Roman" w:cs="Times New Roman"/>
-        </w:rPr>
-      </w:pPr>
-      <w:r>
-        <w:rPr>
-          <w:rFonts w:ascii="Times New Roman" w:hAnsi="Times New Roman" w:cs="Times New Roman"/>
-        </w:rPr>
-        <w:t xml:space="preserve">Phase 1: </w:t>
+        <w:tabs>
+          <w:tab w:val="left" w:pos="560"/>
+          <w:tab w:val="left" w:pos="1120"/>
+          <w:tab w:val="left" w:pos="1680"/>
+          <w:tab w:val="left" w:pos="2240"/>
+          <w:tab w:val="left" w:pos="2800"/>
+          <w:tab w:val="left" w:pos="3360"/>
+          <w:tab w:val="left" w:pos="3920"/>
+          <w:tab w:val="left" w:pos="4480"/>
+          <w:tab w:val="left" w:pos="5040"/>
+          <w:tab w:val="left" w:pos="5600"/>
+          <w:tab w:val="left" w:pos="6160"/>
+          <w:tab w:val="left" w:pos="6720"/>
+        </w:tabs>
+        <w:autoSpaceDE w:val="0"/>
+        <w:autoSpaceDN w:val="0"/>
+        <w:adjustRightInd w:val="0"/>
+        <w:spacing w:after="0" w:line="240" w:lineRule="auto"/>
+        <w:rPr>
+          <w:rFonts w:ascii="Times New Roman" w:hAnsi="Times New Roman" w:cs="Times New Roman"/>
+          <w:color w:val="000000"/>
+          <w:kern w:val="0"/>
+          <w:sz w:val="22"/>
+          <w:szCs w:val="22"/>
+        </w:rPr>
+      </w:pPr>
+      <w:r>
+        <w:rPr>
+          <w:rFonts w:ascii="Times New Roman" w:hAnsi="Times New Roman" w:cs="Times New Roman"/>
+          <w:color w:val="000000"/>
+          <w:kern w:val="0"/>
+          <w:sz w:val="22"/>
+          <w:szCs w:val="22"/>
+        </w:rPr>
+        <w:t xml:space="preserve">    ├── test_classes.py</w:t>
       </w:r>
     </w:p>
     <w:p>
       <w:pPr>
-        <w:pStyle w:val="ListParagraph"/>
-        <w:numPr>
-          <w:ilvl w:val="1"/>
-          <w:numId w:val="8"/>
-        </w:numPr>
-        <w:rPr>
-          <w:rFonts w:ascii="Times New Roman" w:hAnsi="Times New Roman" w:cs="Times New Roman"/>
-        </w:rPr>
-      </w:pPr>
-      <w:r>
-        <w:rPr>
-          <w:rFonts w:ascii="Times New Roman" w:hAnsi="Times New Roman" w:cs="Times New Roman"/>
-        </w:rPr>
-        <w:t>Resource Download</w:t>
-      </w:r>
-      <w:r>
-        <w:rPr>
-          <w:rFonts w:ascii="Times New Roman" w:hAnsi="Times New Roman" w:cs="Times New Roman"/>
-        </w:rPr>
-        <w:t xml:space="preserve"> </w:t>
-      </w:r>
-      <w:r>
-        <w:rPr>
-          <w:rFonts w:ascii="Apple Color Emoji" w:hAnsi="Apple Color Emoji" w:cs="Apple Color Emoji"/>
-          <w:color w:val="B42419"/>
+        <w:tabs>
+          <w:tab w:val="left" w:pos="560"/>
+          <w:tab w:val="left" w:pos="1120"/>
+          <w:tab w:val="left" w:pos="1680"/>
+          <w:tab w:val="left" w:pos="2240"/>
+          <w:tab w:val="left" w:pos="2800"/>
+          <w:tab w:val="left" w:pos="3360"/>
+          <w:tab w:val="left" w:pos="3920"/>
+          <w:tab w:val="left" w:pos="4480"/>
+          <w:tab w:val="left" w:pos="5040"/>
+          <w:tab w:val="left" w:pos="5600"/>
+          <w:tab w:val="left" w:pos="6160"/>
+          <w:tab w:val="left" w:pos="6720"/>
+        </w:tabs>
+        <w:autoSpaceDE w:val="0"/>
+        <w:autoSpaceDN w:val="0"/>
+        <w:adjustRightInd w:val="0"/>
+        <w:spacing w:after="0" w:line="240" w:lineRule="auto"/>
+        <w:rPr>
+          <w:rFonts w:ascii="Times New Roman" w:hAnsi="Times New Roman" w:cs="Times New Roman"/>
+          <w:color w:val="000000"/>
           <w:kern w:val="0"/>
           <w:sz w:val="22"/>
           <w:szCs w:val="22"/>
         </w:rPr>
-        <w:t>✅</w:t>
+      </w:pPr>
+      <w:r>
+        <w:rPr>
+          <w:rFonts w:ascii="Times New Roman" w:hAnsi="Times New Roman" w:cs="Times New Roman"/>
+          <w:color w:val="000000"/>
+          <w:kern w:val="0"/>
+          <w:sz w:val="22"/>
+          <w:szCs w:val="22"/>
+        </w:rPr>
+        <w:t xml:space="preserve">    └── test_download.py</w:t>
       </w:r>
     </w:p>
     <w:p>
       <w:pPr>
-        <w:pStyle w:val="ListParagraph"/>
-        <w:numPr>
-          <w:ilvl w:val="1"/>
-          <w:numId w:val="8"/>
-        </w:numPr>
-        <w:rPr>
-          <w:rFonts w:ascii="Times New Roman" w:hAnsi="Times New Roman" w:cs="Times New Roman"/>
-        </w:rPr>
-      </w:pPr>
-      <w:r>
-        <w:rPr>
-          <w:rFonts w:ascii="Times New Roman" w:eastAsia="Times New Roman" w:hAnsi="Times New Roman" w:cs="Times New Roman"/>
-          <w:kern w:val="0"/>
-          <w14:ligatures w14:val="none"/>
-        </w:rPr>
-        <w:t xml:space="preserve">Ontology Parsing and Graph Construction – On going </w:t>
-      </w:r>
-    </w:p>
-    <w:p>
-      <w:pPr>
-        <w:pStyle w:val="ListParagraph"/>
-        <w:numPr>
-          <w:ilvl w:val="2"/>
-          <w:numId w:val="8"/>
-        </w:numPr>
-        <w:rPr>
-          <w:rFonts w:ascii="Times New Roman" w:hAnsi="Times New Roman" w:cs="Times New Roman"/>
-        </w:rPr>
-      </w:pPr>
-      <w:r>
-        <w:rPr>
-          <w:rFonts w:ascii="Times New Roman" w:eastAsia="Times New Roman" w:hAnsi="Times New Roman" w:cs="Times New Roman"/>
-          <w:kern w:val="0"/>
-          <w14:ligatures w14:val="none"/>
-        </w:rPr>
-        <w:t xml:space="preserve">Challenge: It looks like a mesh </w:t>
-      </w:r>
-    </w:p>
-    <w:p>
-      <w:pPr>
-        <w:pStyle w:val="ListParagraph"/>
-        <w:numPr>
-          <w:ilvl w:val="2"/>
-          <w:numId w:val="8"/>
-        </w:numPr>
-        <w:rPr>
-          <w:rFonts w:ascii="Times New Roman" w:hAnsi="Times New Roman" w:cs="Times New Roman"/>
-        </w:rPr>
-      </w:pPr>
-      <w:r>
-        <w:rPr>
-          <w:rFonts w:ascii="Times New Roman" w:eastAsia="Times New Roman" w:hAnsi="Times New Roman" w:cs="Times New Roman"/>
-          <w:kern w:val="0"/>
-          <w14:ligatures w14:val="none"/>
-        </w:rPr>
-        <w:t xml:space="preserve">Potential solution: use </w:t>
-      </w:r>
-      <w:proofErr w:type="spellStart"/>
-      <w:r>
-        <w:rPr>
-          <w:rFonts w:ascii="Times New Roman" w:eastAsia="Times New Roman" w:hAnsi="Times New Roman" w:cs="Times New Roman"/>
-          <w:kern w:val="0"/>
-          <w14:ligatures w14:val="none"/>
-        </w:rPr>
-        <w:t>toposort</w:t>
-      </w:r>
-      <w:proofErr w:type="spellEnd"/>
-      <w:r>
-        <w:rPr>
-          <w:rFonts w:ascii="Times New Roman" w:eastAsia="Times New Roman" w:hAnsi="Times New Roman" w:cs="Times New Roman"/>
-          <w:kern w:val="0"/>
-          <w14:ligatures w14:val="none"/>
-        </w:rPr>
-        <w:t xml:space="preserve"> to linearize</w:t>
-      </w:r>
-      <w:r>
-        <w:rPr>
-          <w:rFonts w:ascii="Times New Roman" w:eastAsia="Times New Roman" w:hAnsi="Times New Roman" w:cs="Times New Roman"/>
-          <w:kern w:val="0"/>
-          <w14:ligatures w14:val="none"/>
-        </w:rPr>
-        <w:t xml:space="preserve"> and parse in such a way to have the connections between the UB terms associated with organs and tissues; and </w:t>
-      </w:r>
-      <w:proofErr w:type="gramStart"/>
-      <w:r>
-        <w:rPr>
-          <w:rFonts w:ascii="Times New Roman" w:eastAsia="Times New Roman" w:hAnsi="Times New Roman" w:cs="Times New Roman"/>
-          <w:kern w:val="0"/>
-          <w14:ligatures w14:val="none"/>
-        </w:rPr>
-        <w:t>also</w:t>
-      </w:r>
-      <w:proofErr w:type="gramEnd"/>
-      <w:r>
-        <w:rPr>
-          <w:rFonts w:ascii="Times New Roman" w:eastAsia="Times New Roman" w:hAnsi="Times New Roman" w:cs="Times New Roman"/>
-          <w:kern w:val="0"/>
-          <w14:ligatures w14:val="none"/>
-        </w:rPr>
-        <w:t xml:space="preserve"> CL</w:t>
-      </w:r>
-    </w:p>
-    <w:p>
-      <w:pPr>
-        <w:rPr>
-          <w:rFonts w:ascii="Times New Roman" w:hAnsi="Times New Roman" w:cs="Times New Roman"/>
-        </w:rPr>
-      </w:pPr>
-      <w:r>
-        <w:rPr>
-          <w:noProof/>
-        </w:rPr>
-        <w:lastRenderedPageBreak/>
-        <w:drawing>
-          <wp:inline distT="0" distB="0" distL="0" distR="0" wp14:anchorId="7691E278" wp14:editId="667A0CA6">
-            <wp:extent cx="4457700" cy="3682365"/>
-            <wp:effectExtent l="0" t="0" r="0" b="635"/>
-            <wp:docPr id="774131861" name="Picture 1" descr="A network of green dots and lines&#10;&#10;AI-generated content may be incorrect."/>
-            <wp:cNvGraphicFramePr>
-              <a:graphicFrameLocks xmlns:a="http://schemas.openxmlformats.org/drawingml/2006/main" noChangeAspect="1"/>
-            </wp:cNvGraphicFramePr>
-            <a:graphic xmlns:a="http://schemas.openxmlformats.org/drawingml/2006/main">
-              <a:graphicData uri="http://schemas.openxmlformats.org/drawingml/2006/picture">
-                <pic:pic xmlns:pic="http://schemas.openxmlformats.org/drawingml/2006/picture">
-                  <pic:nvPicPr>
-                    <pic:cNvPr id="774131861" name="Picture 1" descr="A network of green dots and lines&#10;&#10;AI-generated content may be incorrect."/>
-                    <pic:cNvPicPr/>
-                  </pic:nvPicPr>
-                  <pic:blipFill>
-                    <a:blip r:embed="rId5"/>
-                    <a:stretch>
-                      <a:fillRect/>
-                    </a:stretch>
-                  </pic:blipFill>
-                  <pic:spPr>
-                    <a:xfrm>
-                      <a:off x="0" y="0"/>
-                      <a:ext cx="4481958" cy="3702404"/>
-                    </a:xfrm>
-                    <a:prstGeom prst="rect">
-                      <a:avLst/>
-                    </a:prstGeom>
-                  </pic:spPr>
-                </pic:pic>
-              </a:graphicData>
-            </a:graphic>
-          </wp:inline>
-        </w:drawing>
-      </w:r>
-    </w:p>
-    <w:p>
-      <w:pPr>
-        <w:pStyle w:val="ListParagraph"/>
-        <w:numPr>
-          <w:ilvl w:val="0"/>
-          <w:numId w:val="8"/>
-        </w:numPr>
-        <w:rPr>
-          <w:rFonts w:ascii="Times New Roman" w:hAnsi="Times New Roman" w:cs="Times New Roman"/>
-        </w:rPr>
-      </w:pPr>
-      <w:r>
-        <w:rPr>
-          <w:rFonts w:ascii="Times New Roman" w:hAnsi="Times New Roman" w:cs="Times New Roman"/>
-        </w:rPr>
-        <w:t xml:space="preserve">Phase 2: </w:t>
-      </w:r>
-    </w:p>
-    <w:p>
-      <w:pPr>
-        <w:pStyle w:val="ListParagraph"/>
-        <w:numPr>
-          <w:ilvl w:val="1"/>
-          <w:numId w:val="8"/>
-        </w:numPr>
-        <w:rPr>
-          <w:rFonts w:ascii="Times New Roman" w:hAnsi="Times New Roman" w:cs="Times New Roman"/>
-        </w:rPr>
-      </w:pPr>
-      <w:r>
-        <w:rPr>
-          <w:rFonts w:ascii="Times New Roman" w:eastAsia="Times New Roman" w:hAnsi="Times New Roman" w:cs="Times New Roman"/>
-          <w:b/>
-          <w:bCs/>
-          <w:kern w:val="0"/>
-          <w14:ligatures w14:val="none"/>
-        </w:rPr>
-        <w:t>Atlas-Based Marker Discovery</w:t>
-      </w:r>
-      <w:r>
-        <w:rPr>
-          <w:rFonts w:ascii="Times New Roman" w:eastAsia="Times New Roman" w:hAnsi="Times New Roman" w:cs="Times New Roman"/>
-          <w:b/>
-          <w:bCs/>
-          <w:kern w:val="0"/>
-          <w14:ligatures w14:val="none"/>
-        </w:rPr>
-        <w:t xml:space="preserve"> -&gt; ongoing. </w:t>
-      </w:r>
-    </w:p>
-    <w:p>
-      <w:pPr>
-        <w:pStyle w:val="ListParagraph"/>
-        <w:ind w:left="1440"/>
-        <w:rPr>
-          <w:rFonts w:ascii="Times New Roman" w:eastAsia="Times New Roman" w:hAnsi="Times New Roman" w:cs="Times New Roman"/>
-          <w:kern w:val="0"/>
-          <w14:ligatures w14:val="none"/>
-        </w:rPr>
-      </w:pPr>
-      <w:r>
-        <w:rPr>
-          <w:rFonts w:ascii="Times New Roman" w:eastAsia="Times New Roman" w:hAnsi="Times New Roman" w:cs="Times New Roman"/>
-          <w:kern w:val="0"/>
-          <w14:ligatures w14:val="none"/>
-        </w:rPr>
-        <w:t xml:space="preserve">It has been tested on a subset of tabula sapiens atlas – skin </w:t>
-      </w:r>
-    </w:p>
-    <w:p>
-      <w:pPr>
-        <w:pStyle w:val="ListParagraph"/>
-        <w:ind w:left="1440"/>
-        <w:rPr>
-          <w:rFonts w:ascii="Times New Roman" w:eastAsia="Times New Roman" w:hAnsi="Times New Roman" w:cs="Times New Roman"/>
-          <w:kern w:val="0"/>
-          <w14:ligatures w14:val="none"/>
-        </w:rPr>
-      </w:pPr>
-      <w:r>
-        <w:rPr>
-          <w:rFonts w:ascii="Times New Roman" w:eastAsia="Times New Roman" w:hAnsi="Times New Roman" w:cs="Times New Roman"/>
-          <w:kern w:val="0"/>
-          <w14:ligatures w14:val="none"/>
-        </w:rPr>
-        <w:t xml:space="preserve">But I keep running into some errors and end up optimizing the algorithm to make it more robust. </w:t>
-      </w:r>
-    </w:p>
-    <w:p>
-      <w:pPr>
-        <w:pStyle w:val="ListParagraph"/>
-        <w:ind w:left="1440"/>
-        <w:rPr>
-          <w:rFonts w:ascii="Times New Roman" w:eastAsia="Times New Roman" w:hAnsi="Times New Roman" w:cs="Times New Roman"/>
-          <w:kern w:val="0"/>
-          <w14:ligatures w14:val="none"/>
-        </w:rPr>
-      </w:pPr>
-      <w:r>
-        <w:rPr>
-          <w:rFonts w:ascii="Times New Roman" w:eastAsia="Times New Roman" w:hAnsi="Times New Roman" w:cs="Times New Roman"/>
-          <w:kern w:val="0"/>
-          <w14:ligatures w14:val="none"/>
-        </w:rPr>
-        <w:t>Current version:</w:t>
-      </w:r>
-    </w:p>
-    <w:p>
-      <w:pPr>
-        <w:pStyle w:val="ListParagraph"/>
-        <w:ind w:left="1440"/>
-        <w:rPr>
-          <w:rFonts w:ascii="Times New Roman" w:eastAsia="Times New Roman" w:hAnsi="Times New Roman" w:cs="Times New Roman"/>
-          <w:kern w:val="0"/>
-          <w14:ligatures w14:val="none"/>
-        </w:rPr>
-      </w:pPr>
-      <w:r>
-        <w:rPr>
-          <w:rFonts w:ascii="Times New Roman" w:eastAsia="Times New Roman" w:hAnsi="Times New Roman" w:cs="Times New Roman"/>
-          <w:kern w:val="0"/>
-          <w14:ligatures w14:val="none"/>
-        </w:rPr>
-        <w:t>for each cluster defined as (</w:t>
-      </w:r>
-      <w:proofErr w:type="spellStart"/>
-      <w:r>
-        <w:rPr>
-          <w:rFonts w:ascii="Times New Roman" w:eastAsia="Times New Roman" w:hAnsi="Times New Roman" w:cs="Times New Roman"/>
-          <w:kern w:val="0"/>
-          <w14:ligatures w14:val="none"/>
-        </w:rPr>
-        <w:t>cell_id</w:t>
-      </w:r>
-      <w:proofErr w:type="spellEnd"/>
-      <w:r>
-        <w:rPr>
-          <w:rFonts w:ascii="Times New Roman" w:eastAsia="Times New Roman" w:hAnsi="Times New Roman" w:cs="Times New Roman"/>
-          <w:kern w:val="0"/>
-          <w14:ligatures w14:val="none"/>
-        </w:rPr>
-        <w:t xml:space="preserve">, </w:t>
-      </w:r>
-      <w:proofErr w:type="spellStart"/>
-      <w:r>
-        <w:rPr>
-          <w:rFonts w:ascii="Times New Roman" w:eastAsia="Times New Roman" w:hAnsi="Times New Roman" w:cs="Times New Roman"/>
-          <w:kern w:val="0"/>
-          <w14:ligatures w14:val="none"/>
-        </w:rPr>
-        <w:t>tissue_id</w:t>
-      </w:r>
-      <w:proofErr w:type="spellEnd"/>
-      <w:r>
-        <w:rPr>
-          <w:rFonts w:ascii="Times New Roman" w:eastAsia="Times New Roman" w:hAnsi="Times New Roman" w:cs="Times New Roman"/>
-          <w:kern w:val="0"/>
-          <w14:ligatures w14:val="none"/>
-        </w:rPr>
-        <w:t xml:space="preserve">, </w:t>
-      </w:r>
-      <w:proofErr w:type="spellStart"/>
-      <w:r>
-        <w:rPr>
-          <w:rFonts w:ascii="Times New Roman" w:eastAsia="Times New Roman" w:hAnsi="Times New Roman" w:cs="Times New Roman"/>
-          <w:kern w:val="0"/>
-          <w14:ligatures w14:val="none"/>
-        </w:rPr>
-        <w:t>cell_tissue_</w:t>
-      </w:r>
-      <w:proofErr w:type="gramStart"/>
-      <w:r>
-        <w:rPr>
-          <w:rFonts w:ascii="Times New Roman" w:eastAsia="Times New Roman" w:hAnsi="Times New Roman" w:cs="Times New Roman"/>
-          <w:kern w:val="0"/>
-          <w14:ligatures w14:val="none"/>
-        </w:rPr>
-        <w:t>id</w:t>
-      </w:r>
-      <w:proofErr w:type="spellEnd"/>
-      <w:r>
-        <w:rPr>
-          <w:rFonts w:ascii="Times New Roman" w:eastAsia="Times New Roman" w:hAnsi="Times New Roman" w:cs="Times New Roman"/>
-          <w:kern w:val="0"/>
-          <w14:ligatures w14:val="none"/>
-        </w:rPr>
-        <w:t>){</w:t>
-      </w:r>
-      <w:proofErr w:type="gramEnd"/>
-    </w:p>
-    <w:p>
-      <w:pPr>
-        <w:pStyle w:val="ListParagraph"/>
-        <w:ind w:left="1440"/>
-        <w:rPr>
-          <w:rFonts w:ascii="Times New Roman" w:eastAsia="Times New Roman" w:hAnsi="Times New Roman" w:cs="Times New Roman"/>
-          <w:kern w:val="0"/>
-          <w14:ligatures w14:val="none"/>
-        </w:rPr>
-      </w:pPr>
-      <w:r>
-        <w:rPr>
-          <w:rFonts w:ascii="Times New Roman" w:eastAsia="Times New Roman" w:hAnsi="Times New Roman" w:cs="Times New Roman"/>
-          <w:kern w:val="0"/>
-          <w14:ligatures w14:val="none"/>
-        </w:rPr>
-        <w:tab/>
-        <w:t>iterate over 100 times {</w:t>
-      </w:r>
-    </w:p>
-    <w:p>
-      <w:pPr>
-        <w:pStyle w:val="ListParagraph"/>
-        <w:ind w:left="1440"/>
-        <w:rPr>
-          <w:rFonts w:ascii="Times New Roman" w:eastAsia="Times New Roman" w:hAnsi="Times New Roman" w:cs="Times New Roman"/>
-          <w:kern w:val="0"/>
-          <w14:ligatures w14:val="none"/>
-        </w:rPr>
-      </w:pPr>
-      <w:r>
-        <w:rPr>
-          <w:rFonts w:ascii="Times New Roman" w:eastAsia="Times New Roman" w:hAnsi="Times New Roman" w:cs="Times New Roman"/>
-          <w:kern w:val="0"/>
-          <w14:ligatures w14:val="none"/>
-        </w:rPr>
-        <w:tab/>
-      </w:r>
-      <w:proofErr w:type="spellStart"/>
-      <w:r>
-        <w:rPr>
-          <w:rFonts w:ascii="Times New Roman" w:eastAsia="Times New Roman" w:hAnsi="Times New Roman" w:cs="Times New Roman"/>
-          <w:kern w:val="0"/>
-          <w14:ligatures w14:val="none"/>
-        </w:rPr>
-        <w:t>scanpy</w:t>
-      </w:r>
-      <w:proofErr w:type="spellEnd"/>
-      <w:r>
-        <w:rPr>
-          <w:rFonts w:ascii="Times New Roman" w:eastAsia="Times New Roman" w:hAnsi="Times New Roman" w:cs="Times New Roman"/>
-          <w:kern w:val="0"/>
-          <w14:ligatures w14:val="none"/>
-        </w:rPr>
-        <w:t xml:space="preserve"> differential using logistic regression</w:t>
-      </w:r>
-    </w:p>
-    <w:p>
-      <w:pPr>
-        <w:pStyle w:val="ListParagraph"/>
-        <w:ind w:left="1440"/>
-        <w:rPr>
-          <w:rFonts w:ascii="Times New Roman" w:eastAsia="Times New Roman" w:hAnsi="Times New Roman" w:cs="Times New Roman"/>
-          <w:kern w:val="0"/>
-          <w14:ligatures w14:val="none"/>
-        </w:rPr>
-      </w:pPr>
-      <w:r>
-        <w:rPr>
-          <w:rFonts w:ascii="Times New Roman" w:eastAsia="Times New Roman" w:hAnsi="Times New Roman" w:cs="Times New Roman"/>
-          <w:kern w:val="0"/>
-          <w14:ligatures w14:val="none"/>
-        </w:rPr>
-        <w:tab/>
-      </w:r>
-      <w:proofErr w:type="spellStart"/>
-      <w:r>
-        <w:rPr>
-          <w:rFonts w:ascii="Times New Roman" w:eastAsia="Times New Roman" w:hAnsi="Times New Roman" w:cs="Times New Roman"/>
-          <w:kern w:val="0"/>
-          <w14:ligatures w14:val="none"/>
-        </w:rPr>
-        <w:t>scanpy</w:t>
-      </w:r>
-      <w:proofErr w:type="spellEnd"/>
-      <w:r>
-        <w:rPr>
-          <w:rFonts w:ascii="Times New Roman" w:eastAsia="Times New Roman" w:hAnsi="Times New Roman" w:cs="Times New Roman"/>
-          <w:kern w:val="0"/>
-          <w14:ligatures w14:val="none"/>
-        </w:rPr>
-        <w:t xml:space="preserve"> differential using Wilcoxon</w:t>
-      </w:r>
-    </w:p>
-    <w:p>
-      <w:pPr>
-        <w:pStyle w:val="ListParagraph"/>
-        <w:ind w:left="1440"/>
-        <w:rPr>
-          <w:rFonts w:ascii="Times New Roman" w:eastAsia="Times New Roman" w:hAnsi="Times New Roman" w:cs="Times New Roman"/>
-          <w:kern w:val="0"/>
-          <w14:ligatures w14:val="none"/>
-        </w:rPr>
-      </w:pPr>
-      <w:r>
-        <w:rPr>
-          <w:rFonts w:ascii="Times New Roman" w:eastAsia="Times New Roman" w:hAnsi="Times New Roman" w:cs="Times New Roman"/>
-          <w:kern w:val="0"/>
-          <w14:ligatures w14:val="none"/>
-        </w:rPr>
-        <w:tab/>
-      </w:r>
-      <w:proofErr w:type="spellStart"/>
-      <w:r>
-        <w:rPr>
-          <w:rFonts w:ascii="Times New Roman" w:eastAsia="Times New Roman" w:hAnsi="Times New Roman" w:cs="Times New Roman"/>
-          <w:kern w:val="0"/>
-          <w14:ligatures w14:val="none"/>
-        </w:rPr>
-        <w:t>Filteration</w:t>
-      </w:r>
-      <w:proofErr w:type="spellEnd"/>
-      <w:r>
-        <w:rPr>
-          <w:rFonts w:ascii="Times New Roman" w:eastAsia="Times New Roman" w:hAnsi="Times New Roman" w:cs="Times New Roman"/>
-          <w:kern w:val="0"/>
-          <w14:ligatures w14:val="none"/>
-        </w:rPr>
-        <w:t xml:space="preserve"> of each of the two </w:t>
-      </w:r>
-      <w:proofErr w:type="gramStart"/>
-      <w:r>
-        <w:rPr>
-          <w:rFonts w:ascii="Times New Roman" w:eastAsia="Times New Roman" w:hAnsi="Times New Roman" w:cs="Times New Roman"/>
-          <w:kern w:val="0"/>
-          <w14:ligatures w14:val="none"/>
-        </w:rPr>
-        <w:t>test</w:t>
-      </w:r>
-      <w:proofErr w:type="gramEnd"/>
-      <w:r>
-        <w:rPr>
-          <w:rFonts w:ascii="Times New Roman" w:eastAsia="Times New Roman" w:hAnsi="Times New Roman" w:cs="Times New Roman"/>
-          <w:kern w:val="0"/>
-          <w14:ligatures w14:val="none"/>
-        </w:rPr>
-        <w:t>:</w:t>
-      </w:r>
-    </w:p>
-    <w:p>
-      <w:pPr>
-        <w:pStyle w:val="ListParagraph"/>
-        <w:ind w:left="1440"/>
-        <w:rPr>
-          <w:rFonts w:ascii="Times New Roman" w:eastAsia="Times New Roman" w:hAnsi="Times New Roman" w:cs="Times New Roman"/>
-          <w:kern w:val="0"/>
-          <w14:ligatures w14:val="none"/>
-        </w:rPr>
-      </w:pPr>
-      <w:r>
-        <w:rPr>
-          <w:rFonts w:ascii="Times New Roman" w:eastAsia="Times New Roman" w:hAnsi="Times New Roman" w:cs="Times New Roman"/>
-          <w:kern w:val="0"/>
-          <w14:ligatures w14:val="none"/>
-        </w:rPr>
-        <w:tab/>
-        <w:t xml:space="preserve">Logistic regression -&gt; regression score threshold based on the elbow knee </w:t>
-      </w:r>
-    </w:p>
-    <w:p>
-      <w:pPr>
-        <w:pStyle w:val="ListParagraph"/>
-        <w:ind w:left="2160"/>
-        <w:rPr>
-          <w:rFonts w:ascii="Times New Roman" w:eastAsia="Times New Roman" w:hAnsi="Times New Roman" w:cs="Times New Roman"/>
-          <w:kern w:val="0"/>
-          <w14:ligatures w14:val="none"/>
-        </w:rPr>
-      </w:pPr>
-      <w:r>
-        <w:rPr>
-          <w:rFonts w:ascii="Times New Roman" w:eastAsia="Times New Roman" w:hAnsi="Times New Roman" w:cs="Times New Roman"/>
-          <w:kern w:val="0"/>
-          <w14:ligatures w14:val="none"/>
-        </w:rPr>
-        <w:t xml:space="preserve">Wilcoxon -&gt; </w:t>
-      </w:r>
-      <w:proofErr w:type="spellStart"/>
-      <w:r>
-        <w:rPr>
-          <w:rFonts w:ascii="Times New Roman" w:eastAsia="Times New Roman" w:hAnsi="Times New Roman" w:cs="Times New Roman"/>
-          <w:kern w:val="0"/>
-          <w14:ligatures w14:val="none"/>
-        </w:rPr>
-        <w:t>padj</w:t>
-      </w:r>
-      <w:proofErr w:type="spellEnd"/>
-      <w:r>
-        <w:rPr>
-          <w:rFonts w:ascii="Times New Roman" w:eastAsia="Times New Roman" w:hAnsi="Times New Roman" w:cs="Times New Roman"/>
-          <w:kern w:val="0"/>
-          <w14:ligatures w14:val="none"/>
-        </w:rPr>
-        <w:t xml:space="preserve"> &lt; 0.05 &amp; abs(log2FC) &gt; 0.25 &amp; </w:t>
-      </w:r>
-      <w:proofErr w:type="spellStart"/>
-      <w:r>
-        <w:rPr>
-          <w:rFonts w:ascii="Times New Roman" w:eastAsia="Times New Roman" w:hAnsi="Times New Roman" w:cs="Times New Roman"/>
-          <w:kern w:val="0"/>
-          <w14:ligatures w14:val="none"/>
-        </w:rPr>
-        <w:t>percent_cells_expressed</w:t>
-      </w:r>
-      <w:proofErr w:type="spellEnd"/>
-      <w:r>
-        <w:rPr>
-          <w:rFonts w:ascii="Times New Roman" w:eastAsia="Times New Roman" w:hAnsi="Times New Roman" w:cs="Times New Roman"/>
-          <w:kern w:val="0"/>
-          <w14:ligatures w14:val="none"/>
-        </w:rPr>
-        <w:t xml:space="preserve"> &gt; 0.3 &amp; </w:t>
-      </w:r>
-      <w:proofErr w:type="spellStart"/>
-      <w:r>
-        <w:rPr>
-          <w:rFonts w:ascii="Times New Roman" w:eastAsia="Times New Roman" w:hAnsi="Times New Roman" w:cs="Times New Roman"/>
-          <w:kern w:val="0"/>
-          <w14:ligatures w14:val="none"/>
-        </w:rPr>
-        <w:t>percent_cell_expressing_outside_cluster</w:t>
-      </w:r>
-      <w:proofErr w:type="spellEnd"/>
-      <w:r>
-        <w:rPr>
-          <w:rFonts w:ascii="Times New Roman" w:eastAsia="Times New Roman" w:hAnsi="Times New Roman" w:cs="Times New Roman"/>
-          <w:kern w:val="0"/>
-          <w14:ligatures w14:val="none"/>
-        </w:rPr>
-        <w:t xml:space="preserve"> &gt; 0.1</w:t>
-      </w:r>
-    </w:p>
-    <w:p>
-      <w:pPr>
-        <w:pStyle w:val="ListParagraph"/>
-        <w:ind w:left="2160"/>
-        <w:rPr>
-          <w:rFonts w:ascii="Times New Roman" w:eastAsia="Times New Roman" w:hAnsi="Times New Roman" w:cs="Times New Roman"/>
-          <w:kern w:val="0"/>
-          <w14:ligatures w14:val="none"/>
-        </w:rPr>
-      </w:pPr>
-      <w:r>
-        <w:rPr>
-          <w:rFonts w:ascii="Times New Roman" w:eastAsia="Times New Roman" w:hAnsi="Times New Roman" w:cs="Times New Roman"/>
-          <w:kern w:val="0"/>
-          <w14:ligatures w14:val="none"/>
-        </w:rPr>
-        <w:t>}</w:t>
-      </w:r>
-    </w:p>
-    <w:p>
-      <w:pPr>
-        <w:pStyle w:val="ListParagraph"/>
-        <w:ind w:left="2160"/>
-        <w:rPr>
-          <w:rFonts w:ascii="Times New Roman" w:eastAsia="Times New Roman" w:hAnsi="Times New Roman" w:cs="Times New Roman"/>
-          <w:kern w:val="0"/>
-          <w14:ligatures w14:val="none"/>
-        </w:rPr>
-      </w:pPr>
-      <w:r>
-        <w:rPr>
-          <w:rFonts w:ascii="Times New Roman" w:eastAsia="Times New Roman" w:hAnsi="Times New Roman" w:cs="Times New Roman"/>
-          <w:kern w:val="0"/>
-          <w14:ligatures w14:val="none"/>
-        </w:rPr>
-        <w:t xml:space="preserve">Marker found in </w:t>
-      </w:r>
-      <w:proofErr w:type="spellStart"/>
-      <w:r>
-        <w:rPr>
-          <w:rFonts w:ascii="Times New Roman" w:eastAsia="Times New Roman" w:hAnsi="Times New Roman" w:cs="Times New Roman"/>
-          <w:kern w:val="0"/>
-          <w14:ligatures w14:val="none"/>
-        </w:rPr>
-        <w:t>atleast</w:t>
-      </w:r>
-      <w:proofErr w:type="spellEnd"/>
-      <w:r>
-        <w:rPr>
-          <w:rFonts w:ascii="Times New Roman" w:eastAsia="Times New Roman" w:hAnsi="Times New Roman" w:cs="Times New Roman"/>
-          <w:kern w:val="0"/>
-          <w14:ligatures w14:val="none"/>
-        </w:rPr>
-        <w:t xml:space="preserve"> 75% of the iteration -&gt; defined as marker</w:t>
-      </w:r>
-    </w:p>
-    <w:p>
-      <w:pPr>
-        <w:pStyle w:val="ListParagraph"/>
-        <w:ind w:left="1440"/>
-        <w:rPr>
-          <w:rFonts w:ascii="Times New Roman" w:eastAsia="Times New Roman" w:hAnsi="Times New Roman" w:cs="Times New Roman"/>
-          <w:kern w:val="0"/>
-          <w14:ligatures w14:val="none"/>
-        </w:rPr>
-      </w:pPr>
-      <w:r>
-        <w:rPr>
-          <w:rFonts w:ascii="Times New Roman" w:eastAsia="Times New Roman" w:hAnsi="Times New Roman" w:cs="Times New Roman"/>
-          <w:kern w:val="0"/>
-          <w14:ligatures w14:val="none"/>
-        </w:rPr>
-        <w:t>}</w:t>
-      </w:r>
-    </w:p>
-    <w:p>
-      <w:pPr>
-        <w:pStyle w:val="ListParagraph"/>
-        <w:ind w:left="1440"/>
-        <w:rPr>
-          <w:rFonts w:ascii="Times New Roman" w:hAnsi="Times New Roman" w:cs="Times New Roman"/>
-        </w:rPr>
-      </w:pPr>
-    </w:p>
-    <w:p>
-      <w:pPr>
-        <w:pStyle w:val="ListParagraph"/>
-        <w:ind w:left="1440"/>
-        <w:rPr>
-          <w:rFonts w:ascii="Times New Roman" w:hAnsi="Times New Roman" w:cs="Times New Roman"/>
-        </w:rPr>
-      </w:pPr>
-    </w:p>
-    <w:p>
-      <w:pPr>
-        <w:pStyle w:val="ListParagraph"/>
-        <w:ind w:left="1440"/>
-        <w:rPr>
-          <w:rFonts w:ascii="Times New Roman" w:hAnsi="Times New Roman" w:cs="Times New Roman"/>
-        </w:rPr>
-      </w:pPr>
-    </w:p>
-    <w:p>
-      <w:pPr>
-        <w:pStyle w:val="ListParagraph"/>
-        <w:ind w:left="1440"/>
-        <w:rPr>
-          <w:rFonts w:ascii="Times New Roman" w:hAnsi="Times New Roman" w:cs="Times New Roman"/>
-        </w:rPr>
-      </w:pPr>
-    </w:p>
-    <w:p>
-      <w:pPr>
-        <w:pStyle w:val="ListParagraph"/>
-        <w:numPr>
-          <w:ilvl w:val="0"/>
-          <w:numId w:val="8"/>
-        </w:numPr>
-        <w:rPr>
-          <w:rFonts w:ascii="Times New Roman" w:hAnsi="Times New Roman" w:cs="Times New Roman"/>
-        </w:rPr>
-      </w:pPr>
-      <w:r>
-        <w:rPr>
-          <w:rFonts w:ascii="Times New Roman" w:hAnsi="Times New Roman" w:cs="Times New Roman"/>
-        </w:rPr>
-        <w:lastRenderedPageBreak/>
-        <w:t>Phase 3:</w:t>
-      </w:r>
-    </w:p>
-    <w:p>
-      <w:pPr>
-        <w:pStyle w:val="ListParagraph"/>
-        <w:numPr>
-          <w:ilvl w:val="1"/>
-          <w:numId w:val="8"/>
-        </w:numPr>
-        <w:rPr>
-          <w:rFonts w:ascii="Times New Roman" w:hAnsi="Times New Roman" w:cs="Times New Roman"/>
-        </w:rPr>
-      </w:pPr>
-      <w:r>
-        <w:rPr>
-          <w:rFonts w:ascii="Times New Roman" w:hAnsi="Times New Roman" w:cs="Times New Roman"/>
-        </w:rPr>
-        <w:t>Hypergeometric test:</w:t>
-      </w:r>
-    </w:p>
-    <w:p>
-      <w:pPr>
-        <w:pStyle w:val="ListParagraph"/>
-        <w:numPr>
-          <w:ilvl w:val="2"/>
-          <w:numId w:val="8"/>
-        </w:numPr>
-        <w:rPr>
-          <w:rFonts w:ascii="Times New Roman" w:hAnsi="Times New Roman" w:cs="Times New Roman"/>
-        </w:rPr>
-      </w:pPr>
-      <w:r>
-        <w:rPr>
-          <w:rFonts w:ascii="Times New Roman" w:hAnsi="Times New Roman" w:cs="Times New Roman"/>
-        </w:rPr>
-        <w:t>Given the DEG marker</w:t>
-      </w:r>
-      <w:r>
-        <w:rPr>
-          <w:rFonts w:ascii="Times New Roman" w:hAnsi="Times New Roman" w:cs="Times New Roman"/>
-        </w:rPr>
-        <w:t xml:space="preserve"> file -&gt; use the </w:t>
-      </w:r>
-      <w:proofErr w:type="spellStart"/>
-      <w:r>
-        <w:rPr>
-          <w:rFonts w:ascii="Times New Roman" w:hAnsi="Times New Roman" w:cs="Times New Roman"/>
-        </w:rPr>
-        <w:t>padj</w:t>
-      </w:r>
-      <w:proofErr w:type="spellEnd"/>
-      <w:r>
-        <w:rPr>
-          <w:rFonts w:ascii="Times New Roman" w:hAnsi="Times New Roman" w:cs="Times New Roman"/>
-        </w:rPr>
-        <w:t xml:space="preserve"> &lt; 0.05 &amp; abs(log2FC) &gt; 1</w:t>
-      </w:r>
-    </w:p>
-    <w:p>
-      <w:pPr>
-        <w:pStyle w:val="ListParagraph"/>
-        <w:ind w:left="2160"/>
-        <w:rPr>
-          <w:rFonts w:ascii="Times New Roman" w:hAnsi="Times New Roman" w:cs="Times New Roman"/>
-        </w:rPr>
-      </w:pPr>
-      <w:r>
-        <w:rPr>
-          <w:rFonts w:ascii="Times New Roman" w:hAnsi="Times New Roman" w:cs="Times New Roman"/>
-        </w:rPr>
-        <w:t xml:space="preserve"> -&gt; convert to </w:t>
-      </w:r>
-      <w:r>
-        <w:rPr>
-          <w:rFonts w:ascii="Times New Roman" w:hAnsi="Times New Roman" w:cs="Times New Roman"/>
-        </w:rPr>
-        <w:t>dictionary of</w:t>
-      </w:r>
-      <w:r>
-        <w:rPr>
-          <w:rFonts w:ascii="Times New Roman" w:hAnsi="Times New Roman" w:cs="Times New Roman"/>
-        </w:rPr>
-        <w:t xml:space="preserve"> markers </w:t>
-      </w:r>
-      <w:r>
-        <w:rPr>
-          <w:rFonts w:ascii="Times New Roman" w:hAnsi="Times New Roman" w:cs="Times New Roman"/>
-        </w:rPr>
-        <w:t>per cluster as key</w:t>
-      </w:r>
-    </w:p>
-    <w:p>
-      <w:pPr>
-        <w:pStyle w:val="ListParagraph"/>
-        <w:numPr>
-          <w:ilvl w:val="2"/>
-          <w:numId w:val="8"/>
-        </w:numPr>
-        <w:rPr>
-          <w:rFonts w:ascii="Times New Roman" w:hAnsi="Times New Roman" w:cs="Times New Roman"/>
-        </w:rPr>
-      </w:pPr>
-      <w:r>
-        <w:rPr>
-          <w:rFonts w:ascii="Times New Roman" w:hAnsi="Times New Roman" w:cs="Times New Roman"/>
-        </w:rPr>
-        <w:t xml:space="preserve">Reference marker dictionary with </w:t>
-      </w:r>
-      <w:proofErr w:type="spellStart"/>
-      <w:r>
-        <w:rPr>
-          <w:rFonts w:ascii="Times New Roman" w:hAnsi="Times New Roman" w:cs="Times New Roman"/>
-        </w:rPr>
-        <w:t>tissue_id</w:t>
-      </w:r>
-      <w:proofErr w:type="spellEnd"/>
-      <w:r>
-        <w:rPr>
-          <w:rFonts w:ascii="Times New Roman" w:hAnsi="Times New Roman" w:cs="Times New Roman"/>
-        </w:rPr>
-        <w:t xml:space="preserve"> + </w:t>
-      </w:r>
-      <w:proofErr w:type="spellStart"/>
-      <w:r>
-        <w:rPr>
-          <w:rFonts w:ascii="Times New Roman" w:hAnsi="Times New Roman" w:cs="Times New Roman"/>
-        </w:rPr>
-        <w:t>cell_id</w:t>
-      </w:r>
-      <w:proofErr w:type="spellEnd"/>
-      <w:r>
-        <w:rPr>
-          <w:rFonts w:ascii="Times New Roman" w:hAnsi="Times New Roman" w:cs="Times New Roman"/>
-        </w:rPr>
-        <w:t xml:space="preserve"> as key and markers </w:t>
-      </w:r>
-      <w:r>
-        <w:rPr>
-          <w:rFonts w:ascii="Times New Roman" w:hAnsi="Times New Roman" w:cs="Times New Roman"/>
-        </w:rPr>
-        <w:t>as value</w:t>
-      </w:r>
-    </w:p>
-    <w:p>
-      <w:pPr>
-        <w:pStyle w:val="ListParagraph"/>
-        <w:numPr>
-          <w:ilvl w:val="2"/>
-          <w:numId w:val="8"/>
-        </w:numPr>
-        <w:rPr>
-          <w:rFonts w:ascii="Times New Roman" w:hAnsi="Times New Roman" w:cs="Times New Roman"/>
-        </w:rPr>
-      </w:pPr>
-      <w:r>
-        <w:rPr>
-          <w:rFonts w:ascii="Times New Roman" w:hAnsi="Times New Roman" w:cs="Times New Roman"/>
-        </w:rPr>
-        <w:t xml:space="preserve">Perform the hypergeometric test per list to return </w:t>
-      </w:r>
-      <w:proofErr w:type="spellStart"/>
-      <w:r>
-        <w:rPr>
-          <w:rFonts w:ascii="Times New Roman" w:hAnsi="Times New Roman" w:cs="Times New Roman"/>
-        </w:rPr>
-        <w:t>cell_id+tissue_id</w:t>
-      </w:r>
-      <w:proofErr w:type="spellEnd"/>
-    </w:p>
-    <w:p>
-      <w:pPr>
-        <w:numPr>
-          <w:ilvl w:val="3"/>
-          <w:numId w:val="8"/>
-        </w:numPr>
-        <w:spacing w:before="100" w:beforeAutospacing="1" w:after="100" w:afterAutospacing="1" w:line="240" w:lineRule="auto"/>
-        <w:rPr>
-          <w:rFonts w:ascii="Times New Roman" w:eastAsia="Times New Roman" w:hAnsi="Times New Roman" w:cs="Times New Roman"/>
-          <w:kern w:val="0"/>
-          <w14:ligatures w14:val="none"/>
-        </w:rPr>
-      </w:pPr>
-      <w:r>
-        <w:rPr>
-          <w:rFonts w:ascii="Times New Roman" w:eastAsia="Times New Roman" w:hAnsi="Times New Roman" w:cs="Times New Roman"/>
-          <w:kern w:val="0"/>
-          <w14:ligatures w14:val="none"/>
-        </w:rPr>
-        <w:t>N: Total number of genes in your dataset's background (e.g., all genes measured by the Xenium panel).</w:t>
-      </w:r>
-    </w:p>
-    <w:p>
-      <w:pPr>
-        <w:numPr>
-          <w:ilvl w:val="3"/>
-          <w:numId w:val="8"/>
-        </w:numPr>
-        <w:spacing w:before="100" w:beforeAutospacing="1" w:after="100" w:afterAutospacing="1" w:line="240" w:lineRule="auto"/>
-        <w:rPr>
-          <w:rFonts w:ascii="Times New Roman" w:eastAsia="Times New Roman" w:hAnsi="Times New Roman" w:cs="Times New Roman"/>
-          <w:kern w:val="0"/>
-          <w14:ligatures w14:val="none"/>
-        </w:rPr>
-      </w:pPr>
-      <w:r>
-        <w:rPr>
-          <w:rFonts w:ascii="Times New Roman" w:eastAsia="Times New Roman" w:hAnsi="Times New Roman" w:cs="Times New Roman"/>
-          <w:kern w:val="0"/>
-          <w14:ligatures w14:val="none"/>
-        </w:rPr>
-        <w:t>K: Total number of markers for a specific cell type in the background (e.g., how many astrocyte markers are in your gene panel).</w:t>
-      </w:r>
-    </w:p>
-    <w:p>
-      <w:pPr>
-        <w:numPr>
-          <w:ilvl w:val="3"/>
-          <w:numId w:val="8"/>
-        </w:numPr>
-        <w:spacing w:before="100" w:beforeAutospacing="1" w:after="100" w:afterAutospacing="1" w:line="240" w:lineRule="auto"/>
-        <w:rPr>
-          <w:rFonts w:ascii="Times New Roman" w:eastAsia="Times New Roman" w:hAnsi="Times New Roman" w:cs="Times New Roman"/>
-          <w:kern w:val="0"/>
-          <w14:ligatures w14:val="none"/>
-        </w:rPr>
-      </w:pPr>
-      <w:r>
-        <w:rPr>
-          <w:rFonts w:ascii="Times New Roman" w:eastAsia="Times New Roman" w:hAnsi="Times New Roman" w:cs="Times New Roman"/>
-          <w:kern w:val="0"/>
-          <w14:ligatures w14:val="none"/>
-        </w:rPr>
-        <w:t>n: The number of top differential genes you selected for your cluster.</w:t>
-      </w:r>
-    </w:p>
-    <w:p>
-      <w:pPr>
-        <w:numPr>
-          <w:ilvl w:val="3"/>
-          <w:numId w:val="8"/>
-        </w:numPr>
-        <w:spacing w:before="100" w:beforeAutospacing="1" w:after="100" w:afterAutospacing="1" w:line="240" w:lineRule="auto"/>
-        <w:rPr>
-          <w:rFonts w:ascii="Times New Roman" w:eastAsia="Times New Roman" w:hAnsi="Times New Roman" w:cs="Times New Roman"/>
-          <w:kern w:val="0"/>
-          <w14:ligatures w14:val="none"/>
-        </w:rPr>
-      </w:pPr>
-      <w:r>
-        <w:rPr>
-          <w:rFonts w:ascii="Times New Roman" w:eastAsia="Times New Roman" w:hAnsi="Times New Roman" w:cs="Times New Roman"/>
-          <w:kern w:val="0"/>
-          <w14:ligatures w14:val="none"/>
-        </w:rPr>
-        <w:t>k: The number of genes that are in BOTH your differential gene list AND the known cell type marker list (the overlap).</w:t>
-      </w:r>
-    </w:p>
-    <w:p>
-      <w:pPr>
-        <w:spacing w:before="100" w:beforeAutospacing="1" w:after="100" w:afterAutospacing="1" w:line="240" w:lineRule="auto"/>
-        <w:ind w:left="1800" w:firstLine="720"/>
-        <w:rPr>
-          <w:rFonts w:ascii="Times New Roman" w:eastAsia="Times New Roman" w:hAnsi="Times New Roman" w:cs="Times New Roman"/>
-          <w:kern w:val="0"/>
-          <w14:ligatures w14:val="none"/>
-        </w:rPr>
-      </w:pPr>
-      <w:r>
-        <w:rPr>
-          <w:rFonts w:ascii="Times New Roman" w:eastAsia="Times New Roman" w:hAnsi="Times New Roman" w:cs="Times New Roman"/>
-          <w:kern w:val="0"/>
-          <w14:ligatures w14:val="none"/>
-        </w:rPr>
-        <w:t xml:space="preserve">The probability is calculated as: </w:t>
-      </w:r>
-    </w:p>
-    <w:p>
-      <w:pPr>
-        <w:spacing w:after="0" w:line="240" w:lineRule="auto"/>
-        <w:ind w:left="2160" w:firstLine="720"/>
-        <w:rPr>
-          <w:rFonts w:ascii="Times New Roman" w:eastAsia="Times New Roman" w:hAnsi="Times New Roman" w:cs="Times New Roman"/>
-          <w:kern w:val="0"/>
-          <w14:ligatures w14:val="none"/>
-        </w:rPr>
-      </w:pPr>
-      <w:r>
-        <w:rPr>
-          <w:rFonts w:ascii="Times New Roman" w:eastAsia="Times New Roman" w:hAnsi="Times New Roman" w:cs="Times New Roman"/>
-          <w:kern w:val="0"/>
-          <w14:ligatures w14:val="none"/>
-        </w:rPr>
-        <w:t>P(</w:t>
-      </w:r>
-      <w:proofErr w:type="spellStart"/>
-      <w:r>
-        <w:rPr>
-          <w:rFonts w:ascii="Times New Roman" w:eastAsia="Times New Roman" w:hAnsi="Times New Roman" w:cs="Times New Roman"/>
-          <w:kern w:val="0"/>
-          <w14:ligatures w14:val="none"/>
-        </w:rPr>
-        <w:t>X≥</w:t>
-      </w:r>
-      <w:proofErr w:type="gramStart"/>
-      <w:r>
-        <w:rPr>
-          <w:rFonts w:ascii="Times New Roman" w:eastAsia="Times New Roman" w:hAnsi="Times New Roman" w:cs="Times New Roman"/>
-          <w:kern w:val="0"/>
-          <w14:ligatures w14:val="none"/>
-        </w:rPr>
-        <w:t>k</w:t>
-      </w:r>
-      <w:proofErr w:type="spellEnd"/>
-      <w:r>
-        <w:rPr>
-          <w:rFonts w:ascii="Times New Roman" w:eastAsia="Times New Roman" w:hAnsi="Times New Roman" w:cs="Times New Roman"/>
-          <w:kern w:val="0"/>
-          <w14:ligatures w14:val="none"/>
-        </w:rPr>
-        <w:t>)=</w:t>
-      </w:r>
-      <w:proofErr w:type="spellStart"/>
-      <w:proofErr w:type="gramEnd"/>
-      <w:r>
-        <w:rPr>
-          <w:rFonts w:ascii="Times New Roman" w:eastAsia="Times New Roman" w:hAnsi="Times New Roman" w:cs="Times New Roman"/>
-          <w:kern w:val="0"/>
-          <w14:ligatures w14:val="none"/>
-        </w:rPr>
-        <w:t>i</w:t>
-      </w:r>
-      <w:proofErr w:type="spellEnd"/>
-      <w:r>
-        <w:rPr>
-          <w:rFonts w:ascii="Times New Roman" w:eastAsia="Times New Roman" w:hAnsi="Times New Roman" w:cs="Times New Roman"/>
-          <w:kern w:val="0"/>
-          <w14:ligatures w14:val="none"/>
-        </w:rPr>
-        <w:t>=</w:t>
-      </w:r>
-      <w:proofErr w:type="spellStart"/>
-      <w:r>
-        <w:rPr>
-          <w:rFonts w:ascii="Times New Roman" w:eastAsia="Times New Roman" w:hAnsi="Times New Roman" w:cs="Times New Roman"/>
-          <w:kern w:val="0"/>
-          <w14:ligatures w14:val="none"/>
-        </w:rPr>
-        <w:t>k∑min</w:t>
-      </w:r>
-      <w:proofErr w:type="spellEnd"/>
-      <w:r>
-        <w:rPr>
-          <w:rFonts w:ascii="Times New Roman" w:eastAsia="Times New Roman" w:hAnsi="Times New Roman" w:cs="Times New Roman"/>
-          <w:kern w:val="0"/>
-          <w14:ligatures w14:val="none"/>
-        </w:rPr>
-        <w:t>(</w:t>
-      </w:r>
-      <w:proofErr w:type="spellStart"/>
-      <w:proofErr w:type="gramStart"/>
-      <w:r>
-        <w:rPr>
-          <w:rFonts w:ascii="Times New Roman" w:eastAsia="Times New Roman" w:hAnsi="Times New Roman" w:cs="Times New Roman"/>
-          <w:kern w:val="0"/>
-          <w14:ligatures w14:val="none"/>
-        </w:rPr>
-        <w:t>n,K</w:t>
-      </w:r>
-      <w:proofErr w:type="spellEnd"/>
-      <w:proofErr w:type="gramEnd"/>
-      <w:r>
-        <w:rPr>
-          <w:rFonts w:ascii="Times New Roman" w:eastAsia="Times New Roman" w:hAnsi="Times New Roman" w:cs="Times New Roman"/>
-          <w:kern w:val="0"/>
-          <w14:ligatures w14:val="none"/>
-        </w:rPr>
-        <w:t>)​(</w:t>
-      </w:r>
-      <w:proofErr w:type="spellStart"/>
-      <w:r>
-        <w:rPr>
-          <w:rFonts w:ascii="Times New Roman" w:eastAsia="Times New Roman" w:hAnsi="Times New Roman" w:cs="Times New Roman"/>
-          <w:kern w:val="0"/>
-          <w14:ligatures w14:val="none"/>
-        </w:rPr>
-        <w:t>nN</w:t>
-      </w:r>
-      <w:proofErr w:type="spellEnd"/>
-      <w:r>
-        <w:rPr>
-          <w:rFonts w:ascii="Times New Roman" w:eastAsia="Times New Roman" w:hAnsi="Times New Roman" w:cs="Times New Roman"/>
-          <w:kern w:val="0"/>
-          <w14:ligatures w14:val="none"/>
-        </w:rPr>
-        <w:t>​)(</w:t>
-      </w:r>
-      <w:proofErr w:type="spellStart"/>
-      <w:r>
-        <w:rPr>
-          <w:rFonts w:ascii="Times New Roman" w:eastAsia="Times New Roman" w:hAnsi="Times New Roman" w:cs="Times New Roman"/>
-          <w:kern w:val="0"/>
-          <w14:ligatures w14:val="none"/>
-        </w:rPr>
-        <w:t>iK</w:t>
-      </w:r>
-      <w:proofErr w:type="spellEnd"/>
-      <w:r>
-        <w:rPr>
-          <w:rFonts w:ascii="Times New Roman" w:eastAsia="Times New Roman" w:hAnsi="Times New Roman" w:cs="Times New Roman"/>
-          <w:kern w:val="0"/>
-          <w14:ligatures w14:val="none"/>
-        </w:rPr>
-        <w:t>​)(n−</w:t>
-      </w:r>
-      <w:proofErr w:type="spellStart"/>
-      <w:r>
-        <w:rPr>
-          <w:rFonts w:ascii="Times New Roman" w:eastAsia="Times New Roman" w:hAnsi="Times New Roman" w:cs="Times New Roman"/>
-          <w:kern w:val="0"/>
-          <w14:ligatures w14:val="none"/>
-        </w:rPr>
-        <w:t>iN</w:t>
-      </w:r>
-      <w:proofErr w:type="spellEnd"/>
-      <w:r>
-        <w:rPr>
-          <w:rFonts w:ascii="Times New Roman" w:eastAsia="Times New Roman" w:hAnsi="Times New Roman" w:cs="Times New Roman"/>
-          <w:kern w:val="0"/>
-          <w14:ligatures w14:val="none"/>
-        </w:rPr>
-        <w:t>−K​)​</w:t>
-      </w:r>
-    </w:p>
-    <w:p>
-      <w:pPr>
-        <w:spacing w:after="0" w:line="240" w:lineRule="auto"/>
-        <w:ind w:left="2160" w:firstLine="720"/>
-        <w:rPr>
-          <w:rFonts w:ascii="Times New Roman" w:eastAsia="Times New Roman" w:hAnsi="Times New Roman" w:cs="Times New Roman"/>
-          <w:kern w:val="0"/>
-          <w14:ligatures w14:val="none"/>
-        </w:rPr>
-      </w:pPr>
-    </w:p>
-    <w:p>
-      <w:pPr>
-        <w:spacing w:after="0" w:line="240" w:lineRule="auto"/>
-        <w:ind w:left="720" w:firstLine="720"/>
-        <w:rPr>
-          <w:rFonts w:ascii="Times New Roman" w:eastAsia="Times New Roman" w:hAnsi="Times New Roman" w:cs="Times New Roman"/>
-          <w:kern w:val="0"/>
-          <w14:ligatures w14:val="none"/>
-        </w:rPr>
-      </w:pPr>
-      <w:r>
-        <w:rPr>
-          <w:rFonts w:ascii="Times New Roman" w:eastAsia="Times New Roman" w:hAnsi="Times New Roman" w:cs="Times New Roman"/>
-          <w:kern w:val="0"/>
-          <w14:ligatures w14:val="none"/>
-        </w:rPr>
-        <w:tab/>
-      </w:r>
-    </w:p>
-    <w:p>
-      <w:pPr>
-        <w:rPr>
-          <w:rFonts w:ascii="Times New Roman" w:hAnsi="Times New Roman" w:cs="Times New Roman"/>
-        </w:rPr>
-      </w:pPr>
-      <w:r>
-        <w:rPr>
-          <w:rFonts w:ascii="Times New Roman" w:hAnsi="Times New Roman" w:cs="Times New Roman"/>
-        </w:rPr>
-        <w:tab/>
-      </w:r>
-      <w:r>
-        <w:rPr>
-          <w:rFonts w:ascii="Times New Roman" w:hAnsi="Times New Roman" w:cs="Times New Roman"/>
-        </w:rPr>
-        <w:tab/>
-      </w:r>
-      <w:r>
-        <w:rPr>
-          <w:rFonts w:ascii="Times New Roman" w:hAnsi="Times New Roman" w:cs="Times New Roman"/>
-        </w:rPr>
-        <w:tab/>
-        <w:t>Return:</w:t>
-      </w:r>
-    </w:p>
-    <w:p>
-      <w:pPr>
-        <w:ind w:left="2160"/>
-      </w:pPr>
-      <w:r>
-        <w:t xml:space="preserve">Overlapping Genes: the </w:t>
-      </w:r>
-      <w:r>
-        <w:rPr>
-          <w:b/>
-          <w:bCs/>
-        </w:rPr>
-        <w:t>exact genes</w:t>
-      </w:r>
-      <w:r>
-        <w:t xml:space="preserve"> that are common between your cluster and the reference cell type</w:t>
-      </w:r>
-    </w:p>
-    <w:p>
-      <w:pPr>
-        <w:ind w:left="1440" w:firstLine="720"/>
-      </w:pPr>
-      <w:r>
-        <w:rPr>
-          <w:rStyle w:val="HTMLCode"/>
-          <w:rFonts w:eastAsiaTheme="majorEastAsia"/>
-          <w:b/>
-          <w:bCs/>
-        </w:rPr>
-        <w:t>Overlap Size (k)</w:t>
-      </w:r>
-      <w:r>
-        <w:t>: The number of overlapping genes.</w:t>
-      </w:r>
-    </w:p>
-    <w:p>
-      <w:pPr>
-        <w:ind w:left="2160"/>
-      </w:pPr>
-      <w:r>
-        <w:rPr>
-          <w:rStyle w:val="HTMLCode"/>
-          <w:rFonts w:eastAsiaTheme="majorEastAsia"/>
-          <w:b/>
-          <w:bCs/>
-        </w:rPr>
-        <w:t>Cluster Markers (n)</w:t>
-      </w:r>
-      <w:r>
-        <w:t>: The total number of significant genes you found for your cluster.</w:t>
-      </w:r>
-    </w:p>
-    <w:p>
-      <w:pPr>
-        <w:ind w:left="2160"/>
-      </w:pPr>
-      <w:r>
-        <w:rPr>
-          <w:rStyle w:val="HTMLCode"/>
-          <w:rFonts w:eastAsiaTheme="majorEastAsia"/>
-          <w:b/>
-          <w:bCs/>
-        </w:rPr>
-        <w:t>Cell Type Markers (K)</w:t>
-      </w:r>
-      <w:r>
-        <w:t>: The total number of markers for that cell type that exist in your experiment's background panel.</w:t>
-      </w:r>
-    </w:p>
-    <w:p>
-      <w:pPr>
-        <w:pStyle w:val="NormalWeb"/>
-        <w:ind w:left="1440" w:firstLine="720"/>
-      </w:pPr>
-      <w:r>
-        <w:rPr>
-          <w:rStyle w:val="HTMLCode"/>
-          <w:rFonts w:eastAsiaTheme="majorEastAsia"/>
-          <w:b/>
-          <w:bCs/>
-        </w:rPr>
-        <w:t>Enrichment Ratio</w:t>
-      </w:r>
-      <w:r>
-        <w:t xml:space="preserve">: It's calculated as </w:t>
-      </w:r>
-      <w:r>
-        <w:rPr>
-          <w:rStyle w:val="mopen"/>
-          <w:rFonts w:eastAsiaTheme="majorEastAsia"/>
-        </w:rPr>
-        <w:t>(</w:t>
-      </w:r>
-      <w:r>
-        <w:rPr>
-          <w:rStyle w:val="mord"/>
-        </w:rPr>
-        <w:t>k/n</w:t>
-      </w:r>
-      <w:r>
-        <w:rPr>
-          <w:rStyle w:val="mclose"/>
-          <w:rFonts w:eastAsiaTheme="majorEastAsia"/>
-        </w:rPr>
-        <w:t>)</w:t>
-      </w:r>
-      <w:r>
-        <w:rPr>
-          <w:rStyle w:val="mord"/>
-        </w:rPr>
-        <w:t>/</w:t>
-      </w:r>
-      <w:r>
-        <w:rPr>
-          <w:rStyle w:val="mopen"/>
-          <w:rFonts w:eastAsiaTheme="majorEastAsia"/>
-        </w:rPr>
-        <w:t>(</w:t>
-      </w:r>
-      <w:r>
-        <w:rPr>
-          <w:rStyle w:val="mord"/>
-        </w:rPr>
-        <w:t>K/N</w:t>
-      </w:r>
-      <w:r>
-        <w:rPr>
-          <w:rStyle w:val="mclose"/>
-          <w:rFonts w:eastAsiaTheme="majorEastAsia"/>
-        </w:rPr>
-        <w:t>)</w:t>
-      </w:r>
-      <w:r>
-        <w:t>.</w:t>
-      </w:r>
-    </w:p>
-    <w:p>
-      <w:pPr>
-        <w:pStyle w:val="NormalWeb"/>
-        <w:spacing w:before="0" w:beforeAutospacing="0" w:after="0" w:afterAutospacing="0"/>
-        <w:ind w:left="1440" w:firstLine="720"/>
-      </w:pPr>
-      <w:r>
-        <w:rPr>
-          <w:rStyle w:val="HTMLCode"/>
-          <w:rFonts w:eastAsiaTheme="majorEastAsia"/>
-        </w:rPr>
-        <w:t>k/n</w:t>
-      </w:r>
-      <w:r>
-        <w:t xml:space="preserve"> is the proportion of your cluster's genes that are cell-type markers.</w:t>
-      </w:r>
-    </w:p>
-    <w:p>
-      <w:pPr>
-        <w:pStyle w:val="NormalWeb"/>
-        <w:spacing w:before="0" w:beforeAutospacing="0" w:after="0" w:afterAutospacing="0"/>
-        <w:ind w:left="2160"/>
-      </w:pPr>
-      <w:r>
-        <w:rPr>
-          <w:rStyle w:val="HTMLCode"/>
-          <w:rFonts w:eastAsiaTheme="majorEastAsia"/>
-        </w:rPr>
-        <w:t>K/N</w:t>
-      </w:r>
-      <w:r>
-        <w:t xml:space="preserve"> is the proportion of all genes in the background that are cell-type markers.</w:t>
-      </w:r>
-    </w:p>
-    <w:p>
-      <w:pPr>
-        <w:pStyle w:val="NormalWeb"/>
-        <w:spacing w:before="0" w:beforeAutospacing="0" w:after="0" w:afterAutospacing="0"/>
-        <w:ind w:left="2160"/>
-      </w:pPr>
-      <w:r>
-        <w:t xml:space="preserve">An enrichment ratio </w:t>
-      </w:r>
-      <w:r>
-        <w:rPr>
-          <w:b/>
-          <w:bCs/>
-        </w:rPr>
-        <w:t>&gt; 1.0</w:t>
-      </w:r>
-      <w:r>
-        <w:t xml:space="preserve"> indicates that the markers are more concentrated in your cluster list than in the background, which is what you expect for a positive result. A higher ratio means stronger enrichment.</w:t>
-      </w:r>
-    </w:p>
-    <w:p>
-      <w:pPr>
-        <w:ind w:left="2880"/>
-        <w:rPr>
-          <w:rFonts w:ascii="Times New Roman" w:hAnsi="Times New Roman" w:cs="Times New Roman"/>
-        </w:rPr>
-      </w:pPr>
+        <w:rPr>
+          <w:rFonts w:ascii="Times New Roman" w:hAnsi="Times New Roman" w:cs="Times New Roman"/>
+        </w:rPr>
+      </w:pPr>
+      <w:r>
+        <w:rPr>
+          <w:rFonts w:ascii="Times New Roman" w:hAnsi="Times New Roman" w:cs="Times New Roman"/>
+          <w:color w:val="B42419"/>
+          <w:kern w:val="0"/>
+          <w:sz w:val="22"/>
+          <w:szCs w:val="22"/>
+        </w:rPr>
+        <w:t xml:space="preserve"> </w:t>
+      </w:r>
     </w:p>
     <w:sectPr>
       <w:pgSz w:w="12240" w:h="15840"/>
@@ -8180,6 +7209,7 @@
   <w:style w:type="paragraph" w:default="1" w:styleId="Normal">
     <w:name w:val="Normal"/>
     <w:qFormat/>
+    <w:rsid w:val="005B38BE"/>
   </w:style>
   <w:style w:type="paragraph" w:styleId="Heading1">
     <w:name w:val="heading 1"/>

</xml_diff>

<commit_message>
Updated codes for database download and parse to integrate more skin specific databases
</commit_message>
<xml_diff>
--- a/SapiensOntoCellMap_documentation.docx
+++ b/SapiensOntoCellMap_documentation.docx
@@ -3735,14 +3735,7 @@
         <w:rPr>
           <w:rFonts w:ascii="Times New Roman" w:hAnsi="Times New Roman" w:cs="Times New Roman"/>
         </w:rPr>
-        <w:t xml:space="preserve"> A hypergeometric test is implemented for the statistical enrichment analysis. This test evaluates the significance of the overlap between the extracted gene list for each cluster and the curated gene sets within a pre-compiled cell marker database. The analysis yields a ranked list of candidate cell type annotations for each </w:t>
-      </w:r>
-      <w:proofErr w:type="spellStart"/>
-      <w:r>
-        <w:rPr>
-          <w:rFonts w:ascii="Times New Roman" w:hAnsi="Times New Roman" w:cs="Times New Roman"/>
-        </w:rPr>
-        <w:t>cluster.</w:t>
+        <w:t xml:space="preserve"> A hypergeometric test is implemented for the statistical enrichment analysis. This test evaluates the significance of the overlap between the extracted gene list for each cluster and the curated gene sets within a pre-compiled cell marker database. The analysis yields a ranked list of candidate cell type annotations for each cluster.</w:t>
       </w:r>
     </w:p>
     <w:p>
@@ -3758,7 +3751,6 @@
           <w14:ligatures w14:val="none"/>
         </w:rPr>
       </w:pPr>
-      <w:proofErr w:type="spellEnd"/>
       <w:r>
         <w:rPr>
           <w:rFonts w:ascii="Times New Roman" w:hAnsi="Times New Roman" w:cs="Times New Roman"/>
@@ -4200,16 +4192,16 @@
         <w:adjustRightInd w:val="0"/>
         <w:spacing w:after="0" w:line="240" w:lineRule="auto"/>
         <w:rPr>
-          <w:rFonts w:ascii="Times New Roman" w:hAnsi="Times New Roman" w:cs="Times New Roman"/>
-          <w:color w:val="000000"/>
-          <w:kern w:val="0"/>
-          <w:sz w:val="22"/>
-          <w:szCs w:val="22"/>
-        </w:rPr>
-      </w:pPr>
-      <w:r>
-        <w:rPr>
-          <w:rFonts w:ascii="Times New Roman" w:hAnsi="Times New Roman" w:cs="Times New Roman"/>
+          <w:rFonts w:ascii="Menlo" w:hAnsi="Menlo" w:cs="Menlo"/>
+          <w:color w:val="000000"/>
+          <w:kern w:val="0"/>
+          <w:sz w:val="22"/>
+          <w:szCs w:val="22"/>
+        </w:rPr>
+      </w:pPr>
+      <w:r>
+        <w:rPr>
+          <w:rFonts w:ascii="Menlo" w:hAnsi="Menlo" w:cs="Menlo"/>
           <w:color w:val="000000"/>
           <w:kern w:val="0"/>
           <w:sz w:val="22"/>
@@ -4239,16 +4231,16 @@
         <w:adjustRightInd w:val="0"/>
         <w:spacing w:after="0" w:line="240" w:lineRule="auto"/>
         <w:rPr>
-          <w:rFonts w:ascii="Times New Roman" w:hAnsi="Times New Roman" w:cs="Times New Roman"/>
-          <w:color w:val="000000"/>
-          <w:kern w:val="0"/>
-          <w:sz w:val="22"/>
-          <w:szCs w:val="22"/>
-        </w:rPr>
-      </w:pPr>
-      <w:r>
-        <w:rPr>
-          <w:rFonts w:ascii="Times New Roman" w:hAnsi="Times New Roman" w:cs="Times New Roman"/>
+          <w:rFonts w:ascii="Menlo" w:hAnsi="Menlo" w:cs="Menlo"/>
+          <w:color w:val="000000"/>
+          <w:kern w:val="0"/>
+          <w:sz w:val="22"/>
+          <w:szCs w:val="22"/>
+        </w:rPr>
+      </w:pPr>
+      <w:r>
+        <w:rPr>
+          <w:rFonts w:ascii="Menlo" w:hAnsi="Menlo" w:cs="Menlo"/>
           <w:color w:val="000000"/>
           <w:kern w:val="0"/>
           <w:sz w:val="22"/>
@@ -4278,32 +4270,22 @@
         <w:adjustRightInd w:val="0"/>
         <w:spacing w:after="0" w:line="240" w:lineRule="auto"/>
         <w:rPr>
-          <w:rFonts w:ascii="Times New Roman" w:hAnsi="Times New Roman" w:cs="Times New Roman"/>
-          <w:color w:val="000000"/>
-          <w:kern w:val="0"/>
-          <w:sz w:val="22"/>
-          <w:szCs w:val="22"/>
-        </w:rPr>
-      </w:pPr>
-      <w:r>
-        <w:rPr>
-          <w:rFonts w:ascii="Times New Roman" w:hAnsi="Times New Roman" w:cs="Times New Roman"/>
-          <w:color w:val="000000"/>
-          <w:kern w:val="0"/>
-          <w:sz w:val="22"/>
-          <w:szCs w:val="22"/>
-        </w:rPr>
-        <w:t>│   ├── __init__.p</w:t>
-      </w:r>
-      <w:r>
-        <w:rPr>
-          <w:rFonts w:ascii="Times New Roman" w:hAnsi="Times New Roman" w:cs="Times New Roman"/>
-          <w:color w:val="000000"/>
-          <w:kern w:val="0"/>
-          <w:sz w:val="22"/>
-          <w:szCs w:val="22"/>
-        </w:rPr>
-        <w:t>y</w:t>
+          <w:rFonts w:ascii="Menlo" w:hAnsi="Menlo" w:cs="Menlo"/>
+          <w:color w:val="000000"/>
+          <w:kern w:val="0"/>
+          <w:sz w:val="22"/>
+          <w:szCs w:val="22"/>
+        </w:rPr>
+      </w:pPr>
+      <w:r>
+        <w:rPr>
+          <w:rFonts w:ascii="Menlo" w:hAnsi="Menlo" w:cs="Menlo"/>
+          <w:color w:val="000000"/>
+          <w:kern w:val="0"/>
+          <w:sz w:val="22"/>
+          <w:szCs w:val="22"/>
+        </w:rPr>
+        <w:t>│   ├── __init__.py</w:t>
       </w:r>
     </w:p>
     <w:p>
@@ -4327,16 +4309,16 @@
         <w:adjustRightInd w:val="0"/>
         <w:spacing w:after="0" w:line="240" w:lineRule="auto"/>
         <w:rPr>
-          <w:rFonts w:ascii="Times New Roman" w:hAnsi="Times New Roman" w:cs="Times New Roman"/>
-          <w:color w:val="000000"/>
-          <w:kern w:val="0"/>
-          <w:sz w:val="22"/>
-          <w:szCs w:val="22"/>
-        </w:rPr>
-      </w:pPr>
-      <w:r>
-        <w:rPr>
-          <w:rFonts w:ascii="Times New Roman" w:hAnsi="Times New Roman" w:cs="Times New Roman"/>
+          <w:rFonts w:ascii="Menlo" w:hAnsi="Menlo" w:cs="Menlo"/>
+          <w:color w:val="000000"/>
+          <w:kern w:val="0"/>
+          <w:sz w:val="22"/>
+          <w:szCs w:val="22"/>
+        </w:rPr>
+      </w:pPr>
+      <w:r>
+        <w:rPr>
+          <w:rFonts w:ascii="Menlo" w:hAnsi="Menlo" w:cs="Menlo"/>
           <w:color w:val="000000"/>
           <w:kern w:val="0"/>
           <w:sz w:val="22"/>
@@ -4366,35 +4348,23 @@
         <w:adjustRightInd w:val="0"/>
         <w:spacing w:after="0" w:line="240" w:lineRule="auto"/>
         <w:rPr>
-          <w:rFonts w:ascii="Times New Roman" w:hAnsi="Times New Roman" w:cs="Times New Roman"/>
-          <w:color w:val="000000"/>
-          <w:kern w:val="0"/>
-          <w:sz w:val="22"/>
-          <w:szCs w:val="22"/>
-        </w:rPr>
-      </w:pPr>
-      <w:r>
-        <w:rPr>
-          <w:rFonts w:ascii="Times New Roman" w:hAnsi="Times New Roman" w:cs="Times New Roman"/>
-          <w:color w:val="000000"/>
-          <w:kern w:val="0"/>
-          <w:sz w:val="22"/>
-          <w:szCs w:val="22"/>
-        </w:rPr>
-        <w:t xml:space="preserve">├── </w:t>
-      </w:r>
-      <w:proofErr w:type="spellStart"/>
-      <w:r>
-        <w:rPr>
-          <w:rFonts w:ascii="Times New Roman" w:hAnsi="Times New Roman" w:cs="Times New Roman"/>
-          <w:color w:val="000000"/>
-          <w:kern w:val="0"/>
-          <w:sz w:val="22"/>
-          <w:szCs w:val="22"/>
-        </w:rPr>
-        <w:t>src</w:t>
-      </w:r>
-      <w:proofErr w:type="spellEnd"/>
+          <w:rFonts w:ascii="Menlo" w:hAnsi="Menlo" w:cs="Menlo"/>
+          <w:color w:val="000000"/>
+          <w:kern w:val="0"/>
+          <w:sz w:val="22"/>
+          <w:szCs w:val="22"/>
+        </w:rPr>
+      </w:pPr>
+      <w:r>
+        <w:rPr>
+          <w:rFonts w:ascii="Menlo" w:hAnsi="Menlo" w:cs="Menlo"/>
+          <w:color w:val="000000"/>
+          <w:kern w:val="0"/>
+          <w:sz w:val="22"/>
+          <w:szCs w:val="22"/>
+        </w:rPr>
+        <w:t>├── data</w:t>
+      </w:r>
     </w:p>
     <w:p>
       <w:pPr>
@@ -4417,23 +4387,35 @@
         <w:adjustRightInd w:val="0"/>
         <w:spacing w:after="0" w:line="240" w:lineRule="auto"/>
         <w:rPr>
-          <w:rFonts w:ascii="Times New Roman" w:hAnsi="Times New Roman" w:cs="Times New Roman"/>
-          <w:color w:val="000000"/>
-          <w:kern w:val="0"/>
-          <w:sz w:val="22"/>
-          <w:szCs w:val="22"/>
-        </w:rPr>
-      </w:pPr>
-      <w:r>
-        <w:rPr>
-          <w:rFonts w:ascii="Times New Roman" w:hAnsi="Times New Roman" w:cs="Times New Roman"/>
-          <w:color w:val="000000"/>
-          <w:kern w:val="0"/>
-          <w:sz w:val="22"/>
-          <w:szCs w:val="22"/>
-        </w:rPr>
-        <w:t>│   ├── __init__.py</w:t>
-      </w:r>
+          <w:rFonts w:ascii="Menlo" w:hAnsi="Menlo" w:cs="Menlo"/>
+          <w:color w:val="000000"/>
+          <w:kern w:val="0"/>
+          <w:sz w:val="22"/>
+          <w:szCs w:val="22"/>
+        </w:rPr>
+      </w:pPr>
+      <w:r>
+        <w:rPr>
+          <w:rFonts w:ascii="Menlo" w:hAnsi="Menlo" w:cs="Menlo"/>
+          <w:color w:val="000000"/>
+          <w:kern w:val="0"/>
+          <w:sz w:val="22"/>
+          <w:szCs w:val="22"/>
+        </w:rPr>
+        <w:t xml:space="preserve">│   └── </w:t>
+      </w:r>
+      <w:proofErr w:type="spellStart"/>
+      <w:r>
+        <w:rPr>
+          <w:rFonts w:ascii="Menlo" w:hAnsi="Menlo" w:cs="Menlo"/>
+          <w:color w:val="000000"/>
+          <w:kern w:val="0"/>
+          <w:sz w:val="22"/>
+          <w:szCs w:val="22"/>
+        </w:rPr>
+        <w:t>pre_manually_downloaded_files</w:t>
+      </w:r>
+      <w:proofErr w:type="spellEnd"/>
     </w:p>
     <w:p>
       <w:pPr>
@@ -4456,35 +4438,23 @@
         <w:adjustRightInd w:val="0"/>
         <w:spacing w:after="0" w:line="240" w:lineRule="auto"/>
         <w:rPr>
-          <w:rFonts w:ascii="Times New Roman" w:hAnsi="Times New Roman" w:cs="Times New Roman"/>
-          <w:color w:val="000000"/>
-          <w:kern w:val="0"/>
-          <w:sz w:val="22"/>
-          <w:szCs w:val="22"/>
-        </w:rPr>
-      </w:pPr>
-      <w:r>
-        <w:rPr>
-          <w:rFonts w:ascii="Times New Roman" w:hAnsi="Times New Roman" w:cs="Times New Roman"/>
-          <w:color w:val="000000"/>
-          <w:kern w:val="0"/>
-          <w:sz w:val="22"/>
-          <w:szCs w:val="22"/>
-        </w:rPr>
-        <w:t xml:space="preserve">│   ├── </w:t>
-      </w:r>
-      <w:proofErr w:type="spellStart"/>
-      <w:r>
-        <w:rPr>
-          <w:rFonts w:ascii="Times New Roman" w:hAnsi="Times New Roman" w:cs="Times New Roman"/>
-          <w:color w:val="000000"/>
-          <w:kern w:val="0"/>
-          <w:sz w:val="22"/>
-          <w:szCs w:val="22"/>
-        </w:rPr>
-        <w:t>cluster_annotation</w:t>
-      </w:r>
-      <w:proofErr w:type="spellEnd"/>
+          <w:rFonts w:ascii="Menlo" w:hAnsi="Menlo" w:cs="Menlo"/>
+          <w:color w:val="000000"/>
+          <w:kern w:val="0"/>
+          <w:sz w:val="22"/>
+          <w:szCs w:val="22"/>
+        </w:rPr>
+      </w:pPr>
+      <w:r>
+        <w:rPr>
+          <w:rFonts w:ascii="Menlo" w:hAnsi="Menlo" w:cs="Menlo"/>
+          <w:color w:val="000000"/>
+          <w:kern w:val="0"/>
+          <w:sz w:val="22"/>
+          <w:szCs w:val="22"/>
+        </w:rPr>
+        <w:t>│       ├── GSE130973_2020_sc_skin_Cell_anno_V2_marker_genes.csv</w:t>
+      </w:r>
     </w:p>
     <w:p>
       <w:pPr>
@@ -4507,22 +4477,22 @@
         <w:adjustRightInd w:val="0"/>
         <w:spacing w:after="0" w:line="240" w:lineRule="auto"/>
         <w:rPr>
-          <w:rFonts w:ascii="Times New Roman" w:hAnsi="Times New Roman" w:cs="Times New Roman"/>
-          <w:color w:val="000000"/>
-          <w:kern w:val="0"/>
-          <w:sz w:val="22"/>
-          <w:szCs w:val="22"/>
-        </w:rPr>
-      </w:pPr>
-      <w:r>
-        <w:rPr>
-          <w:rFonts w:ascii="Times New Roman" w:hAnsi="Times New Roman" w:cs="Times New Roman"/>
-          <w:color w:val="000000"/>
-          <w:kern w:val="0"/>
-          <w:sz w:val="22"/>
-          <w:szCs w:val="22"/>
-        </w:rPr>
-        <w:t>│   │   ├── get_cluster_annotation.py</w:t>
+          <w:rFonts w:ascii="Menlo" w:hAnsi="Menlo" w:cs="Menlo"/>
+          <w:color w:val="000000"/>
+          <w:kern w:val="0"/>
+          <w:sz w:val="22"/>
+          <w:szCs w:val="22"/>
+        </w:rPr>
+      </w:pPr>
+      <w:r>
+        <w:rPr>
+          <w:rFonts w:ascii="Menlo" w:hAnsi="Menlo" w:cs="Menlo"/>
+          <w:color w:val="000000"/>
+          <w:kern w:val="0"/>
+          <w:sz w:val="22"/>
+          <w:szCs w:val="22"/>
+        </w:rPr>
+        <w:t>│       ├── GSE138669_2018_JID_sc_skin_Cell_anno_V2_marker_genes.csv</w:t>
       </w:r>
     </w:p>
     <w:p>
@@ -4546,22 +4516,22 @@
         <w:adjustRightInd w:val="0"/>
         <w:spacing w:after="0" w:line="240" w:lineRule="auto"/>
         <w:rPr>
-          <w:rFonts w:ascii="Times New Roman" w:hAnsi="Times New Roman" w:cs="Times New Roman"/>
-          <w:color w:val="000000"/>
-          <w:kern w:val="0"/>
-          <w:sz w:val="22"/>
-          <w:szCs w:val="22"/>
-        </w:rPr>
-      </w:pPr>
-      <w:r>
-        <w:rPr>
-          <w:rFonts w:ascii="Times New Roman" w:hAnsi="Times New Roman" w:cs="Times New Roman"/>
-          <w:color w:val="000000"/>
-          <w:kern w:val="0"/>
-          <w:sz w:val="22"/>
-          <w:szCs w:val="22"/>
-        </w:rPr>
-        <w:t>│   │   ├── get_html_report.py</w:t>
+          <w:rFonts w:ascii="Menlo" w:hAnsi="Menlo" w:cs="Menlo"/>
+          <w:color w:val="000000"/>
+          <w:kern w:val="0"/>
+          <w:sz w:val="22"/>
+          <w:szCs w:val="22"/>
+        </w:rPr>
+      </w:pPr>
+      <w:r>
+        <w:rPr>
+          <w:rFonts w:ascii="Menlo" w:hAnsi="Menlo" w:cs="Menlo"/>
+          <w:color w:val="000000"/>
+          <w:kern w:val="0"/>
+          <w:sz w:val="22"/>
+          <w:szCs w:val="22"/>
+        </w:rPr>
+        <w:t>│       ├── GSE156326_2021_NC_sc_hyper_Cell_anno_V2_marker_genes.csv</w:t>
       </w:r>
     </w:p>
     <w:p>
@@ -4585,22 +4555,22 @@
         <w:adjustRightInd w:val="0"/>
         <w:spacing w:after="0" w:line="240" w:lineRule="auto"/>
         <w:rPr>
-          <w:rFonts w:ascii="Times New Roman" w:hAnsi="Times New Roman" w:cs="Times New Roman"/>
-          <w:color w:val="000000"/>
-          <w:kern w:val="0"/>
-          <w:sz w:val="22"/>
-          <w:szCs w:val="22"/>
-        </w:rPr>
-      </w:pPr>
-      <w:r>
-        <w:rPr>
-          <w:rFonts w:ascii="Times New Roman" w:hAnsi="Times New Roman" w:cs="Times New Roman"/>
-          <w:color w:val="000000"/>
-          <w:kern w:val="0"/>
-          <w:sz w:val="22"/>
-          <w:szCs w:val="22"/>
-        </w:rPr>
-        <w:t>│   │   └── get_marker_enrichment_test.py</w:t>
+          <w:rFonts w:ascii="Menlo" w:hAnsi="Menlo" w:cs="Menlo"/>
+          <w:color w:val="000000"/>
+          <w:kern w:val="0"/>
+          <w:sz w:val="22"/>
+          <w:szCs w:val="22"/>
+        </w:rPr>
+      </w:pPr>
+      <w:r>
+        <w:rPr>
+          <w:rFonts w:ascii="Menlo" w:hAnsi="Menlo" w:cs="Menlo"/>
+          <w:color w:val="000000"/>
+          <w:kern w:val="0"/>
+          <w:sz w:val="22"/>
+          <w:szCs w:val="22"/>
+        </w:rPr>
+        <w:t>│       ├── GSE163973_2021_NC_sc_keloid_Cell_anno_V2_marker_genes.csv</w:t>
       </w:r>
     </w:p>
     <w:p>
@@ -4624,35 +4594,23 @@
         <w:adjustRightInd w:val="0"/>
         <w:spacing w:after="0" w:line="240" w:lineRule="auto"/>
         <w:rPr>
-          <w:rFonts w:ascii="Times New Roman" w:hAnsi="Times New Roman" w:cs="Times New Roman"/>
-          <w:color w:val="000000"/>
-          <w:kern w:val="0"/>
-          <w:sz w:val="22"/>
-          <w:szCs w:val="22"/>
-        </w:rPr>
-      </w:pPr>
-      <w:r>
-        <w:rPr>
-          <w:rFonts w:ascii="Times New Roman" w:hAnsi="Times New Roman" w:cs="Times New Roman"/>
-          <w:color w:val="000000"/>
-          <w:kern w:val="0"/>
-          <w:sz w:val="22"/>
-          <w:szCs w:val="22"/>
-        </w:rPr>
-        <w:t xml:space="preserve">│   ├── </w:t>
-      </w:r>
-      <w:proofErr w:type="spellStart"/>
-      <w:r>
-        <w:rPr>
-          <w:rFonts w:ascii="Times New Roman" w:hAnsi="Times New Roman" w:cs="Times New Roman"/>
-          <w:color w:val="000000"/>
-          <w:kern w:val="0"/>
-          <w:sz w:val="22"/>
-          <w:szCs w:val="22"/>
-        </w:rPr>
-        <w:t>db_manager</w:t>
-      </w:r>
-      <w:proofErr w:type="spellEnd"/>
+          <w:rFonts w:ascii="Menlo" w:hAnsi="Menlo" w:cs="Menlo"/>
+          <w:color w:val="000000"/>
+          <w:kern w:val="0"/>
+          <w:sz w:val="22"/>
+          <w:szCs w:val="22"/>
+        </w:rPr>
+      </w:pPr>
+      <w:r>
+        <w:rPr>
+          <w:rFonts w:ascii="Menlo" w:hAnsi="Menlo" w:cs="Menlo"/>
+          <w:color w:val="000000"/>
+          <w:kern w:val="0"/>
+          <w:sz w:val="22"/>
+          <w:szCs w:val="22"/>
+        </w:rPr>
+        <w:t>│       └── hubmap_summary.csv</w:t>
+      </w:r>
     </w:p>
     <w:p>
       <w:pPr>
@@ -4675,23 +4633,35 @@
         <w:adjustRightInd w:val="0"/>
         <w:spacing w:after="0" w:line="240" w:lineRule="auto"/>
         <w:rPr>
-          <w:rFonts w:ascii="Times New Roman" w:hAnsi="Times New Roman" w:cs="Times New Roman"/>
-          <w:color w:val="000000"/>
-          <w:kern w:val="0"/>
-          <w:sz w:val="22"/>
-          <w:szCs w:val="22"/>
-        </w:rPr>
-      </w:pPr>
-      <w:r>
-        <w:rPr>
-          <w:rFonts w:ascii="Times New Roman" w:hAnsi="Times New Roman" w:cs="Times New Roman"/>
-          <w:color w:val="000000"/>
-          <w:kern w:val="0"/>
-          <w:sz w:val="22"/>
-          <w:szCs w:val="22"/>
-        </w:rPr>
-        <w:t>│   │   ├── database_creator.py</w:t>
-      </w:r>
+          <w:rFonts w:ascii="Menlo" w:hAnsi="Menlo" w:cs="Menlo"/>
+          <w:color w:val="000000"/>
+          <w:kern w:val="0"/>
+          <w:sz w:val="22"/>
+          <w:szCs w:val="22"/>
+        </w:rPr>
+      </w:pPr>
+      <w:r>
+        <w:rPr>
+          <w:rFonts w:ascii="Menlo" w:hAnsi="Menlo" w:cs="Menlo"/>
+          <w:color w:val="000000"/>
+          <w:kern w:val="0"/>
+          <w:sz w:val="22"/>
+          <w:szCs w:val="22"/>
+        </w:rPr>
+        <w:t xml:space="preserve">├── </w:t>
+      </w:r>
+      <w:proofErr w:type="spellStart"/>
+      <w:r>
+        <w:rPr>
+          <w:rFonts w:ascii="Menlo" w:hAnsi="Menlo" w:cs="Menlo"/>
+          <w:color w:val="000000"/>
+          <w:kern w:val="0"/>
+          <w:sz w:val="22"/>
+          <w:szCs w:val="22"/>
+        </w:rPr>
+        <w:t>src</w:t>
+      </w:r>
+      <w:proofErr w:type="spellEnd"/>
     </w:p>
     <w:p>
       <w:pPr>
@@ -4714,22 +4684,22 @@
         <w:adjustRightInd w:val="0"/>
         <w:spacing w:after="0" w:line="240" w:lineRule="auto"/>
         <w:rPr>
-          <w:rFonts w:ascii="Times New Roman" w:hAnsi="Times New Roman" w:cs="Times New Roman"/>
-          <w:color w:val="000000"/>
-          <w:kern w:val="0"/>
-          <w:sz w:val="22"/>
-          <w:szCs w:val="22"/>
-        </w:rPr>
-      </w:pPr>
-      <w:r>
-        <w:rPr>
-          <w:rFonts w:ascii="Times New Roman" w:hAnsi="Times New Roman" w:cs="Times New Roman"/>
-          <w:color w:val="000000"/>
-          <w:kern w:val="0"/>
-          <w:sz w:val="22"/>
-          <w:szCs w:val="22"/>
-        </w:rPr>
-        <w:t>│   │   ├── db_manager.py</w:t>
+          <w:rFonts w:ascii="Menlo" w:hAnsi="Menlo" w:cs="Menlo"/>
+          <w:color w:val="000000"/>
+          <w:kern w:val="0"/>
+          <w:sz w:val="22"/>
+          <w:szCs w:val="22"/>
+        </w:rPr>
+      </w:pPr>
+      <w:r>
+        <w:rPr>
+          <w:rFonts w:ascii="Menlo" w:hAnsi="Menlo" w:cs="Menlo"/>
+          <w:color w:val="000000"/>
+          <w:kern w:val="0"/>
+          <w:sz w:val="22"/>
+          <w:szCs w:val="22"/>
+        </w:rPr>
+        <w:t>│   ├── __init__.py</w:t>
       </w:r>
     </w:p>
     <w:p>
@@ -4753,23 +4723,35 @@
         <w:adjustRightInd w:val="0"/>
         <w:spacing w:after="0" w:line="240" w:lineRule="auto"/>
         <w:rPr>
-          <w:rFonts w:ascii="Times New Roman" w:hAnsi="Times New Roman" w:cs="Times New Roman"/>
-          <w:color w:val="000000"/>
-          <w:kern w:val="0"/>
-          <w:sz w:val="22"/>
-          <w:szCs w:val="22"/>
-        </w:rPr>
-      </w:pPr>
-      <w:r>
-        <w:rPr>
-          <w:rFonts w:ascii="Times New Roman" w:hAnsi="Times New Roman" w:cs="Times New Roman"/>
-          <w:color w:val="000000"/>
-          <w:kern w:val="0"/>
-          <w:sz w:val="22"/>
-          <w:szCs w:val="22"/>
-        </w:rPr>
-        <w:t>│   │   └── db_schema.py</w:t>
-      </w:r>
+          <w:rFonts w:ascii="Menlo" w:hAnsi="Menlo" w:cs="Menlo"/>
+          <w:color w:val="000000"/>
+          <w:kern w:val="0"/>
+          <w:sz w:val="22"/>
+          <w:szCs w:val="22"/>
+        </w:rPr>
+      </w:pPr>
+      <w:r>
+        <w:rPr>
+          <w:rFonts w:ascii="Menlo" w:hAnsi="Menlo" w:cs="Menlo"/>
+          <w:color w:val="000000"/>
+          <w:kern w:val="0"/>
+          <w:sz w:val="22"/>
+          <w:szCs w:val="22"/>
+        </w:rPr>
+        <w:t xml:space="preserve">│   ├── </w:t>
+      </w:r>
+      <w:proofErr w:type="spellStart"/>
+      <w:r>
+        <w:rPr>
+          <w:rFonts w:ascii="Menlo" w:hAnsi="Menlo" w:cs="Menlo"/>
+          <w:color w:val="000000"/>
+          <w:kern w:val="0"/>
+          <w:sz w:val="22"/>
+          <w:szCs w:val="22"/>
+        </w:rPr>
+        <w:t>cluster_annotation</w:t>
+      </w:r>
+      <w:proofErr w:type="spellEnd"/>
     </w:p>
     <w:p>
       <w:pPr>
@@ -4792,22 +4774,44 @@
         <w:adjustRightInd w:val="0"/>
         <w:spacing w:after="0" w:line="240" w:lineRule="auto"/>
         <w:rPr>
-          <w:rFonts w:ascii="Times New Roman" w:hAnsi="Times New Roman" w:cs="Times New Roman"/>
-          <w:color w:val="000000"/>
-          <w:kern w:val="0"/>
-          <w:sz w:val="22"/>
-          <w:szCs w:val="22"/>
-        </w:rPr>
-      </w:pPr>
-      <w:r>
-        <w:rPr>
-          <w:rFonts w:ascii="Times New Roman" w:hAnsi="Times New Roman" w:cs="Times New Roman"/>
-          <w:color w:val="000000"/>
-          <w:kern w:val="0"/>
-          <w:sz w:val="22"/>
-          <w:szCs w:val="22"/>
-        </w:rPr>
-        <w:t>│   ├── download</w:t>
+          <w:rFonts w:ascii="Menlo" w:hAnsi="Menlo" w:cs="Menlo"/>
+          <w:color w:val="000000"/>
+          <w:kern w:val="0"/>
+          <w:sz w:val="22"/>
+          <w:szCs w:val="22"/>
+        </w:rPr>
+      </w:pPr>
+      <w:r>
+        <w:rPr>
+          <w:rFonts w:ascii="Menlo" w:hAnsi="Menlo" w:cs="Menlo"/>
+          <w:color w:val="000000"/>
+          <w:kern w:val="0"/>
+          <w:sz w:val="22"/>
+          <w:szCs w:val="22"/>
+        </w:rPr>
+        <w:t>│   │   ├── __</w:t>
+      </w:r>
+      <w:proofErr w:type="spellStart"/>
+      <w:r>
+        <w:rPr>
+          <w:rFonts w:ascii="Menlo" w:hAnsi="Menlo" w:cs="Menlo"/>
+          <w:color w:val="000000"/>
+          <w:kern w:val="0"/>
+          <w:sz w:val="22"/>
+          <w:szCs w:val="22"/>
+        </w:rPr>
+        <w:t>pycache</w:t>
+      </w:r>
+      <w:proofErr w:type="spellEnd"/>
+      <w:r>
+        <w:rPr>
+          <w:rFonts w:ascii="Menlo" w:hAnsi="Menlo" w:cs="Menlo"/>
+          <w:color w:val="000000"/>
+          <w:kern w:val="0"/>
+          <w:sz w:val="22"/>
+          <w:szCs w:val="22"/>
+        </w:rPr>
+        <w:t>__</w:t>
       </w:r>
     </w:p>
     <w:p>
@@ -4831,22 +4835,22 @@
         <w:adjustRightInd w:val="0"/>
         <w:spacing w:after="0" w:line="240" w:lineRule="auto"/>
         <w:rPr>
-          <w:rFonts w:ascii="Times New Roman" w:hAnsi="Times New Roman" w:cs="Times New Roman"/>
-          <w:color w:val="000000"/>
-          <w:kern w:val="0"/>
-          <w:sz w:val="22"/>
-          <w:szCs w:val="22"/>
-        </w:rPr>
-      </w:pPr>
-      <w:r>
-        <w:rPr>
-          <w:rFonts w:ascii="Times New Roman" w:hAnsi="Times New Roman" w:cs="Times New Roman"/>
-          <w:color w:val="000000"/>
-          <w:kern w:val="0"/>
-          <w:sz w:val="22"/>
-          <w:szCs w:val="22"/>
-        </w:rPr>
-        <w:t>│   │   └── bio_database_downloader.py</w:t>
+          <w:rFonts w:ascii="Menlo" w:hAnsi="Menlo" w:cs="Menlo"/>
+          <w:color w:val="000000"/>
+          <w:kern w:val="0"/>
+          <w:sz w:val="22"/>
+          <w:szCs w:val="22"/>
+        </w:rPr>
+      </w:pPr>
+      <w:r>
+        <w:rPr>
+          <w:rFonts w:ascii="Menlo" w:hAnsi="Menlo" w:cs="Menlo"/>
+          <w:color w:val="000000"/>
+          <w:kern w:val="0"/>
+          <w:sz w:val="22"/>
+          <w:szCs w:val="22"/>
+        </w:rPr>
+        <w:t>│   │   ├── get_cluster_annotation.py</w:t>
       </w:r>
     </w:p>
     <w:p>
@@ -4870,22 +4874,22 @@
         <w:adjustRightInd w:val="0"/>
         <w:spacing w:after="0" w:line="240" w:lineRule="auto"/>
         <w:rPr>
-          <w:rFonts w:ascii="Times New Roman" w:hAnsi="Times New Roman" w:cs="Times New Roman"/>
-          <w:color w:val="000000"/>
-          <w:kern w:val="0"/>
-          <w:sz w:val="22"/>
-          <w:szCs w:val="22"/>
-        </w:rPr>
-      </w:pPr>
-      <w:r>
-        <w:rPr>
-          <w:rFonts w:ascii="Times New Roman" w:hAnsi="Times New Roman" w:cs="Times New Roman"/>
-          <w:color w:val="000000"/>
-          <w:kern w:val="0"/>
-          <w:sz w:val="22"/>
-          <w:szCs w:val="22"/>
-        </w:rPr>
-        <w:t>│   ├── parser</w:t>
+          <w:rFonts w:ascii="Menlo" w:hAnsi="Menlo" w:cs="Menlo"/>
+          <w:color w:val="000000"/>
+          <w:kern w:val="0"/>
+          <w:sz w:val="22"/>
+          <w:szCs w:val="22"/>
+        </w:rPr>
+      </w:pPr>
+      <w:r>
+        <w:rPr>
+          <w:rFonts w:ascii="Menlo" w:hAnsi="Menlo" w:cs="Menlo"/>
+          <w:color w:val="000000"/>
+          <w:kern w:val="0"/>
+          <w:sz w:val="22"/>
+          <w:szCs w:val="22"/>
+        </w:rPr>
+        <w:t>│   │   ├── get_html_report.py</w:t>
       </w:r>
     </w:p>
     <w:p>
@@ -4909,22 +4913,22 @@
         <w:adjustRightInd w:val="0"/>
         <w:spacing w:after="0" w:line="240" w:lineRule="auto"/>
         <w:rPr>
-          <w:rFonts w:ascii="Times New Roman" w:hAnsi="Times New Roman" w:cs="Times New Roman"/>
-          <w:color w:val="000000"/>
-          <w:kern w:val="0"/>
-          <w:sz w:val="22"/>
-          <w:szCs w:val="22"/>
-        </w:rPr>
-      </w:pPr>
-      <w:r>
-        <w:rPr>
-          <w:rFonts w:ascii="Times New Roman" w:hAnsi="Times New Roman" w:cs="Times New Roman"/>
-          <w:color w:val="000000"/>
-          <w:kern w:val="0"/>
-          <w:sz w:val="22"/>
-          <w:szCs w:val="22"/>
-        </w:rPr>
-        <w:t>│   │   ├── cell_ontology_parser.py</w:t>
+          <w:rFonts w:ascii="Menlo" w:hAnsi="Menlo" w:cs="Menlo"/>
+          <w:color w:val="000000"/>
+          <w:kern w:val="0"/>
+          <w:sz w:val="22"/>
+          <w:szCs w:val="22"/>
+        </w:rPr>
+      </w:pPr>
+      <w:r>
+        <w:rPr>
+          <w:rFonts w:ascii="Menlo" w:hAnsi="Menlo" w:cs="Menlo"/>
+          <w:color w:val="000000"/>
+          <w:kern w:val="0"/>
+          <w:sz w:val="22"/>
+          <w:szCs w:val="22"/>
+        </w:rPr>
+        <w:t>│   │   └── get_marker_enrichment_test.py</w:t>
       </w:r>
     </w:p>
     <w:p>
@@ -4948,23 +4952,35 @@
         <w:adjustRightInd w:val="0"/>
         <w:spacing w:after="0" w:line="240" w:lineRule="auto"/>
         <w:rPr>
-          <w:rFonts w:ascii="Times New Roman" w:hAnsi="Times New Roman" w:cs="Times New Roman"/>
-          <w:color w:val="000000"/>
-          <w:kern w:val="0"/>
-          <w:sz w:val="22"/>
-          <w:szCs w:val="22"/>
-        </w:rPr>
-      </w:pPr>
-      <w:r>
-        <w:rPr>
-          <w:rFonts w:ascii="Times New Roman" w:hAnsi="Times New Roman" w:cs="Times New Roman"/>
-          <w:color w:val="000000"/>
-          <w:kern w:val="0"/>
-          <w:sz w:val="22"/>
-          <w:szCs w:val="22"/>
-        </w:rPr>
-        <w:t>│   │   ├── cellmarker_parser.py</w:t>
-      </w:r>
+          <w:rFonts w:ascii="Menlo" w:hAnsi="Menlo" w:cs="Menlo"/>
+          <w:color w:val="000000"/>
+          <w:kern w:val="0"/>
+          <w:sz w:val="22"/>
+          <w:szCs w:val="22"/>
+        </w:rPr>
+      </w:pPr>
+      <w:r>
+        <w:rPr>
+          <w:rFonts w:ascii="Menlo" w:hAnsi="Menlo" w:cs="Menlo"/>
+          <w:color w:val="000000"/>
+          <w:kern w:val="0"/>
+          <w:sz w:val="22"/>
+          <w:szCs w:val="22"/>
+        </w:rPr>
+        <w:t xml:space="preserve">│   ├── </w:t>
+      </w:r>
+      <w:proofErr w:type="spellStart"/>
+      <w:r>
+        <w:rPr>
+          <w:rFonts w:ascii="Menlo" w:hAnsi="Menlo" w:cs="Menlo"/>
+          <w:color w:val="000000"/>
+          <w:kern w:val="0"/>
+          <w:sz w:val="22"/>
+          <w:szCs w:val="22"/>
+        </w:rPr>
+        <w:t>db_manager</w:t>
+      </w:r>
+      <w:proofErr w:type="spellEnd"/>
     </w:p>
     <w:p>
       <w:pPr>
@@ -4987,22 +5003,22 @@
         <w:adjustRightInd w:val="0"/>
         <w:spacing w:after="0" w:line="240" w:lineRule="auto"/>
         <w:rPr>
-          <w:rFonts w:ascii="Times New Roman" w:hAnsi="Times New Roman" w:cs="Times New Roman"/>
-          <w:color w:val="000000"/>
-          <w:kern w:val="0"/>
-          <w:sz w:val="22"/>
-          <w:szCs w:val="22"/>
-        </w:rPr>
-      </w:pPr>
-      <w:r>
-        <w:rPr>
-          <w:rFonts w:ascii="Times New Roman" w:hAnsi="Times New Roman" w:cs="Times New Roman"/>
-          <w:color w:val="000000"/>
-          <w:kern w:val="0"/>
-          <w:sz w:val="22"/>
-          <w:szCs w:val="22"/>
-        </w:rPr>
-        <w:t>│   │   ├── cellmarkerdb_parser.py</w:t>
+          <w:rFonts w:ascii="Menlo" w:hAnsi="Menlo" w:cs="Menlo"/>
+          <w:color w:val="000000"/>
+          <w:kern w:val="0"/>
+          <w:sz w:val="22"/>
+          <w:szCs w:val="22"/>
+        </w:rPr>
+      </w:pPr>
+      <w:r>
+        <w:rPr>
+          <w:rFonts w:ascii="Menlo" w:hAnsi="Menlo" w:cs="Menlo"/>
+          <w:color w:val="000000"/>
+          <w:kern w:val="0"/>
+          <w:sz w:val="22"/>
+          <w:szCs w:val="22"/>
+        </w:rPr>
+        <w:t>│   │   ├── database_creator.py</w:t>
       </w:r>
     </w:p>
     <w:p>
@@ -5026,22 +5042,22 @@
         <w:adjustRightInd w:val="0"/>
         <w:spacing w:after="0" w:line="240" w:lineRule="auto"/>
         <w:rPr>
-          <w:rFonts w:ascii="Times New Roman" w:hAnsi="Times New Roman" w:cs="Times New Roman"/>
-          <w:color w:val="000000"/>
-          <w:kern w:val="0"/>
-          <w:sz w:val="22"/>
-          <w:szCs w:val="22"/>
-        </w:rPr>
-      </w:pPr>
-      <w:r>
-        <w:rPr>
-          <w:rFonts w:ascii="Times New Roman" w:hAnsi="Times New Roman" w:cs="Times New Roman"/>
-          <w:color w:val="000000"/>
-          <w:kern w:val="0"/>
-          <w:sz w:val="22"/>
-          <w:szCs w:val="22"/>
-        </w:rPr>
-        <w:t>│   │   ├── cellxgene_parser.py</w:t>
+          <w:rFonts w:ascii="Menlo" w:hAnsi="Menlo" w:cs="Menlo"/>
+          <w:color w:val="000000"/>
+          <w:kern w:val="0"/>
+          <w:sz w:val="22"/>
+          <w:szCs w:val="22"/>
+        </w:rPr>
+      </w:pPr>
+      <w:r>
+        <w:rPr>
+          <w:rFonts w:ascii="Menlo" w:hAnsi="Menlo" w:cs="Menlo"/>
+          <w:color w:val="000000"/>
+          <w:kern w:val="0"/>
+          <w:sz w:val="22"/>
+          <w:szCs w:val="22"/>
+        </w:rPr>
+        <w:t>│   │   ├── db_manager.py</w:t>
       </w:r>
     </w:p>
     <w:p>
@@ -5065,22 +5081,22 @@
         <w:adjustRightInd w:val="0"/>
         <w:spacing w:after="0" w:line="240" w:lineRule="auto"/>
         <w:rPr>
-          <w:rFonts w:ascii="Times New Roman" w:hAnsi="Times New Roman" w:cs="Times New Roman"/>
-          <w:color w:val="000000"/>
-          <w:kern w:val="0"/>
-          <w:sz w:val="22"/>
-          <w:szCs w:val="22"/>
-        </w:rPr>
-      </w:pPr>
-      <w:r>
-        <w:rPr>
-          <w:rFonts w:ascii="Times New Roman" w:hAnsi="Times New Roman" w:cs="Times New Roman"/>
-          <w:color w:val="000000"/>
-          <w:kern w:val="0"/>
-          <w:sz w:val="22"/>
-          <w:szCs w:val="22"/>
-        </w:rPr>
-        <w:t>│   │   ├── customdb_parser.py</w:t>
+          <w:rFonts w:ascii="Menlo" w:hAnsi="Menlo" w:cs="Menlo"/>
+          <w:color w:val="000000"/>
+          <w:kern w:val="0"/>
+          <w:sz w:val="22"/>
+          <w:szCs w:val="22"/>
+        </w:rPr>
+      </w:pPr>
+      <w:r>
+        <w:rPr>
+          <w:rFonts w:ascii="Menlo" w:hAnsi="Menlo" w:cs="Menlo"/>
+          <w:color w:val="000000"/>
+          <w:kern w:val="0"/>
+          <w:sz w:val="22"/>
+          <w:szCs w:val="22"/>
+        </w:rPr>
+        <w:t>│   │   └── db_schema.py</w:t>
       </w:r>
     </w:p>
     <w:p>
@@ -5104,22 +5120,22 @@
         <w:adjustRightInd w:val="0"/>
         <w:spacing w:after="0" w:line="240" w:lineRule="auto"/>
         <w:rPr>
-          <w:rFonts w:ascii="Times New Roman" w:hAnsi="Times New Roman" w:cs="Times New Roman"/>
-          <w:color w:val="000000"/>
-          <w:kern w:val="0"/>
-          <w:sz w:val="22"/>
-          <w:szCs w:val="22"/>
-        </w:rPr>
-      </w:pPr>
-      <w:r>
-        <w:rPr>
-          <w:rFonts w:ascii="Times New Roman" w:hAnsi="Times New Roman" w:cs="Times New Roman"/>
-          <w:color w:val="000000"/>
-          <w:kern w:val="0"/>
-          <w:sz w:val="22"/>
-          <w:szCs w:val="22"/>
-        </w:rPr>
-        <w:t>│   │   ├── database_file_parser.py</w:t>
+          <w:rFonts w:ascii="Menlo" w:hAnsi="Menlo" w:cs="Menlo"/>
+          <w:color w:val="000000"/>
+          <w:kern w:val="0"/>
+          <w:sz w:val="22"/>
+          <w:szCs w:val="22"/>
+        </w:rPr>
+      </w:pPr>
+      <w:r>
+        <w:rPr>
+          <w:rFonts w:ascii="Menlo" w:hAnsi="Menlo" w:cs="Menlo"/>
+          <w:color w:val="000000"/>
+          <w:kern w:val="0"/>
+          <w:sz w:val="22"/>
+          <w:szCs w:val="22"/>
+        </w:rPr>
+        <w:t>│   ├── download</w:t>
       </w:r>
     </w:p>
     <w:p>
@@ -5143,22 +5159,22 @@
         <w:adjustRightInd w:val="0"/>
         <w:spacing w:after="0" w:line="240" w:lineRule="auto"/>
         <w:rPr>
-          <w:rFonts w:ascii="Times New Roman" w:hAnsi="Times New Roman" w:cs="Times New Roman"/>
-          <w:color w:val="000000"/>
-          <w:kern w:val="0"/>
-          <w:sz w:val="22"/>
-          <w:szCs w:val="22"/>
-        </w:rPr>
-      </w:pPr>
-      <w:r>
-        <w:rPr>
-          <w:rFonts w:ascii="Times New Roman" w:hAnsi="Times New Roman" w:cs="Times New Roman"/>
-          <w:color w:val="000000"/>
-          <w:kern w:val="0"/>
-          <w:sz w:val="22"/>
-          <w:szCs w:val="22"/>
-        </w:rPr>
-        <w:t>│   │   ├── hubmap_parser.py</w:t>
+          <w:rFonts w:ascii="Menlo" w:hAnsi="Menlo" w:cs="Menlo"/>
+          <w:color w:val="000000"/>
+          <w:kern w:val="0"/>
+          <w:sz w:val="22"/>
+          <w:szCs w:val="22"/>
+        </w:rPr>
+      </w:pPr>
+      <w:r>
+        <w:rPr>
+          <w:rFonts w:ascii="Menlo" w:hAnsi="Menlo" w:cs="Menlo"/>
+          <w:color w:val="000000"/>
+          <w:kern w:val="0"/>
+          <w:sz w:val="22"/>
+          <w:szCs w:val="22"/>
+        </w:rPr>
+        <w:t>│   │   └── bio_database_downloader.py</w:t>
       </w:r>
     </w:p>
     <w:p>
@@ -5182,22 +5198,22 @@
         <w:adjustRightInd w:val="0"/>
         <w:spacing w:after="0" w:line="240" w:lineRule="auto"/>
         <w:rPr>
-          <w:rFonts w:ascii="Times New Roman" w:hAnsi="Times New Roman" w:cs="Times New Roman"/>
-          <w:color w:val="000000"/>
-          <w:kern w:val="0"/>
-          <w:sz w:val="22"/>
-          <w:szCs w:val="22"/>
-        </w:rPr>
-      </w:pPr>
-      <w:r>
-        <w:rPr>
-          <w:rFonts w:ascii="Times New Roman" w:hAnsi="Times New Roman" w:cs="Times New Roman"/>
-          <w:color w:val="000000"/>
-          <w:kern w:val="0"/>
-          <w:sz w:val="22"/>
-          <w:szCs w:val="22"/>
-        </w:rPr>
-        <w:t>│   │   ├── ontology_utils.py</w:t>
+          <w:rFonts w:ascii="Menlo" w:hAnsi="Menlo" w:cs="Menlo"/>
+          <w:color w:val="000000"/>
+          <w:kern w:val="0"/>
+          <w:sz w:val="22"/>
+          <w:szCs w:val="22"/>
+        </w:rPr>
+      </w:pPr>
+      <w:r>
+        <w:rPr>
+          <w:rFonts w:ascii="Menlo" w:hAnsi="Menlo" w:cs="Menlo"/>
+          <w:color w:val="000000"/>
+          <w:kern w:val="0"/>
+          <w:sz w:val="22"/>
+          <w:szCs w:val="22"/>
+        </w:rPr>
+        <w:t>│   ├── parser</w:t>
       </w:r>
     </w:p>
     <w:p>
@@ -5221,22 +5237,22 @@
         <w:adjustRightInd w:val="0"/>
         <w:spacing w:after="0" w:line="240" w:lineRule="auto"/>
         <w:rPr>
-          <w:rFonts w:ascii="Times New Roman" w:hAnsi="Times New Roman" w:cs="Times New Roman"/>
-          <w:color w:val="000000"/>
-          <w:kern w:val="0"/>
-          <w:sz w:val="22"/>
-          <w:szCs w:val="22"/>
-        </w:rPr>
-      </w:pPr>
-      <w:r>
-        <w:rPr>
-          <w:rFonts w:ascii="Times New Roman" w:hAnsi="Times New Roman" w:cs="Times New Roman"/>
-          <w:color w:val="000000"/>
-          <w:kern w:val="0"/>
-          <w:sz w:val="22"/>
-          <w:szCs w:val="22"/>
-        </w:rPr>
-        <w:t>│   │   ├── panglaodb_parser.py</w:t>
+          <w:rFonts w:ascii="Menlo" w:hAnsi="Menlo" w:cs="Menlo"/>
+          <w:color w:val="000000"/>
+          <w:kern w:val="0"/>
+          <w:sz w:val="22"/>
+          <w:szCs w:val="22"/>
+        </w:rPr>
+      </w:pPr>
+      <w:r>
+        <w:rPr>
+          <w:rFonts w:ascii="Menlo" w:hAnsi="Menlo" w:cs="Menlo"/>
+          <w:color w:val="000000"/>
+          <w:kern w:val="0"/>
+          <w:sz w:val="22"/>
+          <w:szCs w:val="22"/>
+        </w:rPr>
+        <w:t>│   │   ├── cellmarkerdb_parser.py</w:t>
       </w:r>
     </w:p>
     <w:p>
@@ -5260,22 +5276,22 @@
         <w:adjustRightInd w:val="0"/>
         <w:spacing w:after="0" w:line="240" w:lineRule="auto"/>
         <w:rPr>
-          <w:rFonts w:ascii="Times New Roman" w:hAnsi="Times New Roman" w:cs="Times New Roman"/>
-          <w:color w:val="000000"/>
-          <w:kern w:val="0"/>
-          <w:sz w:val="22"/>
-          <w:szCs w:val="22"/>
-        </w:rPr>
-      </w:pPr>
-      <w:r>
-        <w:rPr>
-          <w:rFonts w:ascii="Times New Roman" w:hAnsi="Times New Roman" w:cs="Times New Roman"/>
-          <w:color w:val="000000"/>
-          <w:kern w:val="0"/>
-          <w:sz w:val="22"/>
-          <w:szCs w:val="22"/>
-        </w:rPr>
-        <w:t>│   │   └── uberon_parser.py</w:t>
+          <w:rFonts w:ascii="Menlo" w:hAnsi="Menlo" w:cs="Menlo"/>
+          <w:color w:val="000000"/>
+          <w:kern w:val="0"/>
+          <w:sz w:val="22"/>
+          <w:szCs w:val="22"/>
+        </w:rPr>
+      </w:pPr>
+      <w:r>
+        <w:rPr>
+          <w:rFonts w:ascii="Menlo" w:hAnsi="Menlo" w:cs="Menlo"/>
+          <w:color w:val="000000"/>
+          <w:kern w:val="0"/>
+          <w:sz w:val="22"/>
+          <w:szCs w:val="22"/>
+        </w:rPr>
+        <w:t>│   │   ├── cellxgene_parser.py</w:t>
       </w:r>
     </w:p>
     <w:p>
@@ -5299,22 +5315,22 @@
         <w:adjustRightInd w:val="0"/>
         <w:spacing w:after="0" w:line="240" w:lineRule="auto"/>
         <w:rPr>
-          <w:rFonts w:ascii="Times New Roman" w:hAnsi="Times New Roman" w:cs="Times New Roman"/>
-          <w:color w:val="000000"/>
-          <w:kern w:val="0"/>
-          <w:sz w:val="22"/>
-          <w:szCs w:val="22"/>
-        </w:rPr>
-      </w:pPr>
-      <w:r>
-        <w:rPr>
-          <w:rFonts w:ascii="Times New Roman" w:hAnsi="Times New Roman" w:cs="Times New Roman"/>
-          <w:color w:val="000000"/>
-          <w:kern w:val="0"/>
-          <w:sz w:val="22"/>
-          <w:szCs w:val="22"/>
-        </w:rPr>
-        <w:t>│   └── visualization</w:t>
+          <w:rFonts w:ascii="Menlo" w:hAnsi="Menlo" w:cs="Menlo"/>
+          <w:color w:val="000000"/>
+          <w:kern w:val="0"/>
+          <w:sz w:val="22"/>
+          <w:szCs w:val="22"/>
+        </w:rPr>
+      </w:pPr>
+      <w:r>
+        <w:rPr>
+          <w:rFonts w:ascii="Menlo" w:hAnsi="Menlo" w:cs="Menlo"/>
+          <w:color w:val="000000"/>
+          <w:kern w:val="0"/>
+          <w:sz w:val="22"/>
+          <w:szCs w:val="22"/>
+        </w:rPr>
+        <w:t>│   │   ├── database_file_parser.py</w:t>
       </w:r>
     </w:p>
     <w:p>
@@ -5338,22 +5354,22 @@
         <w:adjustRightInd w:val="0"/>
         <w:spacing w:after="0" w:line="240" w:lineRule="auto"/>
         <w:rPr>
-          <w:rFonts w:ascii="Times New Roman" w:hAnsi="Times New Roman" w:cs="Times New Roman"/>
-          <w:color w:val="000000"/>
-          <w:kern w:val="0"/>
-          <w:sz w:val="22"/>
-          <w:szCs w:val="22"/>
-        </w:rPr>
-      </w:pPr>
-      <w:r>
-        <w:rPr>
-          <w:rFonts w:ascii="Times New Roman" w:hAnsi="Times New Roman" w:cs="Times New Roman"/>
-          <w:color w:val="000000"/>
-          <w:kern w:val="0"/>
-          <w:sz w:val="22"/>
-          <w:szCs w:val="22"/>
-        </w:rPr>
-        <w:t>│       └── app.py</w:t>
+          <w:rFonts w:ascii="Menlo" w:hAnsi="Menlo" w:cs="Menlo"/>
+          <w:color w:val="000000"/>
+          <w:kern w:val="0"/>
+          <w:sz w:val="22"/>
+          <w:szCs w:val="22"/>
+        </w:rPr>
+      </w:pPr>
+      <w:r>
+        <w:rPr>
+          <w:rFonts w:ascii="Menlo" w:hAnsi="Menlo" w:cs="Menlo"/>
+          <w:color w:val="000000"/>
+          <w:kern w:val="0"/>
+          <w:sz w:val="22"/>
+          <w:szCs w:val="22"/>
+        </w:rPr>
+        <w:t>│   │   ├── epi_gse147482_parser.py</w:t>
       </w:r>
     </w:p>
     <w:p>
@@ -5377,22 +5393,22 @@
         <w:adjustRightInd w:val="0"/>
         <w:spacing w:after="0" w:line="240" w:lineRule="auto"/>
         <w:rPr>
-          <w:rFonts w:ascii="Times New Roman" w:hAnsi="Times New Roman" w:cs="Times New Roman"/>
-          <w:color w:val="000000"/>
-          <w:kern w:val="0"/>
-          <w:sz w:val="22"/>
-          <w:szCs w:val="22"/>
-        </w:rPr>
-      </w:pPr>
-      <w:r>
-        <w:rPr>
-          <w:rFonts w:ascii="Times New Roman" w:hAnsi="Times New Roman" w:cs="Times New Roman"/>
-          <w:color w:val="000000"/>
-          <w:kern w:val="0"/>
-          <w:sz w:val="22"/>
-          <w:szCs w:val="22"/>
-        </w:rPr>
-        <w:t>└── test</w:t>
+          <w:rFonts w:ascii="Menlo" w:hAnsi="Menlo" w:cs="Menlo"/>
+          <w:color w:val="000000"/>
+          <w:kern w:val="0"/>
+          <w:sz w:val="22"/>
+          <w:szCs w:val="22"/>
+        </w:rPr>
+      </w:pPr>
+      <w:r>
+        <w:rPr>
+          <w:rFonts w:ascii="Menlo" w:hAnsi="Menlo" w:cs="Menlo"/>
+          <w:color w:val="000000"/>
+          <w:kern w:val="0"/>
+          <w:sz w:val="22"/>
+          <w:szCs w:val="22"/>
+        </w:rPr>
+        <w:t>│   │   ├── hubmap_parser.py</w:t>
       </w:r>
     </w:p>
     <w:p>
@@ -5416,22 +5432,22 @@
         <w:adjustRightInd w:val="0"/>
         <w:spacing w:after="0" w:line="240" w:lineRule="auto"/>
         <w:rPr>
-          <w:rFonts w:ascii="Times New Roman" w:hAnsi="Times New Roman" w:cs="Times New Roman"/>
-          <w:color w:val="000000"/>
-          <w:kern w:val="0"/>
-          <w:sz w:val="22"/>
-          <w:szCs w:val="22"/>
-        </w:rPr>
-      </w:pPr>
-      <w:r>
-        <w:rPr>
-          <w:rFonts w:ascii="Times New Roman" w:hAnsi="Times New Roman" w:cs="Times New Roman"/>
-          <w:color w:val="000000"/>
-          <w:kern w:val="0"/>
-          <w:sz w:val="22"/>
-          <w:szCs w:val="22"/>
-        </w:rPr>
-        <w:t xml:space="preserve">    ├── test_classes.py</w:t>
+          <w:rFonts w:ascii="Menlo" w:hAnsi="Menlo" w:cs="Menlo"/>
+          <w:color w:val="000000"/>
+          <w:kern w:val="0"/>
+          <w:sz w:val="22"/>
+          <w:szCs w:val="22"/>
+        </w:rPr>
+      </w:pPr>
+      <w:r>
+        <w:rPr>
+          <w:rFonts w:ascii="Menlo" w:hAnsi="Menlo" w:cs="Menlo"/>
+          <w:color w:val="000000"/>
+          <w:kern w:val="0"/>
+          <w:sz w:val="22"/>
+          <w:szCs w:val="22"/>
+        </w:rPr>
+        <w:t>│   │   ├── ontology_utils.py</w:t>
       </w:r>
     </w:p>
     <w:p>
@@ -5455,16 +5471,328 @@
         <w:adjustRightInd w:val="0"/>
         <w:spacing w:after="0" w:line="240" w:lineRule="auto"/>
         <w:rPr>
-          <w:rFonts w:ascii="Times New Roman" w:hAnsi="Times New Roman" w:cs="Times New Roman"/>
-          <w:color w:val="000000"/>
-          <w:kern w:val="0"/>
-          <w:sz w:val="22"/>
-          <w:szCs w:val="22"/>
-        </w:rPr>
-      </w:pPr>
-      <w:r>
-        <w:rPr>
-          <w:rFonts w:ascii="Times New Roman" w:hAnsi="Times New Roman" w:cs="Times New Roman"/>
+          <w:rFonts w:ascii="Menlo" w:hAnsi="Menlo" w:cs="Menlo"/>
+          <w:color w:val="000000"/>
+          <w:kern w:val="0"/>
+          <w:sz w:val="22"/>
+          <w:szCs w:val="22"/>
+        </w:rPr>
+      </w:pPr>
+      <w:r>
+        <w:rPr>
+          <w:rFonts w:ascii="Menlo" w:hAnsi="Menlo" w:cs="Menlo"/>
+          <w:color w:val="000000"/>
+          <w:kern w:val="0"/>
+          <w:sz w:val="22"/>
+          <w:szCs w:val="22"/>
+        </w:rPr>
+        <w:t>│   │   ├── panglaodb_parser.py</w:t>
+      </w:r>
+    </w:p>
+    <w:p>
+      <w:pPr>
+        <w:tabs>
+          <w:tab w:val="left" w:pos="560"/>
+          <w:tab w:val="left" w:pos="1120"/>
+          <w:tab w:val="left" w:pos="1680"/>
+          <w:tab w:val="left" w:pos="2240"/>
+          <w:tab w:val="left" w:pos="2800"/>
+          <w:tab w:val="left" w:pos="3360"/>
+          <w:tab w:val="left" w:pos="3920"/>
+          <w:tab w:val="left" w:pos="4480"/>
+          <w:tab w:val="left" w:pos="5040"/>
+          <w:tab w:val="left" w:pos="5600"/>
+          <w:tab w:val="left" w:pos="6160"/>
+          <w:tab w:val="left" w:pos="6720"/>
+        </w:tabs>
+        <w:autoSpaceDE w:val="0"/>
+        <w:autoSpaceDN w:val="0"/>
+        <w:adjustRightInd w:val="0"/>
+        <w:spacing w:after="0" w:line="240" w:lineRule="auto"/>
+        <w:rPr>
+          <w:rFonts w:ascii="Menlo" w:hAnsi="Menlo" w:cs="Menlo"/>
+          <w:color w:val="000000"/>
+          <w:kern w:val="0"/>
+          <w:sz w:val="22"/>
+          <w:szCs w:val="22"/>
+        </w:rPr>
+      </w:pPr>
+      <w:r>
+        <w:rPr>
+          <w:rFonts w:ascii="Menlo" w:hAnsi="Menlo" w:cs="Menlo"/>
+          <w:color w:val="000000"/>
+          <w:kern w:val="0"/>
+          <w:sz w:val="22"/>
+          <w:szCs w:val="22"/>
+        </w:rPr>
+        <w:t>│   │   ├── scarcellmarker_parser.py</w:t>
+      </w:r>
+    </w:p>
+    <w:p>
+      <w:pPr>
+        <w:tabs>
+          <w:tab w:val="left" w:pos="560"/>
+          <w:tab w:val="left" w:pos="1120"/>
+          <w:tab w:val="left" w:pos="1680"/>
+          <w:tab w:val="left" w:pos="2240"/>
+          <w:tab w:val="left" w:pos="2800"/>
+          <w:tab w:val="left" w:pos="3360"/>
+          <w:tab w:val="left" w:pos="3920"/>
+          <w:tab w:val="left" w:pos="4480"/>
+          <w:tab w:val="left" w:pos="5040"/>
+          <w:tab w:val="left" w:pos="5600"/>
+          <w:tab w:val="left" w:pos="6160"/>
+          <w:tab w:val="left" w:pos="6720"/>
+        </w:tabs>
+        <w:autoSpaceDE w:val="0"/>
+        <w:autoSpaceDN w:val="0"/>
+        <w:adjustRightInd w:val="0"/>
+        <w:spacing w:after="0" w:line="240" w:lineRule="auto"/>
+        <w:rPr>
+          <w:rFonts w:ascii="Menlo" w:hAnsi="Menlo" w:cs="Menlo"/>
+          <w:color w:val="000000"/>
+          <w:kern w:val="0"/>
+          <w:sz w:val="22"/>
+          <w:szCs w:val="22"/>
+        </w:rPr>
+      </w:pPr>
+      <w:r>
+        <w:rPr>
+          <w:rFonts w:ascii="Menlo" w:hAnsi="Menlo" w:cs="Menlo"/>
+          <w:color w:val="000000"/>
+          <w:kern w:val="0"/>
+          <w:sz w:val="22"/>
+          <w:szCs w:val="22"/>
+        </w:rPr>
+        <w:t>│   │   ├── skin_fibroblast_atlas_parser.py</w:t>
+      </w:r>
+    </w:p>
+    <w:p>
+      <w:pPr>
+        <w:tabs>
+          <w:tab w:val="left" w:pos="560"/>
+          <w:tab w:val="left" w:pos="1120"/>
+          <w:tab w:val="left" w:pos="1680"/>
+          <w:tab w:val="left" w:pos="2240"/>
+          <w:tab w:val="left" w:pos="2800"/>
+          <w:tab w:val="left" w:pos="3360"/>
+          <w:tab w:val="left" w:pos="3920"/>
+          <w:tab w:val="left" w:pos="4480"/>
+          <w:tab w:val="left" w:pos="5040"/>
+          <w:tab w:val="left" w:pos="5600"/>
+          <w:tab w:val="left" w:pos="6160"/>
+          <w:tab w:val="left" w:pos="6720"/>
+        </w:tabs>
+        <w:autoSpaceDE w:val="0"/>
+        <w:autoSpaceDN w:val="0"/>
+        <w:adjustRightInd w:val="0"/>
+        <w:spacing w:after="0" w:line="240" w:lineRule="auto"/>
+        <w:rPr>
+          <w:rFonts w:ascii="Menlo" w:hAnsi="Menlo" w:cs="Menlo"/>
+          <w:color w:val="000000"/>
+          <w:kern w:val="0"/>
+          <w:sz w:val="22"/>
+          <w:szCs w:val="22"/>
+        </w:rPr>
+      </w:pPr>
+      <w:r>
+        <w:rPr>
+          <w:rFonts w:ascii="Menlo" w:hAnsi="Menlo" w:cs="Menlo"/>
+          <w:color w:val="000000"/>
+          <w:kern w:val="0"/>
+          <w:sz w:val="22"/>
+          <w:szCs w:val="22"/>
+        </w:rPr>
+        <w:t>│   │   └── wimms_parser.py</w:t>
+      </w:r>
+    </w:p>
+    <w:p>
+      <w:pPr>
+        <w:tabs>
+          <w:tab w:val="left" w:pos="560"/>
+          <w:tab w:val="left" w:pos="1120"/>
+          <w:tab w:val="left" w:pos="1680"/>
+          <w:tab w:val="left" w:pos="2240"/>
+          <w:tab w:val="left" w:pos="2800"/>
+          <w:tab w:val="left" w:pos="3360"/>
+          <w:tab w:val="left" w:pos="3920"/>
+          <w:tab w:val="left" w:pos="4480"/>
+          <w:tab w:val="left" w:pos="5040"/>
+          <w:tab w:val="left" w:pos="5600"/>
+          <w:tab w:val="left" w:pos="6160"/>
+          <w:tab w:val="left" w:pos="6720"/>
+        </w:tabs>
+        <w:autoSpaceDE w:val="0"/>
+        <w:autoSpaceDN w:val="0"/>
+        <w:adjustRightInd w:val="0"/>
+        <w:spacing w:after="0" w:line="240" w:lineRule="auto"/>
+        <w:rPr>
+          <w:rFonts w:ascii="Menlo" w:hAnsi="Menlo" w:cs="Menlo"/>
+          <w:color w:val="000000"/>
+          <w:kern w:val="0"/>
+          <w:sz w:val="22"/>
+          <w:szCs w:val="22"/>
+        </w:rPr>
+      </w:pPr>
+      <w:r>
+        <w:rPr>
+          <w:rFonts w:ascii="Menlo" w:hAnsi="Menlo" w:cs="Menlo"/>
+          <w:color w:val="000000"/>
+          <w:kern w:val="0"/>
+          <w:sz w:val="22"/>
+          <w:szCs w:val="22"/>
+        </w:rPr>
+        <w:t>│   └── visualization</w:t>
+      </w:r>
+    </w:p>
+    <w:p>
+      <w:pPr>
+        <w:tabs>
+          <w:tab w:val="left" w:pos="560"/>
+          <w:tab w:val="left" w:pos="1120"/>
+          <w:tab w:val="left" w:pos="1680"/>
+          <w:tab w:val="left" w:pos="2240"/>
+          <w:tab w:val="left" w:pos="2800"/>
+          <w:tab w:val="left" w:pos="3360"/>
+          <w:tab w:val="left" w:pos="3920"/>
+          <w:tab w:val="left" w:pos="4480"/>
+          <w:tab w:val="left" w:pos="5040"/>
+          <w:tab w:val="left" w:pos="5600"/>
+          <w:tab w:val="left" w:pos="6160"/>
+          <w:tab w:val="left" w:pos="6720"/>
+        </w:tabs>
+        <w:autoSpaceDE w:val="0"/>
+        <w:autoSpaceDN w:val="0"/>
+        <w:adjustRightInd w:val="0"/>
+        <w:spacing w:after="0" w:line="240" w:lineRule="auto"/>
+        <w:rPr>
+          <w:rFonts w:ascii="Menlo" w:hAnsi="Menlo" w:cs="Menlo"/>
+          <w:color w:val="000000"/>
+          <w:kern w:val="0"/>
+          <w:sz w:val="22"/>
+          <w:szCs w:val="22"/>
+        </w:rPr>
+      </w:pPr>
+      <w:r>
+        <w:rPr>
+          <w:rFonts w:ascii="Menlo" w:hAnsi="Menlo" w:cs="Menlo"/>
+          <w:color w:val="000000"/>
+          <w:kern w:val="0"/>
+          <w:sz w:val="22"/>
+          <w:szCs w:val="22"/>
+        </w:rPr>
+        <w:t>│       └── app.py</w:t>
+      </w:r>
+    </w:p>
+    <w:p>
+      <w:pPr>
+        <w:tabs>
+          <w:tab w:val="left" w:pos="560"/>
+          <w:tab w:val="left" w:pos="1120"/>
+          <w:tab w:val="left" w:pos="1680"/>
+          <w:tab w:val="left" w:pos="2240"/>
+          <w:tab w:val="left" w:pos="2800"/>
+          <w:tab w:val="left" w:pos="3360"/>
+          <w:tab w:val="left" w:pos="3920"/>
+          <w:tab w:val="left" w:pos="4480"/>
+          <w:tab w:val="left" w:pos="5040"/>
+          <w:tab w:val="left" w:pos="5600"/>
+          <w:tab w:val="left" w:pos="6160"/>
+          <w:tab w:val="left" w:pos="6720"/>
+        </w:tabs>
+        <w:autoSpaceDE w:val="0"/>
+        <w:autoSpaceDN w:val="0"/>
+        <w:adjustRightInd w:val="0"/>
+        <w:spacing w:after="0" w:line="240" w:lineRule="auto"/>
+        <w:rPr>
+          <w:rFonts w:ascii="Menlo" w:hAnsi="Menlo" w:cs="Menlo"/>
+          <w:color w:val="000000"/>
+          <w:kern w:val="0"/>
+          <w:sz w:val="22"/>
+          <w:szCs w:val="22"/>
+        </w:rPr>
+      </w:pPr>
+      <w:r>
+        <w:rPr>
+          <w:rFonts w:ascii="Menlo" w:hAnsi="Menlo" w:cs="Menlo"/>
+          <w:color w:val="000000"/>
+          <w:kern w:val="0"/>
+          <w:sz w:val="22"/>
+          <w:szCs w:val="22"/>
+        </w:rPr>
+        <w:t>└── test</w:t>
+      </w:r>
+    </w:p>
+    <w:p>
+      <w:pPr>
+        <w:tabs>
+          <w:tab w:val="left" w:pos="560"/>
+          <w:tab w:val="left" w:pos="1120"/>
+          <w:tab w:val="left" w:pos="1680"/>
+          <w:tab w:val="left" w:pos="2240"/>
+          <w:tab w:val="left" w:pos="2800"/>
+          <w:tab w:val="left" w:pos="3360"/>
+          <w:tab w:val="left" w:pos="3920"/>
+          <w:tab w:val="left" w:pos="4480"/>
+          <w:tab w:val="left" w:pos="5040"/>
+          <w:tab w:val="left" w:pos="5600"/>
+          <w:tab w:val="left" w:pos="6160"/>
+          <w:tab w:val="left" w:pos="6720"/>
+        </w:tabs>
+        <w:autoSpaceDE w:val="0"/>
+        <w:autoSpaceDN w:val="0"/>
+        <w:adjustRightInd w:val="0"/>
+        <w:spacing w:after="0" w:line="240" w:lineRule="auto"/>
+        <w:rPr>
+          <w:rFonts w:ascii="Menlo" w:hAnsi="Menlo" w:cs="Menlo"/>
+          <w:color w:val="000000"/>
+          <w:kern w:val="0"/>
+          <w:sz w:val="22"/>
+          <w:szCs w:val="22"/>
+        </w:rPr>
+      </w:pPr>
+      <w:r>
+        <w:rPr>
+          <w:rFonts w:ascii="Menlo" w:hAnsi="Menlo" w:cs="Menlo"/>
+          <w:color w:val="000000"/>
+          <w:kern w:val="0"/>
+          <w:sz w:val="22"/>
+          <w:szCs w:val="22"/>
+        </w:rPr>
+        <w:t xml:space="preserve">    ├── test_classes.py</w:t>
+      </w:r>
+    </w:p>
+    <w:p>
+      <w:pPr>
+        <w:tabs>
+          <w:tab w:val="left" w:pos="560"/>
+          <w:tab w:val="left" w:pos="1120"/>
+          <w:tab w:val="left" w:pos="1680"/>
+          <w:tab w:val="left" w:pos="2240"/>
+          <w:tab w:val="left" w:pos="2800"/>
+          <w:tab w:val="left" w:pos="3360"/>
+          <w:tab w:val="left" w:pos="3920"/>
+          <w:tab w:val="left" w:pos="4480"/>
+          <w:tab w:val="left" w:pos="5040"/>
+          <w:tab w:val="left" w:pos="5600"/>
+          <w:tab w:val="left" w:pos="6160"/>
+          <w:tab w:val="left" w:pos="6720"/>
+        </w:tabs>
+        <w:autoSpaceDE w:val="0"/>
+        <w:autoSpaceDN w:val="0"/>
+        <w:adjustRightInd w:val="0"/>
+        <w:spacing w:after="0" w:line="240" w:lineRule="auto"/>
+        <w:rPr>
+          <w:rFonts w:ascii="Menlo" w:hAnsi="Menlo" w:cs="Menlo"/>
+          <w:color w:val="000000"/>
+          <w:kern w:val="0"/>
+          <w:sz w:val="22"/>
+          <w:szCs w:val="22"/>
+        </w:rPr>
+      </w:pPr>
+      <w:r>
+        <w:rPr>
+          <w:rFonts w:ascii="Menlo" w:hAnsi="Menlo" w:cs="Menlo"/>
           <w:color w:val="000000"/>
           <w:kern w:val="0"/>
           <w:sz w:val="22"/>
@@ -5472,6 +5800,35 @@
         </w:rPr>
         <w:t xml:space="preserve">    └── test_download.py</w:t>
       </w:r>
+    </w:p>
+    <w:p>
+      <w:pPr>
+        <w:tabs>
+          <w:tab w:val="left" w:pos="560"/>
+          <w:tab w:val="left" w:pos="1120"/>
+          <w:tab w:val="left" w:pos="1680"/>
+          <w:tab w:val="left" w:pos="2240"/>
+          <w:tab w:val="left" w:pos="2800"/>
+          <w:tab w:val="left" w:pos="3360"/>
+          <w:tab w:val="left" w:pos="3920"/>
+          <w:tab w:val="left" w:pos="4480"/>
+          <w:tab w:val="left" w:pos="5040"/>
+          <w:tab w:val="left" w:pos="5600"/>
+          <w:tab w:val="left" w:pos="6160"/>
+          <w:tab w:val="left" w:pos="6720"/>
+        </w:tabs>
+        <w:autoSpaceDE w:val="0"/>
+        <w:autoSpaceDN w:val="0"/>
+        <w:adjustRightInd w:val="0"/>
+        <w:spacing w:after="0" w:line="240" w:lineRule="auto"/>
+        <w:rPr>
+          <w:rFonts w:ascii="Menlo" w:hAnsi="Menlo" w:cs="Menlo"/>
+          <w:color w:val="000000"/>
+          <w:kern w:val="0"/>
+          <w:sz w:val="22"/>
+          <w:szCs w:val="22"/>
+        </w:rPr>
+      </w:pPr>
     </w:p>
     <w:p>
       <w:pPr>

</xml_diff>